<commit_message>
Remove checklist de entrega e atualiza o relatório final do Lab01, incluindo ajustes na formatação e conteúdo, além de links relevantes. A seção de métricas foi aprimorada e a orientação para a coleta de dados foi ajustada. #11
</commit_message>
<xml_diff>
--- a/relatorio/Lab01_Relatorio_Final.docx
+++ b/relatorio/Lab01_Relatorio_Final.docx
@@ -1,6 +1,6 @@
 
 <file path=word/document.xml><?xml version="1.0" encoding="utf-8"?>
-<w:document xmlns:wpc="http://schemas.microsoft.com/office/word/2010/wordprocessingCanvas" xmlns:cx="http://schemas.microsoft.com/office/drawing/2014/chartex" xmlns:cx1="http://schemas.microsoft.com/office/drawing/2015/9/8/chartex" xmlns:cx2="http://schemas.microsoft.com/office/drawing/2015/10/21/chartex" xmlns:cx3="http://schemas.microsoft.com/office/drawing/2016/5/9/chartex" xmlns:cx4="http://schemas.microsoft.com/office/drawing/2016/5/10/chartex" xmlns:cx5="http://schemas.microsoft.com/office/drawing/2016/5/11/chartex" xmlns:cx6="http://schemas.microsoft.com/office/drawing/2016/5/12/chartex" xmlns:cx7="http://schemas.microsoft.com/office/drawing/2016/5/13/chartex" xmlns:cx8="http://schemas.microsoft.com/office/drawing/2016/5/14/chartex" xmlns:mc="http://schemas.openxmlformats.org/markup-compatibility/2006" xmlns:m="http://schemas.openxmlformats.org/officeDocument/2006/math" xmlns:aink="http://schemas.microsoft.com/office/drawing/2016/ink" xmlns:am3d="http://schemas.microsoft.com/office/drawing/2017/model3d" xmlns:oel="http://schemas.microsoft.com/office/2019/extlst" xmlns:r="http://schemas.openxmlformats.org/officeDocument/2006/relationships" xmlns:wp14="http://schemas.microsoft.com/office/word/2010/wordprocessingDrawing" xmlns:wp="http://schemas.openxmlformats.org/drawingml/2006/wordprocessingDrawing" xmlns:wpg="http://schemas.microsoft.com/office/word/2010/wordprocessingGroup" xmlns:wpi="http://schemas.microsoft.com/office/word/2010/wordprocessingInk" xmlns:wps="http://schemas.microsoft.com/office/word/2010/wordprocessingShape" xmlns:o="urn:schemas-microsoft-com:office:office" xmlns:v="urn:schemas-microsoft-com:vml" xmlns:w10="urn:schemas-microsoft-com:office:word" xmlns:w="http://schemas.openxmlformats.org/wordprocessingml/2006/main" xmlns:w14="http://schemas.microsoft.com/office/word/2010/wordml" xmlns:w15="http://schemas.microsoft.com/office/word/2012/wordml" xmlns:w16cei="http://schemas.microsoft.com/office/word/2026/wordml/cei" xmlns:w16cex="http://schemas.microsoft.com/office/word/2018/wordml/cex" xmlns:w16cid="http://schemas.microsoft.com/office/word/2016/wordml/cid" xmlns:w16="http://schemas.microsoft.com/office/word/2018/wordml" xmlns:w16sdtdh="http://schemas.microsoft.com/office/word/2020/wordml/sdtdatahash" xmlns:w16sdtfl="http://schemas.microsoft.com/office/word/2024/wordml/sdtformatlock" xmlns:w16se="http://schemas.microsoft.com/office/word/2015/wordml/symex" xmlns:w16du="http://schemas.microsoft.com/office/word/2023/wordml/word16du" xmlns:wne="http://schemas.microsoft.com/office/word/2006/wordml" mc:Ignorable="w14 w15 w16se w16cid w16 w16cex w16sdtdh w16sdtfl w16du wp14">
+<w:document xmlns:wpc="http://schemas.microsoft.com/office/word/2010/wordprocessingCanvas" xmlns:cx="http://schemas.microsoft.com/office/drawing/2014/chartex" xmlns:cx1="http://schemas.microsoft.com/office/drawing/2015/9/8/chartex" xmlns:cx2="http://schemas.microsoft.com/office/drawing/2015/10/21/chartex" xmlns:cx3="http://schemas.microsoft.com/office/drawing/2016/5/9/chartex" xmlns:cx4="http://schemas.microsoft.com/office/drawing/2016/5/10/chartex" xmlns:cx5="http://schemas.microsoft.com/office/drawing/2016/5/11/chartex" xmlns:cx6="http://schemas.microsoft.com/office/drawing/2016/5/12/chartex" xmlns:cx7="http://schemas.microsoft.com/office/drawing/2016/5/13/chartex" xmlns:cx8="http://schemas.microsoft.com/office/drawing/2016/5/14/chartex" xmlns:mc="http://schemas.openxmlformats.org/markup-compatibility/2006" xmlns:aink="http://schemas.microsoft.com/office/drawing/2016/ink" xmlns:am3d="http://schemas.microsoft.com/office/drawing/2017/model3d" xmlns:o="urn:schemas-microsoft-com:office:office" xmlns:oel="http://schemas.microsoft.com/office/2019/extlst" xmlns:r="http://schemas.openxmlformats.org/officeDocument/2006/relationships" xmlns:m="http://schemas.openxmlformats.org/officeDocument/2006/math" xmlns:v="urn:schemas-microsoft-com:vml" xmlns:wp14="http://schemas.microsoft.com/office/word/2010/wordprocessingDrawing" xmlns:wp="http://schemas.openxmlformats.org/drawingml/2006/wordprocessingDrawing" xmlns:w10="urn:schemas-microsoft-com:office:word" xmlns:w="http://schemas.openxmlformats.org/wordprocessingml/2006/main" xmlns:w14="http://schemas.microsoft.com/office/word/2010/wordml" xmlns:w15="http://schemas.microsoft.com/office/word/2012/wordml" xmlns:w16cex="http://schemas.microsoft.com/office/word/2018/wordml/cex" xmlns:w16cid="http://schemas.microsoft.com/office/word/2016/wordml/cid" xmlns:w16="http://schemas.microsoft.com/office/word/2018/wordml" xmlns:w16sdtdh="http://schemas.microsoft.com/office/word/2020/wordml/sdtdatahash" xmlns:w16se="http://schemas.microsoft.com/office/word/2015/wordml/symex" xmlns:wpg="http://schemas.microsoft.com/office/word/2010/wordprocessingGroup" xmlns:wpi="http://schemas.microsoft.com/office/word/2010/wordprocessingInk" xmlns:wne="http://schemas.microsoft.com/office/word/2006/wordml" xmlns:wps="http://schemas.microsoft.com/office/word/2010/wordprocessingShape" mc:Ignorable="w14 w15 w16se w16cid w16 w16cex w16sdtdh wp14">
   <w:body>
     <w:p>
       <w:pPr>
@@ -32,27 +32,7 @@
           <w:sz w:val="24"/>
           <w:lang w:val="pt-BR"/>
         </w:rPr>
-        <w:t>Laboratório de Experimentação de Software — Modelo/</w:t>
-      </w:r>
-      <w:proofErr w:type="spellStart"/>
-      <w:r>
-        <w:rPr>
-          <w:i/>
-          <w:color w:val="1F6E63"/>
-          <w:sz w:val="24"/>
-          <w:lang w:val="pt-BR"/>
-        </w:rPr>
-        <w:t>Template</w:t>
-      </w:r>
-      <w:proofErr w:type="spellEnd"/>
-      <w:r>
-        <w:rPr>
-          <w:i/>
-          <w:color w:val="1F6E63"/>
-          <w:sz w:val="24"/>
-          <w:lang w:val="pt-BR"/>
-        </w:rPr>
-        <w:t xml:space="preserve"> de Relatório</w:t>
+        <w:t>Laboratório de Experimentação de Software — Modelo/Template de Relatório</w:t>
       </w:r>
     </w:p>
     <w:p>
@@ -64,9 +44,8 @@
       </w:pPr>
       <w:r>
         <w:rPr>
-          <w:i w:val="0"/>
           <w:color w:val="000000"/>
-          <w:sz w:val="22"/>
+          <w:lang w:val="pt-BR"/>
         </w:rPr>
         <w:t>Relatório Final do Laboratório 01 da disciplina Laboratório de Experimentação de Software (PUC Minas). Este documento descreve a mineração dos 1.000 repositórios mais estrelados do GitHub, as hipóteses informais do grupo, a metodologia de coleta via GraphQL e a configuração do processo Kanban no GitHub Projects. A seção de visualização gráfica detalhada (Issue #10) é de responsabilidade dos demais integrantes e deve ser anexada/integrada quando concluída.</w:t>
       </w:r>
@@ -100,14 +79,12 @@
             <w:shd w:val="clear" w:color="auto" w:fill="F0F0EC"/>
           </w:tcPr>
           <w:p>
-            <w:proofErr w:type="spellStart"/>
             <w:r>
               <w:rPr>
                 <w:b/>
               </w:rPr>
               <w:t>Curso</w:t>
             </w:r>
-            <w:proofErr w:type="spellEnd"/>
           </w:p>
         </w:tc>
         <w:tc>
@@ -168,28 +145,12 @@
             <w:shd w:val="clear" w:color="auto" w:fill="F0F0EC"/>
           </w:tcPr>
           <w:p>
-            <w:proofErr w:type="spellStart"/>
             <w:r>
               <w:rPr>
                 <w:b/>
               </w:rPr>
-              <w:t>Turno</w:t>
+              <w:t>Turno / Período</w:t>
             </w:r>
-            <w:proofErr w:type="spellEnd"/>
-            <w:r>
-              <w:rPr>
-                <w:b/>
-              </w:rPr>
-              <w:t xml:space="preserve"> / </w:t>
-            </w:r>
-            <w:proofErr w:type="spellStart"/>
-            <w:r>
-              <w:rPr>
-                <w:b/>
-              </w:rPr>
-              <w:t>Período</w:t>
-            </w:r>
-            <w:proofErr w:type="spellEnd"/>
           </w:p>
         </w:tc>
         <w:tc>
@@ -261,6 +222,9 @@
               </w:rPr>
             </w:pPr>
             <w:r>
+              <w:rPr>
+                <w:lang w:val="pt-BR"/>
+              </w:rPr>
               <w:t>Lab01 — Características de repositórios populares + Setup do Kanban</w:t>
             </w:r>
           </w:p>
@@ -289,7 +253,15 @@
             <w:tcW w:w="5953" w:type="dxa"/>
           </w:tcPr>
           <w:p>
+            <w:pPr>
+              <w:rPr>
+                <w:lang w:val="pt-BR"/>
+              </w:rPr>
+            </w:pPr>
             <w:r>
+              <w:rPr>
+                <w:lang w:val="pt-BR"/>
+              </w:rPr>
               <w:t>Gabriel Ferreira Amaral (Druitti) · Gabriel Santiago (gabsant07) · Gabriel Tavares (Tavaresds1)</w:t>
             </w:r>
           </w:p>
@@ -315,17 +287,8 @@
                 <w:b/>
                 <w:lang w:val="pt-BR"/>
               </w:rPr>
-              <w:t xml:space="preserve">Link do repositório / GitHub </w:t>
+              <w:t>Link do repositório / GitHub Projects</w:t>
             </w:r>
-            <w:proofErr w:type="spellStart"/>
-            <w:r>
-              <w:rPr>
-                <w:b/>
-                <w:lang w:val="pt-BR"/>
-              </w:rPr>
-              <w:t>Projects</w:t>
-            </w:r>
-            <w:proofErr w:type="spellEnd"/>
           </w:p>
         </w:tc>
         <w:tc>
@@ -358,16 +321,8 @@
               <w:rPr>
                 <w:b/>
               </w:rPr>
-              <w:t xml:space="preserve">Data de </w:t>
+              <w:t>Data de entrega</w:t>
             </w:r>
-            <w:proofErr w:type="spellStart"/>
-            <w:r>
-              <w:rPr>
-                <w:b/>
-              </w:rPr>
-              <w:t>entrega</w:t>
-            </w:r>
-            <w:proofErr w:type="spellEnd"/>
           </w:p>
         </w:tc>
         <w:tc>
@@ -404,12 +359,6 @@
           <w:lang w:val="pt-BR"/>
         </w:rPr>
       </w:pPr>
-      <w:proofErr w:type="spellStart"/>
-      <w:proofErr w:type="spellEnd"/>
-      <w:proofErr w:type="spellStart"/>
-      <w:proofErr w:type="spellEnd"/>
-      <w:proofErr w:type="spellStart"/>
-      <w:proofErr w:type="spellEnd"/>
     </w:p>
     <w:p>
       <w:pPr>
@@ -478,21 +427,7 @@
         <w:rPr>
           <w:lang w:val="pt-BR"/>
         </w:rPr>
-        <w:t xml:space="preserve">Quais </w:t>
-      </w:r>
-      <w:proofErr w:type="spellStart"/>
-      <w:r>
-        <w:rPr>
-          <w:lang w:val="pt-BR"/>
-        </w:rPr>
-        <w:t>RQs</w:t>
-      </w:r>
-      <w:proofErr w:type="spellEnd"/>
-      <w:r>
-        <w:rPr>
-          <w:lang w:val="pt-BR"/>
-        </w:rPr>
-        <w:t>, métricas ou variáveis o grupo está propondo além do enunciado (resumo de 1 linha cada — os 30% de inovação)?</w:t>
+        <w:t>Quais RQs, métricas ou variáveis o grupo está propondo além do enunciado (resumo de 1 linha cada — os 30% de inovação)?</w:t>
       </w:r>
     </w:p>
     <w:p>
@@ -504,46 +439,165 @@
       </w:pPr>
       <w:r>
         <w:rPr>
-          <w:i w:val="0"/>
           <w:color w:val="000000"/>
-          <w:sz w:val="22"/>
+          <w:lang w:val="pt-BR"/>
         </w:rPr>
         <w:t>Repositórios open-source populares concentram boa parte da atenção da indústria e da academia, mas nem sempre há evidência sistemática sobre o perfil desses sistemas (idade, contribuição externa, releases, atualização, linguagem e gestão de issues). Este laboratório investiga essas características nos 1.000 repositórios com maior número de estrelas no GitHub e, em paralelo, institui o quadro Kanban (GitHub Projects v2) que acompanhará o grupo no semestre.</w:t>
+      </w:r>
+      <w:r>
+        <w:rPr>
+          <w:color w:val="000000"/>
+          <w:lang w:val="pt-BR"/>
+        </w:rPr>
         <w:br/>
+      </w:r>
+      <w:r>
+        <w:rPr>
+          <w:color w:val="000000"/>
+          <w:lang w:val="pt-BR"/>
+        </w:rPr>
         <w:br/>
         <w:t>Questões de Pesquisa do enunciado:</w:t>
+      </w:r>
+      <w:r>
+        <w:rPr>
+          <w:color w:val="000000"/>
+          <w:lang w:val="pt-BR"/>
+        </w:rPr>
         <w:br/>
         <w:t>RQ01. Sistemas populares são maduros/antigos? (idade a partir de createdAt)</w:t>
+      </w:r>
+      <w:r>
+        <w:rPr>
+          <w:color w:val="000000"/>
+          <w:lang w:val="pt-BR"/>
+        </w:rPr>
         <w:br/>
         <w:t>RQ02. Sistemas populares recebem muita contribuição externa? (PRs merged)</w:t>
+      </w:r>
+      <w:r>
+        <w:rPr>
+          <w:color w:val="000000"/>
+          <w:lang w:val="pt-BR"/>
+        </w:rPr>
         <w:br/>
         <w:t>RQ03. Sistemas populares lançam releases com frequência? (total de releases)</w:t>
+      </w:r>
+      <w:r>
+        <w:rPr>
+          <w:color w:val="000000"/>
+          <w:lang w:val="pt-BR"/>
+        </w:rPr>
         <w:br/>
         <w:t>RQ04. Sistemas populares são atualizados com frequência? (tempo desde pushedAt)</w:t>
+      </w:r>
+      <w:r>
+        <w:rPr>
+          <w:color w:val="000000"/>
+          <w:lang w:val="pt-BR"/>
+        </w:rPr>
         <w:br/>
         <w:t>RQ05. Sistemas populares são escritos nas linguagens mais populares? (primaryLanguage vs TIOBE Index)</w:t>
+      </w:r>
+      <w:r>
+        <w:rPr>
+          <w:color w:val="000000"/>
+          <w:lang w:val="pt-BR"/>
+        </w:rPr>
         <w:br/>
         <w:t>RQ06. Sistemas populares possuem alto percentual de issues fechadas? (closed/total)</w:t>
+      </w:r>
+      <w:r>
+        <w:rPr>
+          <w:color w:val="000000"/>
+          <w:lang w:val="pt-BR"/>
+        </w:rPr>
         <w:br/>
         <w:t>RQ07 (bônus). Linguagens TIOBE associam-se a mais PRs, releases e atualizações mais recentes?</w:t>
+      </w:r>
+      <w:r>
+        <w:rPr>
+          <w:color w:val="000000"/>
+          <w:lang w:val="pt-BR"/>
+        </w:rPr>
         <w:br/>
+      </w:r>
+      <w:r>
+        <w:rPr>
+          <w:color w:val="000000"/>
+          <w:lang w:val="pt-BR"/>
+        </w:rPr>
         <w:br/>
         <w:t>Hipóteses informais (antes da análise completa — Issue #9):</w:t>
+      </w:r>
+      <w:r>
+        <w:rPr>
+          <w:color w:val="000000"/>
+          <w:lang w:val="pt-BR"/>
+        </w:rPr>
         <w:br/>
         <w:t>RQ01 — Sim: mediana de idade elevada (vários anos), pois popularidade acumula-se no tempo.</w:t>
+      </w:r>
+      <w:r>
+        <w:rPr>
+          <w:color w:val="000000"/>
+          <w:lang w:val="pt-BR"/>
+        </w:rPr>
         <w:br/>
         <w:t>RQ02 — Em parte: mediana de PRs merged relevante, com forte assimetria (poucos repos concentram milhares de PRs).</w:t>
+      </w:r>
+      <w:r>
+        <w:rPr>
+          <w:color w:val="000000"/>
+          <w:lang w:val="pt-BR"/>
+        </w:rPr>
         <w:br/>
         <w:t>RQ03 — Não necessariamente: mediana de releases baixa/próxima de zero por causa de repos de curadoria/docs.</w:t>
+      </w:r>
+      <w:r>
+        <w:rPr>
+          <w:color w:val="000000"/>
+          <w:lang w:val="pt-BR"/>
+        </w:rPr>
         <w:br/>
         <w:t>RQ04 — Sim: tempo desde o último push tipicamente curto (dias/poucas semanas).</w:t>
+      </w:r>
+      <w:r>
+        <w:rPr>
+          <w:color w:val="000000"/>
+          <w:lang w:val="pt-BR"/>
+        </w:rPr>
         <w:br/>
         <w:t>RQ05 — Parcialmente: parcela relevante em linguagens TIOBE, mas também Markdown/null e linguagens fora do índice (ex.: TypeScript).</w:t>
+      </w:r>
+      <w:r>
+        <w:rPr>
+          <w:color w:val="000000"/>
+          <w:lang w:val="pt-BR"/>
+        </w:rPr>
         <w:br/>
         <w:t>RQ06 — Sim: razão mediana closed/total alta (~70–80% ou mais).</w:t>
+      </w:r>
+      <w:r>
+        <w:rPr>
+          <w:color w:val="000000"/>
+          <w:lang w:val="pt-BR"/>
+        </w:rPr>
         <w:br/>
         <w:t>RQ07 — Mista: TIOBE com mais PRs e updates mais recentes; releases com diferença menor.</w:t>
+      </w:r>
+      <w:r>
+        <w:rPr>
+          <w:color w:val="000000"/>
+          <w:lang w:val="pt-BR"/>
+        </w:rPr>
         <w:br/>
+      </w:r>
+      <w:r>
+        <w:rPr>
+          <w:color w:val="000000"/>
+          <w:lang w:val="pt-BR"/>
+        </w:rPr>
         <w:br/>
         <w:t>Inovações (30%): (i) validação rápida de amostra (5–10 repos) por bloco de métricas antes da coleta completa; (ii) paginação em lotes menores com retry/backoff para mitigar HTTP 502 na API GraphQL; (iii) snapshots CSV do GitHub Projects para reconstituição histórica do board (base dos Labs 04/05).</w:t>
       </w:r>
@@ -559,6 +613,7 @@
         <w:rPr>
           <w:lang w:val="pt-BR"/>
         </w:rPr>
+        <w:lastRenderedPageBreak/>
         <w:t>2. Contexto</w:t>
       </w:r>
     </w:p>
@@ -570,32 +625,6 @@
           <w:lang w:val="pt-BR"/>
         </w:rPr>
       </w:pPr>
-      <w:proofErr w:type="spellStart"/>
-      <w:proofErr w:type="spellEnd"/>
-      <w:proofErr w:type="gramStart"/>
-      <w:proofErr w:type="gramEnd"/>
-      <w:proofErr w:type="spellStart"/>
-      <w:proofErr w:type="spellEnd"/>
-      <w:proofErr w:type="spellStart"/>
-      <w:proofErr w:type="spellEnd"/>
-      <w:proofErr w:type="spellStart"/>
-      <w:proofErr w:type="spellEnd"/>
-      <w:proofErr w:type="spellStart"/>
-      <w:proofErr w:type="spellEnd"/>
-      <w:proofErr w:type="spellStart"/>
-      <w:proofErr w:type="spellEnd"/>
-      <w:proofErr w:type="spellStart"/>
-      <w:proofErr w:type="spellEnd"/>
-      <w:proofErr w:type="spellStart"/>
-      <w:proofErr w:type="spellEnd"/>
-      <w:proofErr w:type="spellStart"/>
-      <w:proofErr w:type="spellEnd"/>
-      <w:proofErr w:type="spellStart"/>
-      <w:proofErr w:type="spellEnd"/>
-      <w:proofErr w:type="spellStart"/>
-      <w:proofErr w:type="spellEnd"/>
-      <w:proofErr w:type="gramStart"/>
-      <w:proofErr w:type="gramEnd"/>
     </w:p>
     <w:p>
       <w:pPr>
@@ -606,15 +635,38 @@
       </w:pPr>
       <w:r>
         <w:rPr>
-          <w:i w:val="0"/>
           <w:color w:val="000000"/>
-          <w:sz w:val="22"/>
+          <w:lang w:val="pt-BR"/>
         </w:rPr>
         <w:t>Este é o Lab01, ponto de partida do semestre: combina mineração de software (1.000 repositórios mais populares do GitHub) com a implantação do processo Kanban do próprio grupo. Os dados e o board gerados aqui alimentam laboratórios posteriores (em especial snapshots para Labs 04 e 05).</w:t>
+      </w:r>
+      <w:r>
+        <w:rPr>
+          <w:color w:val="000000"/>
+          <w:lang w:val="pt-BR"/>
+        </w:rPr>
         <w:br/>
+      </w:r>
+      <w:r>
+        <w:rPr>
+          <w:color w:val="000000"/>
+          <w:lang w:val="pt-BR"/>
+        </w:rPr>
         <w:br/>
         <w:t>Objeto de estudo: repositórios retornados pela busca GraphQL `stars:&gt;1 sort:stars-desc`, limitados aos 1.000 primeiros, com métricas alinhadas às RQs 01–06 (e campos necessários ao bônus RQ07).</w:t>
+      </w:r>
+      <w:r>
+        <w:rPr>
+          <w:color w:val="000000"/>
+          <w:lang w:val="pt-BR"/>
+        </w:rPr>
         <w:br/>
+      </w:r>
+      <w:r>
+        <w:rPr>
+          <w:color w:val="000000"/>
+          <w:lang w:val="pt-BR"/>
+        </w:rPr>
         <w:br/>
         <w:t>Referência conceitual para “linguagens mais populares” (RQ05/RQ07): TIOBE Index (https://www.tiobe.com/tiobe-index/), mantida como fonte única em todo o Lab01, conforme documentado no README e em docs/hipoteses-informais.md.</w:t>
       </w:r>
@@ -653,7 +705,6 @@
         <w:rPr>
           <w:lang w:val="pt-BR"/>
         </w:rPr>
-        <w:lastRenderedPageBreak/>
         <w:t>3.1 Principais Desafios</w:t>
       </w:r>
     </w:p>
@@ -665,14 +716,6 @@
           <w:lang w:val="pt-BR"/>
         </w:rPr>
       </w:pPr>
-      <w:proofErr w:type="spellStart"/>
-      <w:proofErr w:type="spellEnd"/>
-      <w:proofErr w:type="spellStart"/>
-      <w:proofErr w:type="spellEnd"/>
-      <w:proofErr w:type="spellStart"/>
-      <w:proofErr w:type="spellEnd"/>
-      <w:proofErr w:type="spellStart"/>
-      <w:proofErr w:type="spellEnd"/>
     </w:p>
     <w:p>
       <w:pPr>
@@ -683,19 +726,48 @@
       </w:pPr>
       <w:r>
         <w:rPr>
-          <w:i w:val="0"/>
           <w:color w:val="000000"/>
-          <w:sz w:val="22"/>
+          <w:lang w:val="pt-BR"/>
         </w:rPr>
         <w:t>Principais desafios enfrentados:</w:t>
+      </w:r>
+      <w:r>
+        <w:rPr>
+          <w:color w:val="000000"/>
+          <w:lang w:val="pt-BR"/>
+        </w:rPr>
         <w:br/>
         <w:t>• Complexidade/instabilidade da API GraphQL do GitHub ao solicitar connections (PRs, issues, releases) para dezenas de repositórios na mesma página — ocorrência recorrente de HTTP 502, mitigada com páginas menores e retries com backoff.</w:t>
+      </w:r>
+      <w:r>
+        <w:rPr>
+          <w:color w:val="000000"/>
+          <w:lang w:val="pt-BR"/>
+        </w:rPr>
         <w:br/>
         <w:t>• Paginação até 1.000 itens respeitando o limite de 100 nós por página da API Search.</w:t>
+      </w:r>
+      <w:r>
+        <w:rPr>
+          <w:color w:val="000000"/>
+          <w:lang w:val="pt-BR"/>
+        </w:rPr>
         <w:br/>
         <w:t>• Ausência de histórico consultável de mudança de Status no GitHub Projects via API, exigindo exportações periódicas (snapshots CSV) do board.</w:t>
+      </w:r>
+      <w:r>
+        <w:rPr>
+          <w:color w:val="000000"/>
+          <w:lang w:val="pt-BR"/>
+        </w:rPr>
         <w:br/>
         <w:t>• Valores ausentes: primaryLanguage nulo (listas/docs) e repositórios com zero issues (razão RQ06 indefinida).</w:t>
+      </w:r>
+      <w:r>
+        <w:rPr>
+          <w:color w:val="000000"/>
+          <w:lang w:val="pt-BR"/>
+        </w:rPr>
         <w:br/>
         <w:t>• Restrição do enunciado: proibição de bibliotecas de terceiros que encapsulem a API do GitHub — a query GraphQL e o cliente HTTP são próprios do grupo (Python + requests).</w:t>
       </w:r>
@@ -722,12 +794,6 @@
           <w:lang w:val="pt-BR"/>
         </w:rPr>
       </w:pPr>
-      <w:proofErr w:type="spellStart"/>
-      <w:proofErr w:type="spellEnd"/>
-      <w:proofErr w:type="spellStart"/>
-      <w:proofErr w:type="spellEnd"/>
-      <w:proofErr w:type="spellStart"/>
-      <w:proofErr w:type="spellEnd"/>
     </w:p>
     <w:p>
       <w:pPr>
@@ -738,21 +804,64 @@
       </w:pPr>
       <w:r>
         <w:rPr>
-          <w:i w:val="0"/>
           <w:color w:val="000000"/>
-          <w:sz w:val="22"/>
+          <w:lang w:val="pt-BR"/>
         </w:rPr>
         <w:t>Tomadas de decisão:</w:t>
+      </w:r>
+      <w:r>
+        <w:rPr>
+          <w:color w:val="000000"/>
+          <w:lang w:val="pt-BR"/>
+        </w:rPr>
         <w:br/>
         <w:t>• Linguagem/script: Python 3 com requests e query GraphQL própria (sem SDK GitHub).</w:t>
+      </w:r>
+      <w:r>
+        <w:rPr>
+          <w:color w:val="000000"/>
+          <w:lang w:val="pt-BR"/>
+        </w:rPr>
         <w:br/>
         <w:t>• Amostra: top 1.000 por estrelas via search GraphQL; sem exclusão a priori por linguagem.</w:t>
+      </w:r>
+      <w:r>
+        <w:rPr>
+          <w:color w:val="000000"/>
+          <w:lang w:val="pt-BR"/>
+        </w:rPr>
         <w:br/>
         <w:t>• RQ04 operacionalizada como dias desde pushedAt (atividade de código); updatedAt fica como apoio.</w:t>
+      </w:r>
+      <w:r>
+        <w:rPr>
+          <w:color w:val="000000"/>
+          <w:lang w:val="pt-BR"/>
+        </w:rPr>
         <w:br/>
         <w:t>• RQ05: classificação TIOBE vs. não-TIOBE a partir de primaryLanguage.name (TypeScript, Markdown etc. contam como fora do conjunto TIOBE adotado).</w:t>
+      </w:r>
+      <w:r>
+        <w:rPr>
+          <w:color w:val="000000"/>
+          <w:lang w:val="pt-BR"/>
+        </w:rPr>
         <w:br/>
-        <w:t>• WIP da coluna Doing = 2: trio; evita excesso de paralelismo e força Review/Done frequentes (docs/processo-kanban.md).</w:t>
+        <w:t xml:space="preserve">• WIP da coluna Doing = 2: trio; evita excesso de paralelismo e força Review/Done frequentes </w:t>
+      </w:r>
+      <w:r>
+        <w:rPr>
+          <w:color w:val="000000"/>
+          <w:lang w:val="pt-BR"/>
+        </w:rPr>
+        <w:lastRenderedPageBreak/>
+        <w:t>(docs/processo-kanban.md).</w:t>
+      </w:r>
+      <w:r>
+        <w:rPr>
+          <w:color w:val="000000"/>
+          <w:lang w:val="pt-BR"/>
+        </w:rPr>
         <w:br/>
         <w:t>• Commits devem referenciar #Issue para vinculação no board (correção centrada no Projects).</w:t>
       </w:r>
@@ -779,18 +888,6 @@
           <w:lang w:val="pt-BR"/>
         </w:rPr>
       </w:pPr>
-      <w:proofErr w:type="spellStart"/>
-      <w:proofErr w:type="spellEnd"/>
-      <w:proofErr w:type="spellStart"/>
-      <w:proofErr w:type="spellEnd"/>
-      <w:proofErr w:type="spellStart"/>
-      <w:proofErr w:type="spellEnd"/>
-      <w:proofErr w:type="spellStart"/>
-      <w:proofErr w:type="spellEnd"/>
-      <w:proofErr w:type="spellStart"/>
-      <w:proofErr w:type="spellEnd"/>
-      <w:proofErr w:type="spellStart"/>
-      <w:proofErr w:type="spellEnd"/>
     </w:p>
     <w:p>
       <w:pPr>
@@ -799,83 +896,254 @@
           <w:lang w:val="pt-BR"/>
         </w:rPr>
       </w:pPr>
-      <w:proofErr w:type="spellStart"/>
-      <w:proofErr w:type="spellEnd"/>
-      <w:proofErr w:type="spellStart"/>
-      <w:proofErr w:type="spellEnd"/>
-      <w:r>
-        <w:rPr>
-          <w:i w:val="0"/>
+      <w:r>
+        <w:rPr>
           <w:color w:val="000000"/>
-          <w:sz w:val="22"/>
+          <w:lang w:val="pt-BR"/>
         </w:rPr>
         <w:t>Etapas (sprints) e responsáveis (refletindo Assignees das Issues):</w:t>
+      </w:r>
+      <w:r>
+        <w:rPr>
+          <w:color w:val="000000"/>
+          <w:lang w:val="pt-BR"/>
+        </w:rPr>
         <w:br/>
+      </w:r>
+      <w:r>
+        <w:rPr>
+          <w:color w:val="000000"/>
+          <w:lang w:val="pt-BR"/>
+        </w:rPr>
         <w:br/>
         <w:t>Lab01S01 — Coleta GraphQL (100 repos) + setup Kanban</w:t>
+      </w:r>
+      <w:r>
+        <w:rPr>
+          <w:color w:val="000000"/>
+          <w:lang w:val="pt-BR"/>
+        </w:rPr>
         <w:br/>
         <w:t>• #2 Setup Projects/WIP/labels — Gabriel Ferreira (Druitti) — Done</w:t>
+      </w:r>
+      <w:r>
+        <w:rPr>
+          <w:color w:val="000000"/>
+          <w:lang w:val="pt-BR"/>
+        </w:rPr>
         <w:br/>
         <w:t>• #1 Query base + auth + fetch — Druitti — Done</w:t>
+      </w:r>
+      <w:r>
+        <w:rPr>
+          <w:color w:val="000000"/>
+          <w:lang w:val="pt-BR"/>
+        </w:rPr>
         <w:br/>
         <w:t>• #3 RQ01+RQ02 + validação amostra — Druitti — Done</w:t>
+      </w:r>
+      <w:r>
+        <w:rPr>
+          <w:color w:val="000000"/>
+          <w:lang w:val="pt-BR"/>
+        </w:rPr>
         <w:br/>
         <w:t>• #4 RQ03+RQ04 + validação — Druitti — Done</w:t>
+      </w:r>
+      <w:r>
+        <w:rPr>
+          <w:color w:val="000000"/>
+          <w:lang w:val="pt-BR"/>
+        </w:rPr>
         <w:br/>
         <w:t>• #5 RQ05+RQ06 + TIOBE — Druitti — Done</w:t>
+      </w:r>
+      <w:r>
+        <w:rPr>
+          <w:color w:val="000000"/>
+          <w:lang w:val="pt-BR"/>
+        </w:rPr>
         <w:br/>
         <w:t>• #6 Integração/smoke 100 — Druitti — Done</w:t>
+      </w:r>
+      <w:r>
+        <w:rPr>
+          <w:color w:val="000000"/>
+          <w:lang w:val="pt-BR"/>
+        </w:rPr>
         <w:br/>
+      </w:r>
+      <w:r>
+        <w:rPr>
+          <w:color w:val="000000"/>
+          <w:lang w:val="pt-BR"/>
+        </w:rPr>
         <w:br/>
         <w:t>Lab01S02 — Paginação 1000 + CSV + hipóteses + snapshot</w:t>
+      </w:r>
+      <w:r>
+        <w:rPr>
+          <w:color w:val="000000"/>
+          <w:lang w:val="pt-BR"/>
+        </w:rPr>
         <w:br/>
         <w:t>• #7 Paginação 1000 + export CSV — Gabriel Santiago (gabsant07) — Done (código + dados gerados)</w:t>
+      </w:r>
+      <w:r>
+        <w:rPr>
+          <w:color w:val="000000"/>
+          <w:lang w:val="pt-BR"/>
+        </w:rPr>
         <w:br/>
         <w:t>• #8 Snapshot GraphQL do Project → CSV — gabsant07 — em aberto no board (código presente: src/collect_repos_snapshot.py)</w:t>
+      </w:r>
+      <w:r>
+        <w:rPr>
+          <w:color w:val="000000"/>
+          <w:lang w:val="pt-BR"/>
+        </w:rPr>
         <w:br/>
         <w:t>• #9 Hipóteses informais — Druitti — Done</w:t>
+      </w:r>
+      <w:r>
+        <w:rPr>
+          <w:color w:val="000000"/>
+          <w:lang w:val="pt-BR"/>
+        </w:rPr>
         <w:br/>
+      </w:r>
+      <w:r>
+        <w:rPr>
+          <w:color w:val="000000"/>
+          <w:lang w:val="pt-BR"/>
+        </w:rPr>
         <w:br/>
         <w:t>Lab01S03 — Análise/visualização</w:t>
+      </w:r>
+      <w:r>
+        <w:rPr>
+          <w:color w:val="000000"/>
+          <w:lang w:val="pt-BR"/>
+        </w:rPr>
         <w:br/>
         <w:t>• #10 Análise/visualização RQs + bônus — Gabriel Tavares (Tavaresds1) e gabsant07 — em andamento (fora do escopo deste responsável pelo relatório textual)</w:t>
+      </w:r>
+      <w:r>
+        <w:rPr>
+          <w:color w:val="000000"/>
+          <w:lang w:val="pt-BR"/>
+        </w:rPr>
         <w:br/>
+      </w:r>
+      <w:r>
+        <w:rPr>
+          <w:color w:val="000000"/>
+          <w:lang w:val="pt-BR"/>
+        </w:rPr>
         <w:br/>
         <w:t>Relatório Final</w:t>
+      </w:r>
+      <w:r>
+        <w:rPr>
+          <w:color w:val="000000"/>
+          <w:lang w:val="pt-BR"/>
+        </w:rPr>
         <w:br/>
         <w:t>• #11 Relatório final + print do board — Druitti — este documento</w:t>
+      </w:r>
+      <w:r>
+        <w:rPr>
+          <w:color w:val="000000"/>
+          <w:lang w:val="pt-BR"/>
+        </w:rPr>
         <w:br/>
+      </w:r>
+      <w:r>
+        <w:rPr>
+          <w:color w:val="000000"/>
+          <w:lang w:val="pt-BR"/>
+        </w:rPr>
         <w:br/>
         <w:t>Configuração do processo (Kanban):</w:t>
+      </w:r>
+      <w:r>
+        <w:rPr>
+          <w:color w:val="000000"/>
+          <w:lang w:val="pt-BR"/>
+        </w:rPr>
         <w:br/>
         <w:t>• Colunas Status: Backlog → To Do → Doing → Review → Done</w:t>
+      </w:r>
+      <w:r>
+        <w:rPr>
+          <w:color w:val="000000"/>
+          <w:lang w:val="pt-BR"/>
+        </w:rPr>
         <w:br/>
         <w:t>• WIP Doing = 2 (justificativa na seção 3.2 e em docs/processo-kanban.md)</w:t>
+      </w:r>
+      <w:r>
+        <w:rPr>
+          <w:color w:val="000000"/>
+          <w:lang w:val="pt-BR"/>
+        </w:rPr>
         <w:br/>
         <w:t>• Cartões = Issues reais com Assignee; labels por integrante</w:t>
+      </w:r>
+      <w:r>
+        <w:rPr>
+          <w:color w:val="000000"/>
+          <w:lang w:val="pt-BR"/>
+        </w:rPr>
         <w:br/>
+      </w:r>
+      <w:r>
+        <w:rPr>
+          <w:color w:val="000000"/>
+          <w:lang w:val="pt-BR"/>
+        </w:rPr>
+        <w:lastRenderedPageBreak/>
         <w:br/>
-        <w:t>[INSERIR AQUI O PRINT DO BOARD] — Anexo obrigatório: captura de tela do GitHub Projects (https://github.com/users/Druitti/projects/5) ao final do Lab01, mostrando o fluxo completo e a política de WIP. Salvar também em relatorio/anexos/board-lab01.png se desejar versionar a imagem.</w:t>
-      </w:r>
-    </w:p>
-    <w:p>
-      <w:pPr>
-        <w:jc w:val="center"/>
-        <w:rPr>
-          <w:lang w:val="pt-BR"/>
-        </w:rPr>
-      </w:pPr>
-      <w:proofErr w:type="spellStart"/>
-      <w:proofErr w:type="spellEnd"/>
-      <w:proofErr w:type="spellStart"/>
-      <w:proofErr w:type="spellEnd"/>
-      <w:r>
-        <w:rPr>
-          <w:i w:val="0"/>
-          <w:color w:val="000000"/>
-          <w:sz w:val="22"/>
-        </w:rPr>
-        <w:t>Sugestão de anexo: print do quadro Kanban (GitHub Projects) mencionado acima. Enquanto a imagem não for colada neste .docx, use o link do Project e/ou o arquivo em relatorio/anexos/.</w:t>
+      </w:r>
+      <w:r>
+        <w:rPr>
+          <w:lang w:val="pt-BR"/>
+        </w:rPr>
+        <w:drawing>
+          <wp:inline distT="0" distB="0" distL="0" distR="0" wp14:anchorId="49E38DF7" wp14:editId="00A83045">
+            <wp:extent cx="5972810" cy="3008630"/>
+            <wp:effectExtent l="0" t="0" r="8890" b="1270"/>
+            <wp:docPr id="1" name="Imagem 1"/>
+            <wp:cNvGraphicFramePr>
+              <a:graphicFrameLocks xmlns:a="http://schemas.openxmlformats.org/drawingml/2006/main" noChangeAspect="1"/>
+            </wp:cNvGraphicFramePr>
+            <a:graphic xmlns:a="http://schemas.openxmlformats.org/drawingml/2006/main">
+              <a:graphicData uri="http://schemas.openxmlformats.org/drawingml/2006/picture">
+                <pic:pic xmlns:pic="http://schemas.openxmlformats.org/drawingml/2006/picture">
+                  <pic:nvPicPr>
+                    <pic:cNvPr id="1" name=""/>
+                    <pic:cNvPicPr/>
+                  </pic:nvPicPr>
+                  <pic:blipFill>
+                    <a:blip r:embed="rId6"/>
+                    <a:stretch>
+                      <a:fillRect/>
+                    </a:stretch>
+                  </pic:blipFill>
+                  <pic:spPr>
+                    <a:xfrm>
+                      <a:off x="0" y="0"/>
+                      <a:ext cx="5972810" cy="3008630"/>
+                    </a:xfrm>
+                    <a:prstGeom prst="rect">
+                      <a:avLst/>
+                    </a:prstGeom>
+                  </pic:spPr>
+                </pic:pic>
+              </a:graphicData>
+            </a:graphic>
+          </wp:inline>
+        </w:drawing>
       </w:r>
     </w:p>
     <w:p>
@@ -900,24 +1168,6 @@
           <w:lang w:val="pt-BR"/>
         </w:rPr>
       </w:pPr>
-      <w:proofErr w:type="spellStart"/>
-      <w:proofErr w:type="spellEnd"/>
-      <w:proofErr w:type="spellStart"/>
-      <w:proofErr w:type="spellEnd"/>
-      <w:proofErr w:type="spellStart"/>
-      <w:proofErr w:type="spellEnd"/>
-      <w:proofErr w:type="spellStart"/>
-      <w:proofErr w:type="spellEnd"/>
-      <w:proofErr w:type="spellStart"/>
-      <w:proofErr w:type="spellEnd"/>
-      <w:proofErr w:type="spellStart"/>
-      <w:proofErr w:type="spellEnd"/>
-      <w:proofErr w:type="spellStart"/>
-      <w:proofErr w:type="spellEnd"/>
-      <w:proofErr w:type="spellStart"/>
-      <w:proofErr w:type="spellEnd"/>
-      <w:proofErr w:type="spellStart"/>
-      <w:proofErr w:type="spellEnd"/>
     </w:p>
     <w:p>
       <w:pPr>
@@ -928,24 +1178,71 @@
       </w:pPr>
       <w:r>
         <w:rPr>
-          <w:i w:val="0"/>
           <w:color w:val="000000"/>
-          <w:sz w:val="22"/>
+          <w:lang w:val="pt-BR"/>
         </w:rPr>
         <w:t>Ferramentas utilizadas:</w:t>
+      </w:r>
+      <w:r>
+        <w:rPr>
+          <w:color w:val="000000"/>
+          <w:lang w:val="pt-BR"/>
+        </w:rPr>
         <w:br/>
         <w:t>• GitHub GraphQL API (https://api.github.com/graphql) — mineração e snapshot do Project</w:t>
+      </w:r>
+      <w:r>
+        <w:rPr>
+          <w:color w:val="000000"/>
+          <w:lang w:val="pt-BR"/>
+        </w:rPr>
         <w:br/>
         <w:t>• Python 3 + requests (+ python-dotenv opcional) — scripts próprios do grupo (src/collect_repos.py, src/validate_sample.py, src/collect_repos_snapshot.py)</w:t>
+      </w:r>
+      <w:r>
+        <w:rPr>
+          <w:color w:val="000000"/>
+          <w:lang w:val="pt-BR"/>
+        </w:rPr>
         <w:br/>
         <w:t>• Git / GitHub Issues + GitHub Projects (v2) — processo</w:t>
+      </w:r>
+      <w:r>
+        <w:rPr>
+          <w:color w:val="000000"/>
+          <w:lang w:val="pt-BR"/>
+        </w:rPr>
         <w:br/>
         <w:t>• (Pendente #10) biblioteca/ferramenta de visualização escolhida pelos responsáveis pela análise</w:t>
+      </w:r>
+      <w:r>
+        <w:rPr>
+          <w:color w:val="000000"/>
+          <w:lang w:val="pt-BR"/>
+        </w:rPr>
         <w:br/>
+      </w:r>
+      <w:r>
+        <w:rPr>
+          <w:color w:val="000000"/>
+          <w:lang w:val="pt-BR"/>
+        </w:rPr>
         <w:br/>
         <w:t>Links:</w:t>
+      </w:r>
+      <w:r>
+        <w:rPr>
+          <w:color w:val="000000"/>
+          <w:lang w:val="pt-BR"/>
+        </w:rPr>
         <w:br/>
         <w:t>• Repositório: https://github.com/Druitti/Laboratorio-de-Desenvolvimento-de-Software</w:t>
+      </w:r>
+      <w:r>
+        <w:rPr>
+          <w:color w:val="000000"/>
+          <w:lang w:val="pt-BR"/>
+        </w:rPr>
         <w:br/>
         <w:t>• GitHub Projects: https://github.com/users/Druitti/projects/5</w:t>
       </w:r>
@@ -962,54 +1259,6 @@
           <w:lang w:val="pt-BR"/>
         </w:rPr>
         <w:t>3.5 Tabela de Métricas</w:t>
-      </w:r>
-    </w:p>
-    <w:p>
-      <w:pPr>
-        <w:spacing w:after="200"/>
-        <w:ind w:left="198"/>
-        <w:rPr>
-          <w:lang w:val="pt-BR"/>
-        </w:rPr>
-      </w:pPr>
-      <w:r>
-        <w:rPr>
-          <w:b/>
-          <w:i/>
-          <w:color w:val="1F6E63"/>
-          <w:sz w:val="21"/>
-          <w:lang w:val="pt-BR"/>
-        </w:rPr>
-        <w:t xml:space="preserve">ORIENTAÇÃO: </w:t>
-      </w:r>
-      <w:r>
-        <w:rPr>
-          <w:i/>
-          <w:color w:val="595959"/>
-          <w:sz w:val="21"/>
-          <w:lang w:val="pt-BR"/>
-        </w:rPr>
-        <w:t xml:space="preserve">Construa uma tabela relacionando cada Questão de Pesquisa à métrica correspondente, sua definição operacional exata (a fórmula ou regra de cálculo — não basta o nome) e a ferramenta/fonte usada para coletá-la. Isso é o que garante que o laboratório seja reprodutível por outro grupo. A primeira linha abaixo é um exemplo ilustrativo (baseado no Lab01); substitua pelas </w:t>
-      </w:r>
-      <w:proofErr w:type="spellStart"/>
-      <w:r>
-        <w:rPr>
-          <w:i/>
-          <w:color w:val="595959"/>
-          <w:sz w:val="21"/>
-          <w:lang w:val="pt-BR"/>
-        </w:rPr>
-        <w:t>RQs</w:t>
-      </w:r>
-      <w:proofErr w:type="spellEnd"/>
-      <w:r>
-        <w:rPr>
-          <w:i/>
-          <w:color w:val="595959"/>
-          <w:sz w:val="21"/>
-          <w:lang w:val="pt-BR"/>
-        </w:rPr>
-        <w:t xml:space="preserve"> e métricas do seu laboratório.</w:t>
       </w:r>
     </w:p>
     <w:tbl>
@@ -1333,6 +1582,7 @@
           </w:tcPr>
           <w:p>
             <w:r>
+              <w:lastRenderedPageBreak/>
               <w:t>RQ05</w:t>
             </w:r>
           </w:p>
@@ -1352,7 +1602,15 @@
             <w:tcW w:w="1881" w:type="dxa"/>
           </w:tcPr>
           <w:p>
+            <w:pPr>
+              <w:rPr>
+                <w:lang w:val="pt-BR"/>
+              </w:rPr>
+            </w:pPr>
             <w:r>
+              <w:rPr>
+                <w:lang w:val="pt-BR"/>
+              </w:rPr>
               <w:t>primaryLanguage.name classificada vs TIOBE Index</w:t>
             </w:r>
           </w:p>
@@ -1381,7 +1639,7 @@
       <w:tr>
         <w:tc>
           <w:tcPr>
-            <w:tcW w:type="dxa" w:w="1881"/>
+            <w:tcW w:w="1881" w:type="dxa"/>
           </w:tcPr>
           <w:p>
             <w:r>
@@ -1391,7 +1649,7 @@
         </w:tc>
         <w:tc>
           <w:tcPr>
-            <w:tcW w:type="dxa" w:w="1881"/>
+            <w:tcW w:w="1881" w:type="dxa"/>
           </w:tcPr>
           <w:p>
             <w:r>
@@ -1401,7 +1659,7 @@
         </w:tc>
         <w:tc>
           <w:tcPr>
-            <w:tcW w:type="dxa" w:w="3118"/>
+            <w:tcW w:w="3118" w:type="dxa"/>
           </w:tcPr>
           <w:p>
             <w:r>
@@ -1411,7 +1669,7 @@
         </w:tc>
         <w:tc>
           <w:tcPr>
-            <w:tcW w:type="dxa" w:w="1881"/>
+            <w:tcW w:w="1881" w:type="dxa"/>
           </w:tcPr>
           <w:p>
             <w:r>
@@ -1421,7 +1679,7 @@
         </w:tc>
         <w:tc>
           <w:tcPr>
-            <w:tcW w:type="dxa" w:w="1881"/>
+            <w:tcW w:w="1881" w:type="dxa"/>
           </w:tcPr>
           <w:p>
             <w:r>
@@ -1433,7 +1691,7 @@
       <w:tr>
         <w:tc>
           <w:tcPr>
-            <w:tcW w:type="dxa" w:w="1881"/>
+            <w:tcW w:w="1881" w:type="dxa"/>
           </w:tcPr>
           <w:p>
             <w:r>
@@ -1443,27 +1701,43 @@
         </w:tc>
         <w:tc>
           <w:tcPr>
-            <w:tcW w:type="dxa" w:w="1881"/>
+            <w:tcW w:w="1881" w:type="dxa"/>
           </w:tcPr>
           <w:p>
+            <w:pPr>
+              <w:rPr>
+                <w:lang w:val="pt-BR"/>
+              </w:rPr>
+            </w:pPr>
             <w:r>
+              <w:rPr>
+                <w:lang w:val="pt-BR"/>
+              </w:rPr>
               <w:t>PRs/releases/atualização por linguagem</w:t>
             </w:r>
           </w:p>
         </w:tc>
         <w:tc>
           <w:tcPr>
-            <w:tcW w:type="dxa" w:w="3118"/>
+            <w:tcW w:w="3118" w:type="dxa"/>
           </w:tcPr>
           <w:p>
+            <w:pPr>
+              <w:rPr>
+                <w:lang w:val="pt-BR"/>
+              </w:rPr>
+            </w:pPr>
             <w:r>
+              <w:rPr>
+                <w:lang w:val="pt-BR"/>
+              </w:rPr>
               <w:t>Segmentação das métricas RQ02–04 por linguagem / TIOBE</w:t>
             </w:r>
           </w:p>
         </w:tc>
         <w:tc>
           <w:tcPr>
-            <w:tcW w:type="dxa" w:w="1881"/>
+            <w:tcW w:w="1881" w:type="dxa"/>
           </w:tcPr>
           <w:p>
             <w:r>
@@ -1473,7 +1747,7 @@
         </w:tc>
         <w:tc>
           <w:tcPr>
-            <w:tcW w:type="dxa" w:w="1881"/>
+            <w:tcW w:w="1881" w:type="dxa"/>
           </w:tcPr>
           <w:p>
             <w:r>
@@ -1516,18 +1790,47 @@
       </w:pPr>
       <w:r>
         <w:rPr>
-          <w:i w:val="0"/>
           <w:color w:val="000000"/>
-          <w:sz w:val="22"/>
+          <w:lang w:val="pt-BR"/>
         </w:rPr>
         <w:t>Inovações propostas pelo grupo (30%):</w:t>
+      </w:r>
+      <w:r>
+        <w:rPr>
+          <w:color w:val="000000"/>
+          <w:lang w:val="pt-BR"/>
+        </w:rPr>
         <w:br/>
         <w:t>1) Pipeline de validação de amostra (validate_sample.py) por bloco de RQs antes da coleta em escala — reduz risco de métrica ausente/errada.</w:t>
+      </w:r>
+      <w:r>
+        <w:rPr>
+          <w:color w:val="000000"/>
+          <w:lang w:val="pt-BR"/>
+        </w:rPr>
         <w:br/>
         <w:t>2) Estratégia anti-502 (page size reduzido + retries) na coleta GraphQL dos top repositórios.</w:t>
+      </w:r>
+      <w:r>
+        <w:rPr>
+          <w:color w:val="000000"/>
+          <w:lang w:val="pt-BR"/>
+        </w:rPr>
         <w:br/>
         <w:t>3) Exportação de snapshots do GitHub Projects em CSV (collect_repos_snapshot.py), criando série temporal do Status das Issues para Labs 04/05.</w:t>
+      </w:r>
+      <w:r>
+        <w:rPr>
+          <w:color w:val="000000"/>
+          <w:lang w:val="pt-BR"/>
+        </w:rPr>
         <w:br/>
+      </w:r>
+      <w:r>
+        <w:rPr>
+          <w:color w:val="000000"/>
+          <w:lang w:val="pt-BR"/>
+        </w:rPr>
         <w:br/>
         <w:t>Os resultados numéricos dessas inovações aparecem na robustez da coleta (1.000 repos obtidos) e na rastreabilidade do processo; gráficos comparativos detalhados ficam a cargo da Issue #10.</w:t>
       </w:r>
@@ -1558,6 +1861,152 @@
           <w:lang w:val="pt-BR"/>
         </w:rPr>
         <w:t>4.1 Coleta de Dados</w:t>
+      </w:r>
+    </w:p>
+    <w:p>
+      <w:pPr>
+        <w:ind w:left="198"/>
+        <w:rPr>
+          <w:lang w:val="pt-BR"/>
+        </w:rPr>
+      </w:pPr>
+      <w:r>
+        <w:rPr>
+          <w:color w:val="000000"/>
+          <w:lang w:val="pt-BR"/>
+        </w:rPr>
+        <w:t>Coleta de dados (estado atual):</w:t>
+      </w:r>
+      <w:r>
+        <w:rPr>
+          <w:color w:val="000000"/>
+          <w:lang w:val="pt-BR"/>
+        </w:rPr>
+        <w:br/>
+        <w:t>• Alvo: 1.000 repositórios; obtido: 1.000 linhas em data/top_1000_repos.csv (e JSON correspondente).</w:t>
+      </w:r>
+      <w:r>
+        <w:rPr>
+          <w:color w:val="000000"/>
+          <w:lang w:val="pt-BR"/>
+        </w:rPr>
+        <w:br/>
+        <w:t>• Período de referência da coleta local disponível: agosto/2026.</w:t>
+      </w:r>
+      <w:r>
+        <w:rPr>
+          <w:color w:val="000000"/>
+          <w:lang w:val="pt-BR"/>
+        </w:rPr>
+        <w:br/>
+        <w:t>• Ausências observadas na amostra: primaryLanguage nulo em 87 repos; 43 repos com zero issues (razão RQ06 não definida).</w:t>
+      </w:r>
+      <w:r>
+        <w:rPr>
+          <w:color w:val="000000"/>
+          <w:lang w:val="pt-BR"/>
+        </w:rPr>
+        <w:br/>
+        <w:t>• Tratamento: ausências reportadas; razões RQ06 calculadas apenas quando issues &gt; 0; linguagem nula tratada como categoria própria / fora do TIOBE.</w:t>
+      </w:r>
+      <w:r>
+        <w:rPr>
+          <w:color w:val="000000"/>
+          <w:lang w:val="pt-BR"/>
+        </w:rPr>
+        <w:br/>
+      </w:r>
+      <w:r>
+        <w:rPr>
+          <w:color w:val="000000"/>
+          <w:lang w:val="pt-BR"/>
+        </w:rPr>
+        <w:br/>
+        <w:t>Resumo descritivo (medianas na amostra de 1.000 — apoio ao relatório; gráficos na #10):</w:t>
+      </w:r>
+      <w:r>
+        <w:rPr>
+          <w:color w:val="000000"/>
+          <w:lang w:val="pt-BR"/>
+        </w:rPr>
+        <w:br/>
+        <w:t>• RQ01 — mediana da idade ≈ 2.831 dias (~7,8 anos)</w:t>
+      </w:r>
+      <w:r>
+        <w:rPr>
+          <w:color w:val="000000"/>
+          <w:lang w:val="pt-BR"/>
+        </w:rPr>
+        <w:br/>
+        <w:t>• RQ02 — mediana de PRs merged ≈ 768 (média ≈ 4.243 — forte assimetria)</w:t>
+      </w:r>
+      <w:r>
+        <w:rPr>
+          <w:color w:val="000000"/>
+          <w:lang w:val="pt-BR"/>
+        </w:rPr>
+        <w:br/>
+        <w:t>• RQ03 — mediana de releases ≈ 40; cerca de 28% com zero releases</w:t>
+      </w:r>
+      <w:r>
+        <w:rPr>
+          <w:color w:val="000000"/>
+          <w:lang w:val="pt-BR"/>
+        </w:rPr>
+        <w:br/>
+        <w:t>• RQ04 — mediana de dias desde pushedAt ≈ 6</w:t>
+      </w:r>
+      <w:r>
+        <w:rPr>
+          <w:color w:val="000000"/>
+          <w:lang w:val="pt-BR"/>
+        </w:rPr>
+        <w:br/>
+        <w:t>• RQ05 — entre repos com linguagem: ~67,9% em linguagens do conjunto TIOBE adotado; tops: Python, TypeScript, JavaScript, Go, Rust</w:t>
+      </w:r>
+      <w:r>
+        <w:rPr>
+          <w:color w:val="000000"/>
+          <w:lang w:val="pt-BR"/>
+        </w:rPr>
+        <w:br/>
+        <w:t>• RQ06 — mediana closed/total ≈ 0,875 (87,5%)</w:t>
+      </w:r>
+      <w:r>
+        <w:rPr>
+          <w:color w:val="000000"/>
+          <w:lang w:val="pt-BR"/>
+        </w:rPr>
+        <w:br/>
+      </w:r>
+      <w:r>
+        <w:rPr>
+          <w:color w:val="000000"/>
+          <w:lang w:val="pt-BR"/>
+        </w:rPr>
+        <w:br/>
+      </w:r>
+      <w:r>
+        <w:rPr>
+          <w:color w:val="000000"/>
+          <w:lang w:val="pt-BR"/>
+        </w:rPr>
+        <w:lastRenderedPageBreak/>
+        <w:t>Snapshots do Project: script disponível (src/collect_repos_snapshot.py); a Issue #8 permanece aberta no board até a exportação CSV de fechamento ser confirmada pelos responsáveis.</w:t>
+      </w:r>
+    </w:p>
+    <w:p>
+      <w:pPr>
+        <w:pStyle w:val="Ttulo2"/>
+        <w:rPr>
+          <w:lang w:val="pt-BR"/>
+        </w:rPr>
+      </w:pPr>
+      <w:r>
+        <w:rPr>
+          <w:lang w:val="pt-BR"/>
+        </w:rPr>
+        <w:t>4.2 Visualização Gráfica</w:t>
       </w:r>
     </w:p>
     <w:p>
@@ -1568,182 +2017,6 @@
           <w:lang w:val="pt-BR"/>
         </w:rPr>
       </w:pPr>
-      <w:r>
-        <w:rPr>
-          <w:b/>
-          <w:i/>
-          <w:color w:val="1F6E63"/>
-          <w:sz w:val="21"/>
-          <w:lang w:val="pt-BR"/>
-        </w:rPr>
-        <w:t xml:space="preserve">ORIENTAÇÃO: </w:t>
-      </w:r>
-      <w:r>
-        <w:rPr>
-          <w:i/>
-          <w:color w:val="595959"/>
-          <w:sz w:val="21"/>
-          <w:lang w:val="pt-BR"/>
-        </w:rPr>
-        <w:t xml:space="preserve">Relate o volume final de dados efetivamente coletado e analisado — não apenas o volume-alvo do enunciado. Informe: quantos itens restaram após os filtros de qualidade (ex.: dos 1.000 repositórios buscados, quantos tinham dados completos; dos repositórios candidatos, quantos de fato usavam GitHub </w:t>
-      </w:r>
-      <w:proofErr w:type="spellStart"/>
-      <w:r>
-        <w:rPr>
-          <w:i/>
-          <w:color w:val="595959"/>
-          <w:sz w:val="21"/>
-          <w:lang w:val="pt-BR"/>
-        </w:rPr>
-        <w:t>Actions</w:t>
-      </w:r>
-      <w:proofErr w:type="spellEnd"/>
-      <w:r>
-        <w:rPr>
-          <w:i/>
-          <w:color w:val="595959"/>
-          <w:sz w:val="21"/>
-          <w:lang w:val="pt-BR"/>
-        </w:rPr>
-        <w:t xml:space="preserve"> — Lab03); o período coberto pela coleta; quantos </w:t>
-      </w:r>
-      <w:proofErr w:type="spellStart"/>
-      <w:r>
-        <w:rPr>
-          <w:i/>
-          <w:color w:val="595959"/>
-          <w:sz w:val="21"/>
-          <w:lang w:val="pt-BR"/>
-        </w:rPr>
-        <w:t>trials</w:t>
-      </w:r>
-      <w:proofErr w:type="spellEnd"/>
-      <w:r>
-        <w:rPr>
-          <w:i/>
-          <w:color w:val="595959"/>
-          <w:sz w:val="21"/>
-          <w:lang w:val="pt-BR"/>
-        </w:rPr>
-        <w:t xml:space="preserve">/execuções foram concluídos dentro do </w:t>
-      </w:r>
-      <w:r>
-        <w:rPr>
-          <w:i/>
-          <w:color w:val="595959"/>
-          <w:sz w:val="21"/>
-          <w:lang w:val="pt-BR"/>
-        </w:rPr>
-        <w:lastRenderedPageBreak/>
-        <w:t xml:space="preserve">tempo (Lab02); quantos snapshots do </w:t>
-      </w:r>
-      <w:proofErr w:type="spellStart"/>
-      <w:r>
-        <w:rPr>
-          <w:i/>
-          <w:color w:val="595959"/>
-          <w:sz w:val="21"/>
-          <w:lang w:val="pt-BR"/>
-        </w:rPr>
-        <w:t>Kanban</w:t>
-      </w:r>
-      <w:proofErr w:type="spellEnd"/>
-      <w:r>
-        <w:rPr>
-          <w:i/>
-          <w:color w:val="595959"/>
-          <w:sz w:val="21"/>
-          <w:lang w:val="pt-BR"/>
-        </w:rPr>
-        <w:t xml:space="preserve"> estão disponíveis e desde quando (Lab04/Lab05); outliers ou dados ausentes identificados, e como foram tratados (removidos, mantidos e discutidos à </w:t>
-      </w:r>
-      <w:proofErr w:type="gramStart"/>
-      <w:r>
-        <w:rPr>
-          <w:i/>
-          <w:color w:val="595959"/>
-          <w:sz w:val="21"/>
-          <w:lang w:val="pt-BR"/>
-        </w:rPr>
-        <w:t>parte, etc.</w:t>
-      </w:r>
-      <w:proofErr w:type="gramEnd"/>
-      <w:r>
-        <w:rPr>
-          <w:i/>
-          <w:color w:val="595959"/>
-          <w:sz w:val="21"/>
-          <w:lang w:val="pt-BR"/>
-        </w:rPr>
-        <w:t>).</w:t>
-      </w:r>
-    </w:p>
-    <w:p>
-      <w:pPr>
-        <w:ind w:left="198"/>
-        <w:rPr>
-          <w:lang w:val="pt-BR"/>
-        </w:rPr>
-      </w:pPr>
-      <w:r>
-        <w:rPr>
-          <w:i w:val="0"/>
-          <w:color w:val="000000"/>
-          <w:sz w:val="22"/>
-        </w:rPr>
-        <w:t>Coleta de dados (estado atual):</w:t>
-        <w:br/>
-        <w:t>• Alvo: 1.000 repositórios; obtido: 1.000 linhas em data/top_1000_repos.csv (e JSON correspondente).</w:t>
-        <w:br/>
-        <w:t>• Período de referência da coleta local disponível: agosto/2026.</w:t>
-        <w:br/>
-        <w:t>• Ausências observadas na amostra: primaryLanguage nulo em 87 repos; 43 repos com zero issues (razão RQ06 não definida).</w:t>
-        <w:br/>
-        <w:t>• Tratamento: ausências reportadas; razões RQ06 calculadas apenas quando issues &gt; 0; linguagem nula tratada como categoria própria / fora do TIOBE.</w:t>
-        <w:br/>
-        <w:br/>
-        <w:t>Resumo descritivo (medianas na amostra de 1.000 — apoio ao relatório; gráficos na #10):</w:t>
-        <w:br/>
-        <w:t>• RQ01 — mediana da idade ≈ 2.831 dias (~7,8 anos)</w:t>
-        <w:br/>
-        <w:t>• RQ02 — mediana de PRs merged ≈ 768 (média ≈ 4.243 — forte assimetria)</w:t>
-        <w:br/>
-        <w:t>• RQ03 — mediana de releases ≈ 40; cerca de 28% com zero releases</w:t>
-        <w:br/>
-        <w:t>• RQ04 — mediana de dias desde pushedAt ≈ 6</w:t>
-        <w:br/>
-        <w:t>• RQ05 — entre repos com linguagem: ~67,9% em linguagens do conjunto TIOBE adotado; tops: Python, TypeScript, JavaScript, Go, Rust</w:t>
-        <w:br/>
-        <w:t>• RQ06 — mediana closed/total ≈ 0,875 (87,5%)</w:t>
-        <w:br/>
-        <w:br/>
-        <w:t>Snapshots do Project: script disponível (src/collect_repos_snapshot.py); a Issue #8 permanece aberta no board até a exportação CSV de fechamento ser confirmada pelos responsáveis.</w:t>
-      </w:r>
-    </w:p>
-    <w:p>
-      <w:pPr>
-        <w:pStyle w:val="Ttulo2"/>
-        <w:rPr>
-          <w:lang w:val="pt-BR"/>
-        </w:rPr>
-      </w:pPr>
-      <w:r>
-        <w:rPr>
-          <w:lang w:val="pt-BR"/>
-        </w:rPr>
-        <w:t>4.2 Visualização Gráfica</w:t>
-      </w:r>
-    </w:p>
-    <w:p>
-      <w:pPr>
-        <w:spacing w:after="200"/>
-        <w:ind w:left="198"/>
-        <w:rPr>
-          <w:lang w:val="pt-BR"/>
-        </w:rPr>
-      </w:pPr>
-      <w:proofErr w:type="spellStart"/>
-      <w:proofErr w:type="spellEnd"/>
     </w:p>
     <w:tbl>
       <w:tblPr>
@@ -1769,25 +2042,7 @@
                 <w:color w:val="FFFFFF"/>
                 <w:sz w:val="20"/>
               </w:rPr>
-              <w:t xml:space="preserve">Tipo de </w:t>
-            </w:r>
-            <w:proofErr w:type="spellStart"/>
-            <w:r>
-              <w:rPr>
-                <w:b/>
-                <w:color w:val="FFFFFF"/>
-                <w:sz w:val="20"/>
-              </w:rPr>
-              <w:t>pergunta</w:t>
-            </w:r>
-            <w:proofErr w:type="spellEnd"/>
-            <w:r>
-              <w:rPr>
-                <w:b/>
-                <w:color w:val="FFFFFF"/>
-                <w:sz w:val="20"/>
-              </w:rPr>
-              <w:t xml:space="preserve"> / dado</w:t>
+              <w:t>Tipo de pergunta / dado</w:t>
             </w:r>
           </w:p>
         </w:tc>
@@ -1878,53 +2133,12 @@
                 <w:lang w:val="pt-BR"/>
               </w:rPr>
             </w:pPr>
-            <w:proofErr w:type="spellStart"/>
             <w:r>
               <w:rPr>
                 <w:sz w:val="19"/>
                 <w:lang w:val="pt-BR"/>
               </w:rPr>
-              <w:t>Boxplot</w:t>
-            </w:r>
-            <w:proofErr w:type="spellEnd"/>
-            <w:r>
-              <w:rPr>
-                <w:sz w:val="19"/>
-                <w:lang w:val="pt-BR"/>
-              </w:rPr>
-              <w:t xml:space="preserve"> pareado ou gráfico de pontos conectados (</w:t>
-            </w:r>
-            <w:proofErr w:type="spellStart"/>
-            <w:r>
-              <w:rPr>
-                <w:sz w:val="19"/>
-                <w:lang w:val="pt-BR"/>
-              </w:rPr>
-              <w:t>before</w:t>
-            </w:r>
-            <w:proofErr w:type="spellEnd"/>
-            <w:r>
-              <w:rPr>
-                <w:sz w:val="19"/>
-                <w:lang w:val="pt-BR"/>
-              </w:rPr>
-              <w:t>/</w:t>
-            </w:r>
-            <w:proofErr w:type="spellStart"/>
-            <w:r>
-              <w:rPr>
-                <w:sz w:val="19"/>
-                <w:lang w:val="pt-BR"/>
-              </w:rPr>
-              <w:t>after</w:t>
-            </w:r>
-            <w:proofErr w:type="spellEnd"/>
-            <w:r>
-              <w:rPr>
-                <w:sz w:val="19"/>
-                <w:lang w:val="pt-BR"/>
-              </w:rPr>
-              <w:t>)</w:t>
+              <w:t>Boxplot pareado ou gráfico de pontos conectados (before/after)</w:t>
             </w:r>
           </w:p>
         </w:tc>
@@ -1954,33 +2168,11 @@
             <w:tcW w:w="4703" w:type="dxa"/>
           </w:tcPr>
           <w:p>
-            <w:proofErr w:type="spellStart"/>
             <w:r>
               <w:rPr>
                 <w:sz w:val="19"/>
               </w:rPr>
-              <w:t>Histograma</w:t>
-            </w:r>
-            <w:proofErr w:type="spellEnd"/>
-            <w:r>
-              <w:rPr>
-                <w:sz w:val="19"/>
-              </w:rPr>
-              <w:t xml:space="preserve"> </w:t>
-            </w:r>
-            <w:proofErr w:type="spellStart"/>
-            <w:r>
-              <w:rPr>
-                <w:sz w:val="19"/>
-              </w:rPr>
-              <w:t>ou</w:t>
-            </w:r>
-            <w:proofErr w:type="spellEnd"/>
-            <w:r>
-              <w:rPr>
-                <w:sz w:val="19"/>
-              </w:rPr>
-              <w:t xml:space="preserve"> boxplot</w:t>
+              <w:t>Histograma ou boxplot</w:t>
             </w:r>
           </w:p>
         </w:tc>
@@ -2020,39 +2212,7 @@
                 <w:sz w:val="19"/>
                 <w:lang w:val="pt-BR"/>
               </w:rPr>
-              <w:t>Gráfico de dispersão (</w:t>
-            </w:r>
-            <w:proofErr w:type="spellStart"/>
-            <w:r>
-              <w:rPr>
-                <w:sz w:val="19"/>
-                <w:lang w:val="pt-BR"/>
-              </w:rPr>
-              <w:t>scatter</w:t>
-            </w:r>
-            <w:proofErr w:type="spellEnd"/>
-            <w:r>
-              <w:rPr>
-                <w:sz w:val="19"/>
-                <w:lang w:val="pt-BR"/>
-              </w:rPr>
-              <w:t xml:space="preserve"> </w:t>
-            </w:r>
-            <w:proofErr w:type="spellStart"/>
-            <w:r>
-              <w:rPr>
-                <w:sz w:val="19"/>
-                <w:lang w:val="pt-BR"/>
-              </w:rPr>
-              <w:t>plot</w:t>
-            </w:r>
-            <w:proofErr w:type="spellEnd"/>
-            <w:r>
-              <w:rPr>
-                <w:sz w:val="19"/>
-                <w:lang w:val="pt-BR"/>
-              </w:rPr>
-              <w:t>)</w:t>
+              <w:t>Gráfico de dispersão (scatter plot)</w:t>
             </w:r>
           </w:p>
         </w:tc>
@@ -2073,23 +2233,7 @@
                 <w:sz w:val="19"/>
                 <w:lang w:val="pt-BR"/>
               </w:rPr>
-              <w:t xml:space="preserve">Evolução ao longo do tempo (ex.: </w:t>
-            </w:r>
-            <w:proofErr w:type="spellStart"/>
-            <w:r>
-              <w:rPr>
-                <w:sz w:val="19"/>
-                <w:lang w:val="pt-BR"/>
-              </w:rPr>
-              <w:t>cycle</w:t>
-            </w:r>
-            <w:proofErr w:type="spellEnd"/>
-            <w:r>
-              <w:rPr>
-                <w:sz w:val="19"/>
-                <w:lang w:val="pt-BR"/>
-              </w:rPr>
-              <w:t xml:space="preserve"> time por sprint)</w:t>
+              <w:t>Evolução ao longo do tempo (ex.: cycle time por sprint)</w:t>
             </w:r>
           </w:p>
         </w:tc>
@@ -2129,55 +2273,7 @@
                 <w:sz w:val="19"/>
                 <w:lang w:val="pt-BR"/>
               </w:rPr>
-              <w:t xml:space="preserve">Composição/fluxo do </w:t>
-            </w:r>
-            <w:proofErr w:type="spellStart"/>
-            <w:r>
-              <w:rPr>
-                <w:sz w:val="19"/>
-                <w:lang w:val="pt-BR"/>
-              </w:rPr>
-              <w:t>Kanban</w:t>
-            </w:r>
-            <w:proofErr w:type="spellEnd"/>
-            <w:r>
-              <w:rPr>
-                <w:sz w:val="19"/>
-                <w:lang w:val="pt-BR"/>
-              </w:rPr>
-              <w:t xml:space="preserve"> ao longo do tempo (</w:t>
-            </w:r>
-            <w:proofErr w:type="spellStart"/>
-            <w:r>
-              <w:rPr>
-                <w:sz w:val="19"/>
-                <w:lang w:val="pt-BR"/>
-              </w:rPr>
-              <w:t>Cumulative</w:t>
-            </w:r>
-            <w:proofErr w:type="spellEnd"/>
-            <w:r>
-              <w:rPr>
-                <w:sz w:val="19"/>
-                <w:lang w:val="pt-BR"/>
-              </w:rPr>
-              <w:t xml:space="preserve"> Flow </w:t>
-            </w:r>
-            <w:proofErr w:type="spellStart"/>
-            <w:r>
-              <w:rPr>
-                <w:sz w:val="19"/>
-                <w:lang w:val="pt-BR"/>
-              </w:rPr>
-              <w:t>Diagram</w:t>
-            </w:r>
-            <w:proofErr w:type="spellEnd"/>
-            <w:r>
-              <w:rPr>
-                <w:sz w:val="19"/>
-                <w:lang w:val="pt-BR"/>
-              </w:rPr>
-              <w:t>)</w:t>
+              <w:t>Composição/fluxo do Kanban ao longo do tempo (Cumulative Flow Diagram)</w:t>
             </w:r>
           </w:p>
         </w:tc>
@@ -2217,23 +2313,7 @@
                 <w:sz w:val="19"/>
                 <w:lang w:val="pt-BR"/>
               </w:rPr>
-              <w:t xml:space="preserve">Proporção de categorias (ex.: % de </w:t>
-            </w:r>
-            <w:proofErr w:type="spellStart"/>
-            <w:r>
-              <w:rPr>
-                <w:sz w:val="19"/>
-                <w:lang w:val="pt-BR"/>
-              </w:rPr>
-              <w:t>issues</w:t>
-            </w:r>
-            <w:proofErr w:type="spellEnd"/>
-            <w:r>
-              <w:rPr>
-                <w:sz w:val="19"/>
-                <w:lang w:val="pt-BR"/>
-              </w:rPr>
-              <w:t xml:space="preserve"> fechadas)</w:t>
+              <w:t>Proporção de categorias (ex.: % de issues fechadas)</w:t>
             </w:r>
           </w:p>
         </w:tc>
@@ -2274,9 +2354,8 @@
       </w:pPr>
       <w:r>
         <w:rPr>
-          <w:i w:val="0"/>
           <w:color w:val="000000"/>
-          <w:sz w:val="22"/>
+          <w:lang w:val="pt-BR"/>
         </w:rPr>
         <w:t>[PENDENTE — Issue #10] Inserir aqui os gráficos (um por RQ + bônus), cada um precedido da pergunta correspondente, com eixos nomeados e medianas/valores-chave explicitados no texto. Responsáveis: Gabriel Tavares (Tavaresds1) e Gabriel Santiago (gabsant07).</w:t>
       </w:r>
@@ -2300,137 +2379,6 @@
         <w:spacing w:after="200"/>
         <w:ind w:left="198"/>
         <w:rPr>
-          <w:i/>
-          <w:color w:val="595959"/>
-          <w:sz w:val="21"/>
-          <w:lang w:val="pt-BR"/>
-        </w:rPr>
-      </w:pPr>
-      <w:r>
-        <w:rPr>
-          <w:b/>
-          <w:i/>
-          <w:color w:val="1F6E63"/>
-          <w:sz w:val="21"/>
-          <w:lang w:val="pt-BR"/>
-        </w:rPr>
-        <w:t xml:space="preserve">ORIENTAÇÃO: </w:t>
-      </w:r>
-      <w:r>
-        <w:rPr>
-          <w:i/>
-          <w:color w:val="595959"/>
-          <w:sz w:val="21"/>
-          <w:lang w:val="pt-BR"/>
-        </w:rPr>
-        <w:t xml:space="preserve">Para cada RQ (do enunciado e das </w:t>
-      </w:r>
-      <w:proofErr w:type="spellStart"/>
-      <w:r>
-        <w:rPr>
-          <w:i/>
-          <w:color w:val="595959"/>
-          <w:sz w:val="21"/>
-          <w:lang w:val="pt-BR"/>
-        </w:rPr>
-        <w:t>RQs</w:t>
-      </w:r>
-      <w:proofErr w:type="spellEnd"/>
-      <w:r>
-        <w:rPr>
-          <w:i/>
-          <w:color w:val="595959"/>
-          <w:sz w:val="21"/>
-          <w:lang w:val="pt-BR"/>
-        </w:rPr>
-        <w:t xml:space="preserve"> de inovação do grupo), compare explicitamente a hipótese informal levantada na Introdução com o resultado efetivamente obtido — hipótese confirmada, refutada, ou parcialmente confirmada, e por quê. Quando houver teste estatístico (ex.: </w:t>
-      </w:r>
-      <w:proofErr w:type="spellStart"/>
-      <w:r>
-        <w:rPr>
-          <w:i/>
-          <w:color w:val="595959"/>
-          <w:sz w:val="21"/>
-          <w:lang w:val="pt-BR"/>
-        </w:rPr>
-        <w:t>Wilcoxon</w:t>
-      </w:r>
-      <w:proofErr w:type="spellEnd"/>
-      <w:r>
-        <w:rPr>
-          <w:i/>
-          <w:color w:val="595959"/>
-          <w:sz w:val="21"/>
-          <w:lang w:val="pt-BR"/>
-        </w:rPr>
-        <w:t xml:space="preserve"> no Lab02), reporte o valor obtido e interprete o que ele significa em linguagem acessível, não apenas o número bruto. Discuta as ameaças à validade específicas do laboratório (ex.: efeito de aprendizado entre </w:t>
-      </w:r>
-      <w:proofErr w:type="spellStart"/>
-      <w:r>
-        <w:rPr>
-          <w:i/>
-          <w:color w:val="595959"/>
-          <w:sz w:val="21"/>
-          <w:lang w:val="pt-BR"/>
-        </w:rPr>
-        <w:t>katas</w:t>
-      </w:r>
-      <w:proofErr w:type="spellEnd"/>
-      <w:r>
-        <w:rPr>
-          <w:i/>
-          <w:color w:val="595959"/>
-          <w:sz w:val="21"/>
-          <w:lang w:val="pt-BR"/>
-        </w:rPr>
-        <w:t xml:space="preserve"> e risco de memorização pela IA — Lab02; diferença de dificuldade entre laboratórios distintos confundindo a tendência de </w:t>
-      </w:r>
-      <w:proofErr w:type="spellStart"/>
-      <w:r>
-        <w:rPr>
-          <w:i/>
-          <w:color w:val="595959"/>
-          <w:sz w:val="21"/>
-          <w:lang w:val="pt-BR"/>
-        </w:rPr>
-        <w:t>cycle</w:t>
-      </w:r>
-      <w:proofErr w:type="spellEnd"/>
-      <w:r>
-        <w:rPr>
-          <w:i/>
-          <w:color w:val="595959"/>
-          <w:sz w:val="21"/>
-          <w:lang w:val="pt-BR"/>
-        </w:rPr>
-        <w:t xml:space="preserve"> time — Lab05; lacunas nos snapshots do </w:t>
-      </w:r>
-      <w:proofErr w:type="spellStart"/>
-      <w:r>
-        <w:rPr>
-          <w:i/>
-          <w:color w:val="595959"/>
-          <w:sz w:val="21"/>
-          <w:lang w:val="pt-BR"/>
-        </w:rPr>
-        <w:t>Kanban</w:t>
-      </w:r>
-      <w:proofErr w:type="spellEnd"/>
-      <w:r>
-        <w:rPr>
-          <w:i/>
-          <w:color w:val="595959"/>
-          <w:sz w:val="21"/>
-          <w:lang w:val="pt-BR"/>
-        </w:rPr>
-        <w:t xml:space="preserve"> — Lab05). Finalize relacionando o que as inovações do grupo (seção 3.6) acrescentaram: elas confirmaram, contradisseram ou aprofundaram o que os 70% do enunciado já mostravam?</w:t>
-      </w:r>
-    </w:p>
-    <w:p>
-      <w:pPr>
-        <w:spacing w:after="200"/>
-        <w:ind w:left="198"/>
-        <w:rPr>
           <w:color w:val="FFFFFF" w:themeColor="background1"/>
           <w:sz w:val="8"/>
           <w:szCs w:val="8"/>
@@ -2501,7 +2449,7 @@
           <w:szCs w:val="8"/>
           <w:lang w:val="pt-BR"/>
         </w:rPr>
-        <w:t xml:space="preserve">em referências </w:t>
+        <w:t>em referências https://www.youtube.com/shorts/YwnaeO95AN8</w:t>
       </w:r>
       <w:r>
         <w:rPr>
@@ -2512,17 +2460,6 @@
           <w:szCs w:val="8"/>
           <w:lang w:val="pt-BR"/>
         </w:rPr>
-        <w:t>https://www.youtube.com/shorts/YwnaeO95AN8</w:t>
-      </w:r>
-      <w:r>
-        <w:rPr>
-          <w:b/>
-          <w:i/>
-          <w:color w:val="FFFFFF" w:themeColor="background1"/>
-          <w:sz w:val="6"/>
-          <w:szCs w:val="8"/>
-          <w:lang w:val="pt-BR"/>
-        </w:rPr>
         <w:t>).</w:t>
       </w:r>
     </w:p>
@@ -2535,28 +2472,94 @@
       </w:pPr>
       <w:r>
         <w:rPr>
-          <w:i w:val="0"/>
           <w:color w:val="000000"/>
-          <w:sz w:val="22"/>
+          <w:lang w:val="pt-BR"/>
         </w:rPr>
         <w:t>Discussão preliminar hipótese × evidência descritiva (medianas). A discussão completa com visualizações e eventuais testes deve ser consolidada após a Issue #10.</w:t>
+      </w:r>
+      <w:r>
+        <w:rPr>
+          <w:color w:val="000000"/>
+          <w:lang w:val="pt-BR"/>
+        </w:rPr>
         <w:br/>
+      </w:r>
+      <w:r>
+        <w:rPr>
+          <w:color w:val="000000"/>
+          <w:lang w:val="pt-BR"/>
+        </w:rPr>
         <w:br/>
         <w:t>RQ01 — Hipótese confirmada preliminarmente: mediana ~7,8 anos indica maturidade elevada.</w:t>
+      </w:r>
+      <w:r>
+        <w:rPr>
+          <w:color w:val="000000"/>
+          <w:lang w:val="pt-BR"/>
+        </w:rPr>
         <w:br/>
         <w:t>RQ02 — Hipótese parcialmente confirmada: mediana 768 PRs merged é alta, mas a média muito superior evidencia assimetria (cauda longa).</w:t>
+      </w:r>
+      <w:r>
+        <w:rPr>
+          <w:color w:val="000000"/>
+          <w:lang w:val="pt-BR"/>
+        </w:rPr>
         <w:br/>
         <w:t>RQ03 — Hipótese parcialmente confirmada: há mediana &gt; 0 (40), porém 28% sem releases — compatível com mistura de software versionado e curadoria.</w:t>
+      </w:r>
+      <w:r>
+        <w:rPr>
+          <w:color w:val="000000"/>
+          <w:lang w:val="pt-BR"/>
+        </w:rPr>
         <w:br/>
         <w:t>RQ04 — Hipótese confirmada preliminarmente: mediana de 6 dias desde o último push indica atualização frequente no topo de popularidade.</w:t>
+      </w:r>
+      <w:r>
+        <w:rPr>
+          <w:color w:val="000000"/>
+          <w:lang w:val="pt-BR"/>
+        </w:rPr>
         <w:br/>
         <w:t>RQ05 — Hipótese parcialmente confirmada: maioria (entre os com linguagem) no TIOBE, mas TypeScript/Markdown/null mostram que popularidade ≠ apenas top TIOBE.</w:t>
+      </w:r>
+      <w:r>
+        <w:rPr>
+          <w:color w:val="000000"/>
+          <w:lang w:val="pt-BR"/>
+        </w:rPr>
         <w:br/>
         <w:t>RQ06 — Hipótese confirmada preliminarmente: mediana 87,5% de issues fechadas.</w:t>
+      </w:r>
+      <w:r>
+        <w:rPr>
+          <w:color w:val="000000"/>
+          <w:lang w:val="pt-BR"/>
+        </w:rPr>
         <w:br/>
         <w:t>RQ07 — Aguardando cruzamentos por linguagem da Issue #10 para confirmar/refutar a hipótese mista.</w:t>
+      </w:r>
+      <w:r>
+        <w:rPr>
+          <w:color w:val="000000"/>
+          <w:lang w:val="pt-BR"/>
+        </w:rPr>
         <w:br/>
+      </w:r>
+      <w:r>
+        <w:rPr>
+          <w:color w:val="000000"/>
+          <w:lang w:val="pt-BR"/>
+        </w:rPr>
         <w:br/>
+      </w:r>
+      <w:r>
+        <w:rPr>
+          <w:color w:val="000000"/>
+          <w:lang w:val="pt-BR"/>
+        </w:rPr>
+        <w:lastRenderedPageBreak/>
         <w:t>Ameaça à validade: Search API ordena por estrelas e pode omitir/alterar ranking ao longo do tempo; primaryLanguage nulo e repos sem issues afetam RQ05/RQ06; PRs merged medem contribuição aceita, não necessariamente “externa” no sentido estrito (contribuições de maintainers também entram).</w:t>
       </w:r>
     </w:p>
@@ -2571,56 +2574,7 @@
         <w:rPr>
           <w:lang w:val="pt-BR"/>
         </w:rPr>
-        <w:lastRenderedPageBreak/>
         <w:t>5. Conclusão</w:t>
-      </w:r>
-    </w:p>
-    <w:p>
-      <w:pPr>
-        <w:spacing w:after="200"/>
-        <w:ind w:left="198"/>
-        <w:rPr>
-          <w:lang w:val="pt-BR"/>
-        </w:rPr>
-      </w:pPr>
-      <w:r>
-        <w:rPr>
-          <w:b/>
-          <w:i/>
-          <w:color w:val="1F6E63"/>
-          <w:sz w:val="21"/>
-          <w:lang w:val="pt-BR"/>
-        </w:rPr>
-        <w:t xml:space="preserve">ORIENTAÇÃO: </w:t>
-      </w:r>
-      <w:r>
-        <w:rPr>
-          <w:i/>
-          <w:color w:val="595959"/>
-          <w:sz w:val="21"/>
-          <w:lang w:val="pt-BR"/>
-        </w:rPr>
-        <w:t xml:space="preserve">Sintetize, em poucos parágrafos, as respostas a todas as </w:t>
-      </w:r>
-      <w:proofErr w:type="spellStart"/>
-      <w:r>
-        <w:rPr>
-          <w:i/>
-          <w:color w:val="595959"/>
-          <w:sz w:val="21"/>
-          <w:lang w:val="pt-BR"/>
-        </w:rPr>
-        <w:t>RQs</w:t>
-      </w:r>
-      <w:proofErr w:type="spellEnd"/>
-      <w:r>
-        <w:rPr>
-          <w:i/>
-          <w:color w:val="595959"/>
-          <w:sz w:val="21"/>
-          <w:lang w:val="pt-BR"/>
-        </w:rPr>
-        <w:t xml:space="preserve"> (enunciado + inovação do grupo), sem repetir números já discutidos em detalhe — o objetivo aqui é a mensagem final, não os dados brutos. Aponte as principais limitações do estudo (tamanho de amostra, ameaças à validade não mitigadas, período de coleta). Quando o enunciado pedir explicitamente uma postura de consultoria (caso do Lab05, que pede recomendações de melhoria de processo “como se o grupo fosse consultoria para um time real”), inclua recomendações objetivas e acionáveis, não genéricas. Encerre indicando o que o grupo faria diferente com mais tempo ou recursos, e quais das inovações propostas (30%) valeriam a pena expandir em um trabalho futuro.</w:t>
       </w:r>
     </w:p>
     <w:p>
@@ -2635,18 +2589,53 @@
       </w:pPr>
       <w:r>
         <w:rPr>
-          <w:i w:val="0"/>
           <w:color w:val="000000"/>
-          <w:sz w:val="22"/>
+          <w:lang w:val="pt-BR"/>
         </w:rPr>
         <w:t>O Lab01 permitiu caracterizar, de forma exploratória, o perfil dos 1.000 repositórios mais estrelados do GitHub e institucionalizar o Kanban do grupo (colunas Backlog→Done, WIP=2, Issues com Assignee e commits referenciando #N).</w:t>
+      </w:r>
+      <w:r>
+        <w:rPr>
+          <w:color w:val="000000"/>
+          <w:lang w:val="pt-BR"/>
+        </w:rPr>
         <w:br/>
+      </w:r>
+      <w:r>
+        <w:rPr>
+          <w:color w:val="000000"/>
+          <w:lang w:val="pt-BR"/>
+        </w:rPr>
         <w:br/>
         <w:t>Em síntese descritiva: os sistemas populares tendem a ser maduros e atualizados com frequência, com razão alta de issues fechadas e contribuição via PRs assimétrica; a relação com linguagens TIOBE é parcial; releases variam bastante.</w:t>
+      </w:r>
+      <w:r>
+        <w:rPr>
+          <w:color w:val="000000"/>
+          <w:lang w:val="pt-BR"/>
+        </w:rPr>
         <w:br/>
+      </w:r>
+      <w:r>
+        <w:rPr>
+          <w:color w:val="000000"/>
+          <w:lang w:val="pt-BR"/>
+        </w:rPr>
         <w:br/>
         <w:t>Limitações: dependência da Search API; métricas proxy (ex.: PRs merged ≠ contribuição externa pura); visualizações finais e aprofundamento estatístico pendentes da Issue #10; print do board deve ser anexado neste documento.</w:t>
+      </w:r>
+      <w:r>
+        <w:rPr>
+          <w:color w:val="000000"/>
+          <w:lang w:val="pt-BR"/>
+        </w:rPr>
         <w:br/>
+      </w:r>
+      <w:r>
+        <w:rPr>
+          <w:color w:val="000000"/>
+          <w:lang w:val="pt-BR"/>
+        </w:rPr>
         <w:br/>
         <w:t>Com mais tempo, o grupo expandiria a RQ07 com testes por linguagem e automatizaria snapshots a cada fechamento de sprint no CI.</w:t>
       </w:r>
@@ -2716,8 +2705,61 @@
       </w:pPr>
     </w:p>
     <w:p>
-      <w:r>
-        <w:t>Grupo Lab01 — repositório e board: https://github.com/Druitti/Laboratorio-de-Desenvolvimento-de-Software ; https://github.com/users/Druitti/projects/5</w:t>
+      <w:pPr>
+        <w:rPr>
+          <w:lang w:val="pt-BR"/>
+        </w:rPr>
+      </w:pPr>
+      <w:r>
+        <w:rPr>
+          <w:lang w:val="pt-BR"/>
+        </w:rPr>
+        <w:t xml:space="preserve">Grupo Lab01 — repositório e board: </w:t>
+      </w:r>
+      <w:proofErr w:type="gramStart"/>
+      <w:r>
+        <w:rPr>
+          <w:lang w:val="pt-BR"/>
+        </w:rPr>
+        <w:t>https://github.com/Druitti/Laboratorio-de-Desenvolvimento-de-Software ;</w:t>
+      </w:r>
+      <w:proofErr w:type="gramEnd"/>
+      <w:r>
+        <w:rPr>
+          <w:lang w:val="pt-BR"/>
+        </w:rPr>
+        <w:t xml:space="preserve"> https://github.com/users/Druitti/projects/5</w:t>
+      </w:r>
+    </w:p>
+    <w:p>
+      <w:pPr>
+        <w:pStyle w:val="PargrafodaLista"/>
+        <w:rPr>
+          <w:lang w:val="pt-BR"/>
+        </w:rPr>
+      </w:pPr>
+      <w:r>
+        <w:t xml:space="preserve">TIOBE Software BV. TIOBE Index. </w:t>
+      </w:r>
+      <w:r>
+        <w:rPr>
+          <w:lang w:val="pt-BR"/>
+        </w:rPr>
+        <w:t>Disponível em: https://www.tiobe.com/tiobe-index/. Acesso em: 25 ago. 2026.</w:t>
+      </w:r>
+    </w:p>
+    <w:p>
+      <w:pPr>
+        <w:pStyle w:val="PargrafodaLista"/>
+        <w:rPr>
+          <w:lang w:val="pt-BR"/>
+        </w:rPr>
+      </w:pPr>
+      <w:r>
+        <w:rPr>
+          <w:lang w:val="pt-BR"/>
+        </w:rPr>
+        <w:t>GitHub. GraphQL API documentation. Disponível em: https://docs.github.com/en/graphql. Acesso em: 25 ago. 2026.</w:t>
       </w:r>
     </w:p>
     <w:p>
@@ -2725,23 +2767,13 @@
         <w:pStyle w:val="PargrafodaLista"/>
       </w:pPr>
       <w:r>
-        <w:t>TIOBE Software BV. TIOBE Index. Disponível em: https://www.tiobe.com/tiobe-index/. Acesso em: 25 ago. 2026.</w:t>
-      </w:r>
-    </w:p>
-    <w:p>
-      <w:pPr>
-        <w:pStyle w:val="PargrafodaLista"/>
-      </w:pPr>
-      <w:r>
-        <w:t>GitHub. GraphQL API documentation. Disponível em: https://docs.github.com/en/graphql. Acesso em: 25 ago. 2026.</w:t>
-      </w:r>
-    </w:p>
-    <w:p>
-      <w:pPr>
-        <w:pStyle w:val="PargrafodaLista"/>
-      </w:pPr>
-      <w:r>
-        <w:t>BASILI, Victor R.; CALDIERA, Gianluigi; ROMBACH, H. Dieter. The Goal Question Metric Approach. 1994.</w:t>
+        <w:rPr>
+          <w:lang w:val="pt-BR"/>
+        </w:rPr>
+        <w:t xml:space="preserve">BASILI, Victor R.; CALDIERA, Gianluigi; ROMBACH, H. Dieter. </w:t>
+      </w:r>
+      <w:r>
+        <w:t>The Goal Question Metric Approach. 1994.</w:t>
       </w:r>
     </w:p>
     <w:sectPr>
@@ -2755,7 +2787,7 @@
 </file>
 
 <file path=word/numbering.xml><?xml version="1.0" encoding="utf-8"?>
-<w:numbering xmlns:wpc="http://schemas.microsoft.com/office/word/2010/wordprocessingCanvas" xmlns:cx="http://schemas.microsoft.com/office/drawing/2014/chartex" xmlns:cx1="http://schemas.microsoft.com/office/drawing/2015/9/8/chartex" xmlns:cx2="http://schemas.microsoft.com/office/drawing/2015/10/21/chartex" xmlns:cx3="http://schemas.microsoft.com/office/drawing/2016/5/9/chartex" xmlns:cx4="http://schemas.microsoft.com/office/drawing/2016/5/10/chartex" xmlns:cx5="http://schemas.microsoft.com/office/drawing/2016/5/11/chartex" xmlns:cx6="http://schemas.microsoft.com/office/drawing/2016/5/12/chartex" xmlns:cx7="http://schemas.microsoft.com/office/drawing/2016/5/13/chartex" xmlns:cx8="http://schemas.microsoft.com/office/drawing/2016/5/14/chartex" xmlns:mc="http://schemas.openxmlformats.org/markup-compatibility/2006" xmlns:m="http://schemas.openxmlformats.org/officeDocument/2006/math" xmlns:aink="http://schemas.microsoft.com/office/drawing/2016/ink" xmlns:am3d="http://schemas.microsoft.com/office/drawing/2017/model3d" xmlns:oel="http://schemas.microsoft.com/office/2019/extlst" xmlns:r="http://schemas.openxmlformats.org/officeDocument/2006/relationships" xmlns:wp14="http://schemas.microsoft.com/office/word/2010/wordprocessingDrawing" xmlns:wp="http://schemas.openxmlformats.org/drawingml/2006/wordprocessingDrawing" xmlns:wpg="http://schemas.microsoft.com/office/word/2010/wordprocessingGroup" xmlns:wpi="http://schemas.microsoft.com/office/word/2010/wordprocessingInk" xmlns:wps="http://schemas.microsoft.com/office/word/2010/wordprocessingShape" xmlns:o="urn:schemas-microsoft-com:office:office" xmlns:v="urn:schemas-microsoft-com:vml" xmlns:w10="urn:schemas-microsoft-com:office:word" xmlns:w="http://schemas.openxmlformats.org/wordprocessingml/2006/main" xmlns:w14="http://schemas.microsoft.com/office/word/2010/wordml" xmlns:w15="http://schemas.microsoft.com/office/word/2012/wordml" xmlns:w16cei="http://schemas.microsoft.com/office/word/2026/wordml/cei" xmlns:w16cex="http://schemas.microsoft.com/office/word/2018/wordml/cex" xmlns:w16cid="http://schemas.microsoft.com/office/word/2016/wordml/cid" xmlns:w16="http://schemas.microsoft.com/office/word/2018/wordml" xmlns:w16sdtdh="http://schemas.microsoft.com/office/word/2020/wordml/sdtdatahash" xmlns:w16sdtfl="http://schemas.microsoft.com/office/word/2024/wordml/sdtformatlock" xmlns:w16se="http://schemas.microsoft.com/office/word/2015/wordml/symex" xmlns:w16du="http://schemas.microsoft.com/office/word/2023/wordml/word16du" xmlns:wne="http://schemas.microsoft.com/office/word/2006/wordml" mc:Ignorable="w14 w15 w16se w16cid w16 w16cex w16sdtdh w16sdtfl w16du wp14">
+<w:numbering xmlns:wpc="http://schemas.microsoft.com/office/word/2010/wordprocessingCanvas" xmlns:cx="http://schemas.microsoft.com/office/drawing/2014/chartex" xmlns:cx1="http://schemas.microsoft.com/office/drawing/2015/9/8/chartex" xmlns:cx2="http://schemas.microsoft.com/office/drawing/2015/10/21/chartex" xmlns:cx3="http://schemas.microsoft.com/office/drawing/2016/5/9/chartex" xmlns:cx4="http://schemas.microsoft.com/office/drawing/2016/5/10/chartex" xmlns:cx5="http://schemas.microsoft.com/office/drawing/2016/5/11/chartex" xmlns:cx6="http://schemas.microsoft.com/office/drawing/2016/5/12/chartex" xmlns:cx7="http://schemas.microsoft.com/office/drawing/2016/5/13/chartex" xmlns:cx8="http://schemas.microsoft.com/office/drawing/2016/5/14/chartex" xmlns:mc="http://schemas.openxmlformats.org/markup-compatibility/2006" xmlns:aink="http://schemas.microsoft.com/office/drawing/2016/ink" xmlns:am3d="http://schemas.microsoft.com/office/drawing/2017/model3d" xmlns:o="urn:schemas-microsoft-com:office:office" xmlns:oel="http://schemas.microsoft.com/office/2019/extlst" xmlns:r="http://schemas.openxmlformats.org/officeDocument/2006/relationships" xmlns:m="http://schemas.openxmlformats.org/officeDocument/2006/math" xmlns:v="urn:schemas-microsoft-com:vml" xmlns:wp14="http://schemas.microsoft.com/office/word/2010/wordprocessingDrawing" xmlns:wp="http://schemas.openxmlformats.org/drawingml/2006/wordprocessingDrawing" xmlns:w10="urn:schemas-microsoft-com:office:word" xmlns:w="http://schemas.openxmlformats.org/wordprocessingml/2006/main" xmlns:w14="http://schemas.microsoft.com/office/word/2010/wordml" xmlns:w15="http://schemas.microsoft.com/office/word/2012/wordml" xmlns:w16cex="http://schemas.microsoft.com/office/word/2018/wordml/cex" xmlns:w16cid="http://schemas.microsoft.com/office/word/2016/wordml/cid" xmlns:w16="http://schemas.microsoft.com/office/word/2018/wordml" xmlns:w16sdtdh="http://schemas.microsoft.com/office/word/2020/wordml/sdtdatahash" xmlns:w16se="http://schemas.microsoft.com/office/word/2015/wordml/symex" xmlns:wpg="http://schemas.microsoft.com/office/word/2010/wordprocessingGroup" xmlns:wpi="http://schemas.microsoft.com/office/word/2010/wordprocessingInk" xmlns:wne="http://schemas.microsoft.com/office/word/2006/wordml" xmlns:wps="http://schemas.microsoft.com/office/word/2010/wordprocessingShape" mc:Ignorable="w14 w15 w16se w16cid w16 w16cex w16sdtdh wp14">
   <w:abstractNum w:abstractNumId="0" w15:restartNumberingAfterBreak="0">
     <w:nsid w:val="FFFFFF7C"/>
     <w:multiLevelType w:val="singleLevel"/>
@@ -3074,7 +3106,7 @@
 </file>
 
 <file path=word/styles.xml><?xml version="1.0" encoding="utf-8"?>
-<w:styles xmlns:mc="http://schemas.openxmlformats.org/markup-compatibility/2006" xmlns:r="http://schemas.openxmlformats.org/officeDocument/2006/relationships" xmlns:w="http://schemas.openxmlformats.org/wordprocessingml/2006/main" xmlns:w14="http://schemas.microsoft.com/office/word/2010/wordml" xmlns:w15="http://schemas.microsoft.com/office/word/2012/wordml" xmlns:w16cex="http://schemas.microsoft.com/office/word/2018/wordml/cex" xmlns:w16cid="http://schemas.microsoft.com/office/word/2016/wordml/cid" xmlns:w16="http://schemas.microsoft.com/office/word/2018/wordml" xmlns:w16sdtdh="http://schemas.microsoft.com/office/word/2020/wordml/sdtdatahash" xmlns:w16sdtfl="http://schemas.microsoft.com/office/word/2024/wordml/sdtformatlock" xmlns:w16se="http://schemas.microsoft.com/office/word/2015/wordml/symex" xmlns:w16du="http://schemas.microsoft.com/office/word/2023/wordml/word16du" mc:Ignorable="w14 w15 w16se w16cid w16 w16cex w16sdtdh w16sdtfl w16du">
+<w:styles xmlns:mc="http://schemas.openxmlformats.org/markup-compatibility/2006" xmlns:r="http://schemas.openxmlformats.org/officeDocument/2006/relationships" xmlns:w="http://schemas.openxmlformats.org/wordprocessingml/2006/main" xmlns:w14="http://schemas.microsoft.com/office/word/2010/wordml" xmlns:w15="http://schemas.microsoft.com/office/word/2012/wordml" xmlns:w16cex="http://schemas.microsoft.com/office/word/2018/wordml/cex" xmlns:w16cid="http://schemas.microsoft.com/office/word/2016/wordml/cid" xmlns:w16="http://schemas.microsoft.com/office/word/2018/wordml" xmlns:w16sdtdh="http://schemas.microsoft.com/office/word/2020/wordml/sdtdatahash" xmlns:w16se="http://schemas.microsoft.com/office/word/2015/wordml/symex" mc:Ignorable="w14 w15 w16se w16cid w16 w16cex w16sdtdh">
   <w:docDefaults>
     <w:rPrDefault>
       <w:rPr>

</xml_diff>

<commit_message>
Análise/visualização RQs + bônus Fixes #10
</commit_message>
<xml_diff>
--- a/relatorio/Lab01_Relatorio_Final.docx
+++ b/relatorio/Lab01_Relatorio_Final.docx
@@ -1,6 +1,6 @@
 
 <file path=word/document.xml><?xml version="1.0" encoding="utf-8"?>
-<w:document xmlns:wpc="http://schemas.microsoft.com/office/word/2010/wordprocessingCanvas" xmlns:cx="http://schemas.microsoft.com/office/drawing/2014/chartex" xmlns:cx1="http://schemas.microsoft.com/office/drawing/2015/9/8/chartex" xmlns:cx2="http://schemas.microsoft.com/office/drawing/2015/10/21/chartex" xmlns:cx3="http://schemas.microsoft.com/office/drawing/2016/5/9/chartex" xmlns:cx4="http://schemas.microsoft.com/office/drawing/2016/5/10/chartex" xmlns:cx5="http://schemas.microsoft.com/office/drawing/2016/5/11/chartex" xmlns:cx6="http://schemas.microsoft.com/office/drawing/2016/5/12/chartex" xmlns:cx7="http://schemas.microsoft.com/office/drawing/2016/5/13/chartex" xmlns:cx8="http://schemas.microsoft.com/office/drawing/2016/5/14/chartex" xmlns:mc="http://schemas.openxmlformats.org/markup-compatibility/2006" xmlns:aink="http://schemas.microsoft.com/office/drawing/2016/ink" xmlns:am3d="http://schemas.microsoft.com/office/drawing/2017/model3d" xmlns:o="urn:schemas-microsoft-com:office:office" xmlns:oel="http://schemas.microsoft.com/office/2019/extlst" xmlns:r="http://schemas.openxmlformats.org/officeDocument/2006/relationships" xmlns:m="http://schemas.openxmlformats.org/officeDocument/2006/math" xmlns:v="urn:schemas-microsoft-com:vml" xmlns:wp14="http://schemas.microsoft.com/office/word/2010/wordprocessingDrawing" xmlns:wp="http://schemas.openxmlformats.org/drawingml/2006/wordprocessingDrawing" xmlns:w10="urn:schemas-microsoft-com:office:word" xmlns:w="http://schemas.openxmlformats.org/wordprocessingml/2006/main" xmlns:w14="http://schemas.microsoft.com/office/word/2010/wordml" xmlns:w15="http://schemas.microsoft.com/office/word/2012/wordml" xmlns:w16cex="http://schemas.microsoft.com/office/word/2018/wordml/cex" xmlns:w16cid="http://schemas.microsoft.com/office/word/2016/wordml/cid" xmlns:w16="http://schemas.microsoft.com/office/word/2018/wordml" xmlns:w16sdtdh="http://schemas.microsoft.com/office/word/2020/wordml/sdtdatahash" xmlns:w16se="http://schemas.microsoft.com/office/word/2015/wordml/symex" xmlns:wpg="http://schemas.microsoft.com/office/word/2010/wordprocessingGroup" xmlns:wpi="http://schemas.microsoft.com/office/word/2010/wordprocessingInk" xmlns:wne="http://schemas.microsoft.com/office/word/2006/wordml" xmlns:wps="http://schemas.microsoft.com/office/word/2010/wordprocessingShape" mc:Ignorable="w14 w15 w16se w16cid w16 w16cex w16sdtdh wp14">
+<w:document xmlns:wpc="http://schemas.microsoft.com/office/word/2010/wordprocessingCanvas" xmlns:cx="http://schemas.microsoft.com/office/drawing/2014/chartex" xmlns:cx1="http://schemas.microsoft.com/office/drawing/2015/9/8/chartex" xmlns:cx2="http://schemas.microsoft.com/office/drawing/2015/10/21/chartex" xmlns:cx3="http://schemas.microsoft.com/office/drawing/2016/5/9/chartex" xmlns:cx4="http://schemas.microsoft.com/office/drawing/2016/5/10/chartex" xmlns:cx5="http://schemas.microsoft.com/office/drawing/2016/5/11/chartex" xmlns:cx6="http://schemas.microsoft.com/office/drawing/2016/5/12/chartex" xmlns:cx7="http://schemas.microsoft.com/office/drawing/2016/5/13/chartex" xmlns:cx8="http://schemas.microsoft.com/office/drawing/2016/5/14/chartex" xmlns:mc="http://schemas.openxmlformats.org/markup-compatibility/2006" xmlns:m="http://schemas.openxmlformats.org/officeDocument/2006/math" xmlns:aink="http://schemas.microsoft.com/office/drawing/2016/ink" xmlns:am3d="http://schemas.microsoft.com/office/drawing/2017/model3d" xmlns:oel="http://schemas.microsoft.com/office/2019/extlst" xmlns:r="http://schemas.openxmlformats.org/officeDocument/2006/relationships" xmlns:wp14="http://schemas.microsoft.com/office/word/2010/wordprocessingDrawing" xmlns:wp="http://schemas.openxmlformats.org/drawingml/2006/wordprocessingDrawing" xmlns:wpg="http://schemas.microsoft.com/office/word/2010/wordprocessingGroup" xmlns:wpi="http://schemas.microsoft.com/office/word/2010/wordprocessingInk" xmlns:wps="http://schemas.microsoft.com/office/word/2010/wordprocessingShape" xmlns:o="urn:schemas-microsoft-com:office:office" xmlns:v="urn:schemas-microsoft-com:vml" xmlns:w10="urn:schemas-microsoft-com:office:word" xmlns:w="http://schemas.openxmlformats.org/wordprocessingml/2006/main" xmlns:w14="http://schemas.microsoft.com/office/word/2010/wordml" xmlns:w15="http://schemas.microsoft.com/office/word/2012/wordml" xmlns:w16cei="http://schemas.microsoft.com/office/word/2026/wordml/cei" xmlns:w16cex="http://schemas.microsoft.com/office/word/2018/wordml/cex" xmlns:w16cid="http://schemas.microsoft.com/office/word/2016/wordml/cid" xmlns:w16="http://schemas.microsoft.com/office/word/2018/wordml" xmlns:w16sdtdh="http://schemas.microsoft.com/office/word/2020/wordml/sdtdatahash" xmlns:w16sdtfl="http://schemas.microsoft.com/office/word/2024/wordml/sdtformatlock" xmlns:w16se="http://schemas.microsoft.com/office/word/2015/wordml/symex" xmlns:w16du="http://schemas.microsoft.com/office/word/2023/wordml/word16du" xmlns:wne="http://schemas.microsoft.com/office/word/2006/wordml" mc:Ignorable="w14 w15 w16se w16cid w16 w16cex w16sdtdh w16sdtfl w16du wp14">
   <w:body>
     <w:p>
       <w:pPr>
@@ -32,7 +32,27 @@
           <w:sz w:val="24"/>
           <w:lang w:val="pt-BR"/>
         </w:rPr>
-        <w:t>Laboratório de Experimentação de Software — Modelo/Template de Relatório</w:t>
+        <w:t>Laboratório de Experimentação de Software — Modelo/</w:t>
+      </w:r>
+      <w:proofErr w:type="spellStart"/>
+      <w:r>
+        <w:rPr>
+          <w:i/>
+          <w:color w:val="1F6E63"/>
+          <w:sz w:val="24"/>
+          <w:lang w:val="pt-BR"/>
+        </w:rPr>
+        <w:t>Template</w:t>
+      </w:r>
+      <w:proofErr w:type="spellEnd"/>
+      <w:r>
+        <w:rPr>
+          <w:i/>
+          <w:color w:val="1F6E63"/>
+          <w:sz w:val="24"/>
+          <w:lang w:val="pt-BR"/>
+        </w:rPr>
+        <w:t xml:space="preserve"> de Relatório</w:t>
       </w:r>
     </w:p>
     <w:p>
@@ -44,10 +64,11 @@
       </w:pPr>
       <w:r>
         <w:rPr>
+          <w:i w:val="0"/>
           <w:color w:val="000000"/>
-          <w:lang w:val="pt-BR"/>
+          <w:sz w:val="22"/>
         </w:rPr>
-        <w:t>Relatório Final do Laboratório 01 da disciplina Laboratório de Experimentação de Software (PUC Minas). Este documento descreve a mineração dos 1.000 repositórios mais estrelados do GitHub, as hipóteses informais do grupo, a metodologia de coleta via GraphQL e a configuração do processo Kanban no GitHub Projects. A seção de visualização gráfica detalhada (Issue #10) é de responsabilidade dos demais integrantes e deve ser anexada/integrada quando concluída.</w:t>
+        <w:t>Relatório Final do Laboratório 01 da disciplina Laboratório de Experimentação de Software (PUC Minas). Este documento descreve a mineração dos 1.000 repositórios mais estrelados do GitHub, as hipóteses informais do grupo, a metodologia de coleta via GraphQL, a análise e visualização gráfica das sete RQs (incluindo o bônus RQ07) e a configuração do processo Kanban no GitHub Projects.</w:t>
       </w:r>
     </w:p>
     <w:p>
@@ -79,12 +100,14 @@
             <w:shd w:val="clear" w:color="auto" w:fill="F0F0EC"/>
           </w:tcPr>
           <w:p>
+            <w:proofErr w:type="spellStart"/>
             <w:r>
               <w:rPr>
                 <w:b/>
               </w:rPr>
               <w:t>Curso</w:t>
             </w:r>
+            <w:proofErr w:type="spellEnd"/>
           </w:p>
         </w:tc>
         <w:tc>
@@ -145,12 +168,28 @@
             <w:shd w:val="clear" w:color="auto" w:fill="F0F0EC"/>
           </w:tcPr>
           <w:p>
+            <w:proofErr w:type="spellStart"/>
             <w:r>
               <w:rPr>
                 <w:b/>
               </w:rPr>
-              <w:t>Turno / Período</w:t>
+              <w:t>Turno</w:t>
             </w:r>
+            <w:proofErr w:type="spellEnd"/>
+            <w:r>
+              <w:rPr>
+                <w:b/>
+              </w:rPr>
+              <w:t xml:space="preserve"> / </w:t>
+            </w:r>
+            <w:proofErr w:type="spellStart"/>
+            <w:r>
+              <w:rPr>
+                <w:b/>
+              </w:rPr>
+              <w:t>Período</w:t>
+            </w:r>
+            <w:proofErr w:type="spellEnd"/>
           </w:p>
         </w:tc>
         <w:tc>
@@ -222,9 +261,6 @@
               </w:rPr>
             </w:pPr>
             <w:r>
-              <w:rPr>
-                <w:lang w:val="pt-BR"/>
-              </w:rPr>
               <w:t>Lab01 — Características de repositórios populares + Setup do Kanban</w:t>
             </w:r>
           </w:p>
@@ -253,15 +289,7 @@
             <w:tcW w:w="5953" w:type="dxa"/>
           </w:tcPr>
           <w:p>
-            <w:pPr>
-              <w:rPr>
-                <w:lang w:val="pt-BR"/>
-              </w:rPr>
-            </w:pPr>
             <w:r>
-              <w:rPr>
-                <w:lang w:val="pt-BR"/>
-              </w:rPr>
               <w:t>Gabriel Ferreira Amaral (Druitti) · Gabriel Santiago (gabsant07) · Gabriel Tavares (Tavaresds1)</w:t>
             </w:r>
           </w:p>
@@ -287,8 +315,17 @@
                 <w:b/>
                 <w:lang w:val="pt-BR"/>
               </w:rPr>
-              <w:t>Link do repositório / GitHub Projects</w:t>
+              <w:t xml:space="preserve">Link do repositório / GitHub </w:t>
             </w:r>
+            <w:proofErr w:type="spellStart"/>
+            <w:r>
+              <w:rPr>
+                <w:b/>
+                <w:lang w:val="pt-BR"/>
+              </w:rPr>
+              <w:t>Projects</w:t>
+            </w:r>
+            <w:proofErr w:type="spellEnd"/>
           </w:p>
         </w:tc>
         <w:tc>
@@ -321,8 +358,16 @@
               <w:rPr>
                 <w:b/>
               </w:rPr>
-              <w:t>Data de entrega</w:t>
+              <w:t xml:space="preserve">Data de </w:t>
             </w:r>
+            <w:proofErr w:type="spellStart"/>
+            <w:r>
+              <w:rPr>
+                <w:b/>
+              </w:rPr>
+              <w:t>entrega</w:t>
+            </w:r>
+            <w:proofErr w:type="spellEnd"/>
           </w:p>
         </w:tc>
         <w:tc>
@@ -359,6 +404,12 @@
           <w:lang w:val="pt-BR"/>
         </w:rPr>
       </w:pPr>
+      <w:proofErr w:type="spellStart"/>
+      <w:proofErr w:type="spellEnd"/>
+      <w:proofErr w:type="spellStart"/>
+      <w:proofErr w:type="spellEnd"/>
+      <w:proofErr w:type="spellStart"/>
+      <w:proofErr w:type="spellEnd"/>
     </w:p>
     <w:p>
       <w:pPr>
@@ -427,7 +478,21 @@
         <w:rPr>
           <w:lang w:val="pt-BR"/>
         </w:rPr>
-        <w:t>Quais RQs, métricas ou variáveis o grupo está propondo além do enunciado (resumo de 1 linha cada — os 30% de inovação)?</w:t>
+        <w:t xml:space="preserve">Quais </w:t>
+      </w:r>
+      <w:proofErr w:type="spellStart"/>
+      <w:r>
+        <w:rPr>
+          <w:lang w:val="pt-BR"/>
+        </w:rPr>
+        <w:t>RQs</w:t>
+      </w:r>
+      <w:proofErr w:type="spellEnd"/>
+      <w:r>
+        <w:rPr>
+          <w:lang w:val="pt-BR"/>
+        </w:rPr>
+        <w:t>, métricas ou variáveis o grupo está propondo além do enunciado (resumo de 1 linha cada — os 30% de inovação)?</w:t>
       </w:r>
     </w:p>
     <w:p>
@@ -439,165 +504,46 @@
       </w:pPr>
       <w:r>
         <w:rPr>
+          <w:i w:val="0"/>
           <w:color w:val="000000"/>
-          <w:lang w:val="pt-BR"/>
+          <w:sz w:val="22"/>
         </w:rPr>
         <w:t>Repositórios open-source populares concentram boa parte da atenção da indústria e da academia, mas nem sempre há evidência sistemática sobre o perfil desses sistemas (idade, contribuição externa, releases, atualização, linguagem e gestão de issues). Este laboratório investiga essas características nos 1.000 repositórios com maior número de estrelas no GitHub e, em paralelo, institui o quadro Kanban (GitHub Projects v2) que acompanhará o grupo no semestre.</w:t>
-      </w:r>
-      <w:r>
-        <w:rPr>
-          <w:color w:val="000000"/>
-          <w:lang w:val="pt-BR"/>
-        </w:rPr>
         <w:br/>
-      </w:r>
-      <w:r>
-        <w:rPr>
-          <w:color w:val="000000"/>
-          <w:lang w:val="pt-BR"/>
-        </w:rPr>
         <w:br/>
         <w:t>Questões de Pesquisa do enunciado:</w:t>
-      </w:r>
-      <w:r>
-        <w:rPr>
-          <w:color w:val="000000"/>
-          <w:lang w:val="pt-BR"/>
-        </w:rPr>
         <w:br/>
         <w:t>RQ01. Sistemas populares são maduros/antigos? (idade a partir de createdAt)</w:t>
-      </w:r>
-      <w:r>
-        <w:rPr>
-          <w:color w:val="000000"/>
-          <w:lang w:val="pt-BR"/>
-        </w:rPr>
         <w:br/>
         <w:t>RQ02. Sistemas populares recebem muita contribuição externa? (PRs merged)</w:t>
-      </w:r>
-      <w:r>
-        <w:rPr>
-          <w:color w:val="000000"/>
-          <w:lang w:val="pt-BR"/>
-        </w:rPr>
         <w:br/>
         <w:t>RQ03. Sistemas populares lançam releases com frequência? (total de releases)</w:t>
-      </w:r>
-      <w:r>
-        <w:rPr>
-          <w:color w:val="000000"/>
-          <w:lang w:val="pt-BR"/>
-        </w:rPr>
         <w:br/>
         <w:t>RQ04. Sistemas populares são atualizados com frequência? (tempo desde pushedAt)</w:t>
-      </w:r>
-      <w:r>
-        <w:rPr>
-          <w:color w:val="000000"/>
-          <w:lang w:val="pt-BR"/>
-        </w:rPr>
         <w:br/>
         <w:t>RQ05. Sistemas populares são escritos nas linguagens mais populares? (primaryLanguage vs TIOBE Index)</w:t>
-      </w:r>
-      <w:r>
-        <w:rPr>
-          <w:color w:val="000000"/>
-          <w:lang w:val="pt-BR"/>
-        </w:rPr>
         <w:br/>
         <w:t>RQ06. Sistemas populares possuem alto percentual de issues fechadas? (closed/total)</w:t>
-      </w:r>
-      <w:r>
-        <w:rPr>
-          <w:color w:val="000000"/>
-          <w:lang w:val="pt-BR"/>
-        </w:rPr>
         <w:br/>
         <w:t>RQ07 (bônus). Linguagens TIOBE associam-se a mais PRs, releases e atualizações mais recentes?</w:t>
-      </w:r>
-      <w:r>
-        <w:rPr>
-          <w:color w:val="000000"/>
-          <w:lang w:val="pt-BR"/>
-        </w:rPr>
         <w:br/>
-      </w:r>
-      <w:r>
-        <w:rPr>
-          <w:color w:val="000000"/>
-          <w:lang w:val="pt-BR"/>
-        </w:rPr>
         <w:br/>
         <w:t>Hipóteses informais (antes da análise completa — Issue #9):</w:t>
-      </w:r>
-      <w:r>
-        <w:rPr>
-          <w:color w:val="000000"/>
-          <w:lang w:val="pt-BR"/>
-        </w:rPr>
         <w:br/>
         <w:t>RQ01 — Sim: mediana de idade elevada (vários anos), pois popularidade acumula-se no tempo.</w:t>
-      </w:r>
-      <w:r>
-        <w:rPr>
-          <w:color w:val="000000"/>
-          <w:lang w:val="pt-BR"/>
-        </w:rPr>
         <w:br/>
         <w:t>RQ02 — Em parte: mediana de PRs merged relevante, com forte assimetria (poucos repos concentram milhares de PRs).</w:t>
-      </w:r>
-      <w:r>
-        <w:rPr>
-          <w:color w:val="000000"/>
-          <w:lang w:val="pt-BR"/>
-        </w:rPr>
         <w:br/>
         <w:t>RQ03 — Não necessariamente: mediana de releases baixa/próxima de zero por causa de repos de curadoria/docs.</w:t>
-      </w:r>
-      <w:r>
-        <w:rPr>
-          <w:color w:val="000000"/>
-          <w:lang w:val="pt-BR"/>
-        </w:rPr>
         <w:br/>
         <w:t>RQ04 — Sim: tempo desde o último push tipicamente curto (dias/poucas semanas).</w:t>
-      </w:r>
-      <w:r>
-        <w:rPr>
-          <w:color w:val="000000"/>
-          <w:lang w:val="pt-BR"/>
-        </w:rPr>
         <w:br/>
         <w:t>RQ05 — Parcialmente: parcela relevante em linguagens TIOBE, mas também Markdown/null e linguagens fora do índice (ex.: TypeScript).</w:t>
-      </w:r>
-      <w:r>
-        <w:rPr>
-          <w:color w:val="000000"/>
-          <w:lang w:val="pt-BR"/>
-        </w:rPr>
         <w:br/>
         <w:t>RQ06 — Sim: razão mediana closed/total alta (~70–80% ou mais).</w:t>
-      </w:r>
-      <w:r>
-        <w:rPr>
-          <w:color w:val="000000"/>
-          <w:lang w:val="pt-BR"/>
-        </w:rPr>
         <w:br/>
         <w:t>RQ07 — Mista: TIOBE com mais PRs e updates mais recentes; releases com diferença menor.</w:t>
-      </w:r>
-      <w:r>
-        <w:rPr>
-          <w:color w:val="000000"/>
-          <w:lang w:val="pt-BR"/>
-        </w:rPr>
         <w:br/>
-      </w:r>
-      <w:r>
-        <w:rPr>
-          <w:color w:val="000000"/>
-          <w:lang w:val="pt-BR"/>
-        </w:rPr>
         <w:br/>
         <w:t>Inovações (30%): (i) validação rápida de amostra (5–10 repos) por bloco de métricas antes da coleta completa; (ii) paginação em lotes menores com retry/backoff para mitigar HTTP 502 na API GraphQL; (iii) snapshots CSV do GitHub Projects para reconstituição histórica do board (base dos Labs 04/05).</w:t>
       </w:r>
@@ -613,7 +559,6 @@
         <w:rPr>
           <w:lang w:val="pt-BR"/>
         </w:rPr>
-        <w:lastRenderedPageBreak/>
         <w:t>2. Contexto</w:t>
       </w:r>
     </w:p>
@@ -625,6 +570,32 @@
           <w:lang w:val="pt-BR"/>
         </w:rPr>
       </w:pPr>
+      <w:proofErr w:type="spellStart"/>
+      <w:proofErr w:type="spellEnd"/>
+      <w:proofErr w:type="gramStart"/>
+      <w:proofErr w:type="gramEnd"/>
+      <w:proofErr w:type="spellStart"/>
+      <w:proofErr w:type="spellEnd"/>
+      <w:proofErr w:type="spellStart"/>
+      <w:proofErr w:type="spellEnd"/>
+      <w:proofErr w:type="spellStart"/>
+      <w:proofErr w:type="spellEnd"/>
+      <w:proofErr w:type="spellStart"/>
+      <w:proofErr w:type="spellEnd"/>
+      <w:proofErr w:type="spellStart"/>
+      <w:proofErr w:type="spellEnd"/>
+      <w:proofErr w:type="spellStart"/>
+      <w:proofErr w:type="spellEnd"/>
+      <w:proofErr w:type="spellStart"/>
+      <w:proofErr w:type="spellEnd"/>
+      <w:proofErr w:type="spellStart"/>
+      <w:proofErr w:type="spellEnd"/>
+      <w:proofErr w:type="spellStart"/>
+      <w:proofErr w:type="spellEnd"/>
+      <w:proofErr w:type="spellStart"/>
+      <w:proofErr w:type="spellEnd"/>
+      <w:proofErr w:type="gramStart"/>
+      <w:proofErr w:type="gramEnd"/>
     </w:p>
     <w:p>
       <w:pPr>
@@ -635,38 +606,15 @@
       </w:pPr>
       <w:r>
         <w:rPr>
+          <w:i w:val="0"/>
           <w:color w:val="000000"/>
-          <w:lang w:val="pt-BR"/>
+          <w:sz w:val="22"/>
         </w:rPr>
         <w:t>Este é o Lab01, ponto de partida do semestre: combina mineração de software (1.000 repositórios mais populares do GitHub) com a implantação do processo Kanban do próprio grupo. Os dados e o board gerados aqui alimentam laboratórios posteriores (em especial snapshots para Labs 04 e 05).</w:t>
-      </w:r>
-      <w:r>
-        <w:rPr>
-          <w:color w:val="000000"/>
-          <w:lang w:val="pt-BR"/>
-        </w:rPr>
         <w:br/>
-      </w:r>
-      <w:r>
-        <w:rPr>
-          <w:color w:val="000000"/>
-          <w:lang w:val="pt-BR"/>
-        </w:rPr>
         <w:br/>
         <w:t>Objeto de estudo: repositórios retornados pela busca GraphQL `stars:&gt;1 sort:stars-desc`, limitados aos 1.000 primeiros, com métricas alinhadas às RQs 01–06 (e campos necessários ao bônus RQ07).</w:t>
-      </w:r>
-      <w:r>
-        <w:rPr>
-          <w:color w:val="000000"/>
-          <w:lang w:val="pt-BR"/>
-        </w:rPr>
         <w:br/>
-      </w:r>
-      <w:r>
-        <w:rPr>
-          <w:color w:val="000000"/>
-          <w:lang w:val="pt-BR"/>
-        </w:rPr>
         <w:br/>
         <w:t>Referência conceitual para “linguagens mais populares” (RQ05/RQ07): TIOBE Index (https://www.tiobe.com/tiobe-index/), mantida como fonte única em todo o Lab01, conforme documentado no README e em docs/hipoteses-informais.md.</w:t>
       </w:r>
@@ -705,6 +653,7 @@
         <w:rPr>
           <w:lang w:val="pt-BR"/>
         </w:rPr>
+        <w:lastRenderedPageBreak/>
         <w:t>3.1 Principais Desafios</w:t>
       </w:r>
     </w:p>
@@ -716,6 +665,14 @@
           <w:lang w:val="pt-BR"/>
         </w:rPr>
       </w:pPr>
+      <w:proofErr w:type="spellStart"/>
+      <w:proofErr w:type="spellEnd"/>
+      <w:proofErr w:type="spellStart"/>
+      <w:proofErr w:type="spellEnd"/>
+      <w:proofErr w:type="spellStart"/>
+      <w:proofErr w:type="spellEnd"/>
+      <w:proofErr w:type="spellStart"/>
+      <w:proofErr w:type="spellEnd"/>
     </w:p>
     <w:p>
       <w:pPr>
@@ -726,48 +683,19 @@
       </w:pPr>
       <w:r>
         <w:rPr>
+          <w:i w:val="0"/>
           <w:color w:val="000000"/>
-          <w:lang w:val="pt-BR"/>
+          <w:sz w:val="22"/>
         </w:rPr>
         <w:t>Principais desafios enfrentados:</w:t>
-      </w:r>
-      <w:r>
-        <w:rPr>
-          <w:color w:val="000000"/>
-          <w:lang w:val="pt-BR"/>
-        </w:rPr>
         <w:br/>
         <w:t>• Complexidade/instabilidade da API GraphQL do GitHub ao solicitar connections (PRs, issues, releases) para dezenas de repositórios na mesma página — ocorrência recorrente de HTTP 502, mitigada com páginas menores e retries com backoff.</w:t>
-      </w:r>
-      <w:r>
-        <w:rPr>
-          <w:color w:val="000000"/>
-          <w:lang w:val="pt-BR"/>
-        </w:rPr>
         <w:br/>
         <w:t>• Paginação até 1.000 itens respeitando o limite de 100 nós por página da API Search.</w:t>
-      </w:r>
-      <w:r>
-        <w:rPr>
-          <w:color w:val="000000"/>
-          <w:lang w:val="pt-BR"/>
-        </w:rPr>
         <w:br/>
         <w:t>• Ausência de histórico consultável de mudança de Status no GitHub Projects via API, exigindo exportações periódicas (snapshots CSV) do board.</w:t>
-      </w:r>
-      <w:r>
-        <w:rPr>
-          <w:color w:val="000000"/>
-          <w:lang w:val="pt-BR"/>
-        </w:rPr>
         <w:br/>
         <w:t>• Valores ausentes: primaryLanguage nulo (listas/docs) e repositórios com zero issues (razão RQ06 indefinida).</w:t>
-      </w:r>
-      <w:r>
-        <w:rPr>
-          <w:color w:val="000000"/>
-          <w:lang w:val="pt-BR"/>
-        </w:rPr>
         <w:br/>
         <w:t>• Restrição do enunciado: proibição de bibliotecas de terceiros que encapsulem a API do GitHub — a query GraphQL e o cliente HTTP são próprios do grupo (Python + requests).</w:t>
       </w:r>
@@ -794,6 +722,12 @@
           <w:lang w:val="pt-BR"/>
         </w:rPr>
       </w:pPr>
+      <w:proofErr w:type="spellStart"/>
+      <w:proofErr w:type="spellEnd"/>
+      <w:proofErr w:type="spellStart"/>
+      <w:proofErr w:type="spellEnd"/>
+      <w:proofErr w:type="spellStart"/>
+      <w:proofErr w:type="spellEnd"/>
     </w:p>
     <w:p>
       <w:pPr>
@@ -804,64 +738,21 @@
       </w:pPr>
       <w:r>
         <w:rPr>
+          <w:i w:val="0"/>
           <w:color w:val="000000"/>
-          <w:lang w:val="pt-BR"/>
+          <w:sz w:val="22"/>
         </w:rPr>
         <w:t>Tomadas de decisão:</w:t>
-      </w:r>
-      <w:r>
-        <w:rPr>
-          <w:color w:val="000000"/>
-          <w:lang w:val="pt-BR"/>
-        </w:rPr>
         <w:br/>
         <w:t>• Linguagem/script: Python 3 com requests e query GraphQL própria (sem SDK GitHub).</w:t>
-      </w:r>
-      <w:r>
-        <w:rPr>
-          <w:color w:val="000000"/>
-          <w:lang w:val="pt-BR"/>
-        </w:rPr>
         <w:br/>
         <w:t>• Amostra: top 1.000 por estrelas via search GraphQL; sem exclusão a priori por linguagem.</w:t>
-      </w:r>
-      <w:r>
-        <w:rPr>
-          <w:color w:val="000000"/>
-          <w:lang w:val="pt-BR"/>
-        </w:rPr>
         <w:br/>
         <w:t>• RQ04 operacionalizada como dias desde pushedAt (atividade de código); updatedAt fica como apoio.</w:t>
-      </w:r>
-      <w:r>
-        <w:rPr>
-          <w:color w:val="000000"/>
-          <w:lang w:val="pt-BR"/>
-        </w:rPr>
         <w:br/>
         <w:t>• RQ05: classificação TIOBE vs. não-TIOBE a partir de primaryLanguage.name (TypeScript, Markdown etc. contam como fora do conjunto TIOBE adotado).</w:t>
-      </w:r>
-      <w:r>
-        <w:rPr>
-          <w:color w:val="000000"/>
-          <w:lang w:val="pt-BR"/>
-        </w:rPr>
         <w:br/>
-        <w:t xml:space="preserve">• WIP da coluna Doing = 2: trio; evita excesso de paralelismo e força Review/Done frequentes </w:t>
-      </w:r>
-      <w:r>
-        <w:rPr>
-          <w:color w:val="000000"/>
-          <w:lang w:val="pt-BR"/>
-        </w:rPr>
-        <w:lastRenderedPageBreak/>
-        <w:t>(docs/processo-kanban.md).</w:t>
-      </w:r>
-      <w:r>
-        <w:rPr>
-          <w:color w:val="000000"/>
-          <w:lang w:val="pt-BR"/>
-        </w:rPr>
+        <w:t>• WIP da coluna Doing = 2: trio; evita excesso de paralelismo e força Review/Done frequentes (docs/processo-kanban.md).</w:t>
         <w:br/>
         <w:t>• Commits devem referenciar #Issue para vinculação no board (correção centrada no Projects).</w:t>
       </w:r>
@@ -888,6 +779,18 @@
           <w:lang w:val="pt-BR"/>
         </w:rPr>
       </w:pPr>
+      <w:proofErr w:type="spellStart"/>
+      <w:proofErr w:type="spellEnd"/>
+      <w:proofErr w:type="spellStart"/>
+      <w:proofErr w:type="spellEnd"/>
+      <w:proofErr w:type="spellStart"/>
+      <w:proofErr w:type="spellEnd"/>
+      <w:proofErr w:type="spellStart"/>
+      <w:proofErr w:type="spellEnd"/>
+      <w:proofErr w:type="spellStart"/>
+      <w:proofErr w:type="spellEnd"/>
+      <w:proofErr w:type="spellStart"/>
+      <w:proofErr w:type="spellEnd"/>
     </w:p>
     <w:p>
       <w:pPr>
@@ -896,254 +799,83 @@
           <w:lang w:val="pt-BR"/>
         </w:rPr>
       </w:pPr>
+      <w:proofErr w:type="spellStart"/>
+      <w:proofErr w:type="spellEnd"/>
+      <w:proofErr w:type="spellStart"/>
+      <w:proofErr w:type="spellEnd"/>
       <w:r>
         <w:rPr>
+          <w:i w:val="0"/>
           <w:color w:val="000000"/>
-          <w:lang w:val="pt-BR"/>
+          <w:sz w:val="22"/>
         </w:rPr>
         <w:t>Etapas (sprints) e responsáveis (refletindo Assignees das Issues):</w:t>
-      </w:r>
-      <w:r>
-        <w:rPr>
-          <w:color w:val="000000"/>
-          <w:lang w:val="pt-BR"/>
-        </w:rPr>
         <w:br/>
-      </w:r>
-      <w:r>
-        <w:rPr>
-          <w:color w:val="000000"/>
-          <w:lang w:val="pt-BR"/>
-        </w:rPr>
         <w:br/>
         <w:t>Lab01S01 — Coleta GraphQL (100 repos) + setup Kanban</w:t>
-      </w:r>
-      <w:r>
-        <w:rPr>
-          <w:color w:val="000000"/>
-          <w:lang w:val="pt-BR"/>
-        </w:rPr>
         <w:br/>
         <w:t>• #2 Setup Projects/WIP/labels — Gabriel Ferreira (Druitti) — Done</w:t>
-      </w:r>
-      <w:r>
-        <w:rPr>
-          <w:color w:val="000000"/>
-          <w:lang w:val="pt-BR"/>
-        </w:rPr>
         <w:br/>
         <w:t>• #1 Query base + auth + fetch — Druitti — Done</w:t>
-      </w:r>
-      <w:r>
-        <w:rPr>
-          <w:color w:val="000000"/>
-          <w:lang w:val="pt-BR"/>
-        </w:rPr>
         <w:br/>
         <w:t>• #3 RQ01+RQ02 + validação amostra — Druitti — Done</w:t>
-      </w:r>
-      <w:r>
-        <w:rPr>
-          <w:color w:val="000000"/>
-          <w:lang w:val="pt-BR"/>
-        </w:rPr>
         <w:br/>
         <w:t>• #4 RQ03+RQ04 + validação — Druitti — Done</w:t>
-      </w:r>
-      <w:r>
-        <w:rPr>
-          <w:color w:val="000000"/>
-          <w:lang w:val="pt-BR"/>
-        </w:rPr>
         <w:br/>
         <w:t>• #5 RQ05+RQ06 + TIOBE — Druitti — Done</w:t>
-      </w:r>
-      <w:r>
-        <w:rPr>
-          <w:color w:val="000000"/>
-          <w:lang w:val="pt-BR"/>
-        </w:rPr>
         <w:br/>
         <w:t>• #6 Integração/smoke 100 — Druitti — Done</w:t>
-      </w:r>
-      <w:r>
-        <w:rPr>
-          <w:color w:val="000000"/>
-          <w:lang w:val="pt-BR"/>
-        </w:rPr>
         <w:br/>
-      </w:r>
-      <w:r>
-        <w:rPr>
-          <w:color w:val="000000"/>
-          <w:lang w:val="pt-BR"/>
-        </w:rPr>
         <w:br/>
         <w:t>Lab01S02 — Paginação 1000 + CSV + hipóteses + snapshot</w:t>
-      </w:r>
-      <w:r>
-        <w:rPr>
-          <w:color w:val="000000"/>
-          <w:lang w:val="pt-BR"/>
-        </w:rPr>
         <w:br/>
         <w:t>• #7 Paginação 1000 + export CSV — Gabriel Santiago (gabsant07) — Done (código + dados gerados)</w:t>
-      </w:r>
-      <w:r>
-        <w:rPr>
-          <w:color w:val="000000"/>
-          <w:lang w:val="pt-BR"/>
-        </w:rPr>
         <w:br/>
         <w:t>• #8 Snapshot GraphQL do Project → CSV — gabsant07 — em aberto no board (código presente: src/collect_repos_snapshot.py)</w:t>
-      </w:r>
-      <w:r>
-        <w:rPr>
-          <w:color w:val="000000"/>
-          <w:lang w:val="pt-BR"/>
-        </w:rPr>
         <w:br/>
         <w:t>• #9 Hipóteses informais — Druitti — Done</w:t>
-      </w:r>
-      <w:r>
-        <w:rPr>
-          <w:color w:val="000000"/>
-          <w:lang w:val="pt-BR"/>
-        </w:rPr>
         <w:br/>
-      </w:r>
-      <w:r>
-        <w:rPr>
-          <w:color w:val="000000"/>
-          <w:lang w:val="pt-BR"/>
-        </w:rPr>
         <w:br/>
         <w:t>Lab01S03 — Análise/visualização</w:t>
-      </w:r>
-      <w:r>
-        <w:rPr>
-          <w:color w:val="000000"/>
-          <w:lang w:val="pt-BR"/>
-        </w:rPr>
         <w:br/>
-        <w:t>• #10 Análise/visualização RQs + bônus — Gabriel Tavares (Tavaresds1) e gabsant07 — em andamento (fora do escopo deste responsável pelo relatório textual)</w:t>
-      </w:r>
-      <w:r>
-        <w:rPr>
-          <w:color w:val="000000"/>
-          <w:lang w:val="pt-BR"/>
-        </w:rPr>
+        <w:t>• #10 Análise/visualização RQs + bônus — Gabriel Tavares (Tavaresds1) e gabsant07 — Done</w:t>
         <w:br/>
-      </w:r>
-      <w:r>
-        <w:rPr>
-          <w:color w:val="000000"/>
-          <w:lang w:val="pt-BR"/>
-        </w:rPr>
         <w:br/>
         <w:t>Relatório Final</w:t>
-      </w:r>
-      <w:r>
-        <w:rPr>
-          <w:color w:val="000000"/>
-          <w:lang w:val="pt-BR"/>
-        </w:rPr>
         <w:br/>
         <w:t>• #11 Relatório final + print do board — Druitti — este documento</w:t>
-      </w:r>
-      <w:r>
-        <w:rPr>
-          <w:color w:val="000000"/>
-          <w:lang w:val="pt-BR"/>
-        </w:rPr>
         <w:br/>
-      </w:r>
-      <w:r>
-        <w:rPr>
-          <w:color w:val="000000"/>
-          <w:lang w:val="pt-BR"/>
-        </w:rPr>
         <w:br/>
         <w:t>Configuração do processo (Kanban):</w:t>
-      </w:r>
-      <w:r>
-        <w:rPr>
-          <w:color w:val="000000"/>
-          <w:lang w:val="pt-BR"/>
-        </w:rPr>
         <w:br/>
         <w:t>• Colunas Status: Backlog → To Do → Doing → Review → Done</w:t>
-      </w:r>
-      <w:r>
-        <w:rPr>
-          <w:color w:val="000000"/>
-          <w:lang w:val="pt-BR"/>
-        </w:rPr>
         <w:br/>
         <w:t>• WIP Doing = 2 (justificativa na seção 3.2 e em docs/processo-kanban.md)</w:t>
-      </w:r>
-      <w:r>
-        <w:rPr>
-          <w:color w:val="000000"/>
-          <w:lang w:val="pt-BR"/>
-        </w:rPr>
         <w:br/>
         <w:t>• Cartões = Issues reais com Assignee; labels por integrante</w:t>
+        <w:br/>
+        <w:br/>
+        <w:t>[INSERIR AQUI O PRINT DO BOARD] — Anexo obrigatório: captura de tela do GitHub Projects (https://github.com/users/Druitti/projects/5) ao final do Lab01, mostrando o fluxo completo e a política de WIP. Salvar também em relatorio/anexos/board-lab01.png se desejar versionar a imagem.</w:t>
       </w:r>
-      <w:r>
-        <w:rPr>
-          <w:color w:val="000000"/>
-          <w:lang w:val="pt-BR"/>
-        </w:rPr>
-        <w:br/>
-      </w:r>
-      <w:r>
-        <w:rPr>
-          <w:color w:val="000000"/>
-          <w:lang w:val="pt-BR"/>
-        </w:rPr>
-        <w:lastRenderedPageBreak/>
-        <w:br/>
-      </w:r>
-      <w:r>
+    </w:p>
+    <w:p>
+      <w:pPr>
+        <w:jc w:val="center"/>
         <w:rPr>
           <w:lang w:val="pt-BR"/>
         </w:rPr>
-        <w:drawing>
-          <wp:inline distT="0" distB="0" distL="0" distR="0" wp14:anchorId="49E38DF7" wp14:editId="00A83045">
-            <wp:extent cx="5972810" cy="3008630"/>
-            <wp:effectExtent l="0" t="0" r="8890" b="1270"/>
-            <wp:docPr id="1" name="Imagem 1"/>
-            <wp:cNvGraphicFramePr>
-              <a:graphicFrameLocks xmlns:a="http://schemas.openxmlformats.org/drawingml/2006/main" noChangeAspect="1"/>
-            </wp:cNvGraphicFramePr>
-            <a:graphic xmlns:a="http://schemas.openxmlformats.org/drawingml/2006/main">
-              <a:graphicData uri="http://schemas.openxmlformats.org/drawingml/2006/picture">
-                <pic:pic xmlns:pic="http://schemas.openxmlformats.org/drawingml/2006/picture">
-                  <pic:nvPicPr>
-                    <pic:cNvPr id="1" name=""/>
-                    <pic:cNvPicPr/>
-                  </pic:nvPicPr>
-                  <pic:blipFill>
-                    <a:blip r:embed="rId6"/>
-                    <a:stretch>
-                      <a:fillRect/>
-                    </a:stretch>
-                  </pic:blipFill>
-                  <pic:spPr>
-                    <a:xfrm>
-                      <a:off x="0" y="0"/>
-                      <a:ext cx="5972810" cy="3008630"/>
-                    </a:xfrm>
-                    <a:prstGeom prst="rect">
-                      <a:avLst/>
-                    </a:prstGeom>
-                  </pic:spPr>
-                </pic:pic>
-              </a:graphicData>
-            </a:graphic>
-          </wp:inline>
-        </w:drawing>
+      </w:pPr>
+      <w:proofErr w:type="spellStart"/>
+      <w:proofErr w:type="spellEnd"/>
+      <w:proofErr w:type="spellStart"/>
+      <w:proofErr w:type="spellEnd"/>
+      <w:r>
+        <w:rPr>
+          <w:i w:val="0"/>
+          <w:color w:val="000000"/>
+          <w:sz w:val="22"/>
+        </w:rPr>
+        <w:t>Sugestão de anexo: print do quadro Kanban (GitHub Projects) mencionado acima. Enquanto a imagem não for colada neste .docx, use o link do Project e/ou o arquivo em relatorio/anexos/.</w:t>
       </w:r>
     </w:p>
     <w:p>
@@ -1168,6 +900,24 @@
           <w:lang w:val="pt-BR"/>
         </w:rPr>
       </w:pPr>
+      <w:proofErr w:type="spellStart"/>
+      <w:proofErr w:type="spellEnd"/>
+      <w:proofErr w:type="spellStart"/>
+      <w:proofErr w:type="spellEnd"/>
+      <w:proofErr w:type="spellStart"/>
+      <w:proofErr w:type="spellEnd"/>
+      <w:proofErr w:type="spellStart"/>
+      <w:proofErr w:type="spellEnd"/>
+      <w:proofErr w:type="spellStart"/>
+      <w:proofErr w:type="spellEnd"/>
+      <w:proofErr w:type="spellStart"/>
+      <w:proofErr w:type="spellEnd"/>
+      <w:proofErr w:type="spellStart"/>
+      <w:proofErr w:type="spellEnd"/>
+      <w:proofErr w:type="spellStart"/>
+      <w:proofErr w:type="spellEnd"/>
+      <w:proofErr w:type="spellStart"/>
+      <w:proofErr w:type="spellEnd"/>
     </w:p>
     <w:p>
       <w:pPr>
@@ -1178,71 +928,24 @@
       </w:pPr>
       <w:r>
         <w:rPr>
+          <w:i w:val="0"/>
           <w:color w:val="000000"/>
-          <w:lang w:val="pt-BR"/>
+          <w:sz w:val="22"/>
         </w:rPr>
         <w:t>Ferramentas utilizadas:</w:t>
-      </w:r>
-      <w:r>
-        <w:rPr>
-          <w:color w:val="000000"/>
-          <w:lang w:val="pt-BR"/>
-        </w:rPr>
         <w:br/>
         <w:t>• GitHub GraphQL API (https://api.github.com/graphql) — mineração e snapshot do Project</w:t>
-      </w:r>
-      <w:r>
-        <w:rPr>
-          <w:color w:val="000000"/>
-          <w:lang w:val="pt-BR"/>
-        </w:rPr>
         <w:br/>
         <w:t>• Python 3 + requests (+ python-dotenv opcional) — scripts próprios do grupo (src/collect_repos.py, src/validate_sample.py, src/collect_repos_snapshot.py)</w:t>
-      </w:r>
-      <w:r>
-        <w:rPr>
-          <w:color w:val="000000"/>
-          <w:lang w:val="pt-BR"/>
-        </w:rPr>
         <w:br/>
         <w:t>• Git / GitHub Issues + GitHub Projects (v2) — processo</w:t>
-      </w:r>
-      <w:r>
-        <w:rPr>
-          <w:color w:val="000000"/>
-          <w:lang w:val="pt-BR"/>
-        </w:rPr>
         <w:br/>
-        <w:t>• (Pendente #10) biblioteca/ferramenta de visualização escolhida pelos responsáveis pela análise</w:t>
-      </w:r>
-      <w:r>
-        <w:rPr>
-          <w:color w:val="000000"/>
-          <w:lang w:val="pt-BR"/>
-        </w:rPr>
+        <w:t>• Python 3 + matplotlib + seaborn — geração dos gráficos das RQs 01–07 (scripts/gerar_graficos_rqs.py)</w:t>
         <w:br/>
-      </w:r>
-      <w:r>
-        <w:rPr>
-          <w:color w:val="000000"/>
-          <w:lang w:val="pt-BR"/>
-        </w:rPr>
         <w:br/>
         <w:t>Links:</w:t>
-      </w:r>
-      <w:r>
-        <w:rPr>
-          <w:color w:val="000000"/>
-          <w:lang w:val="pt-BR"/>
-        </w:rPr>
         <w:br/>
         <w:t>• Repositório: https://github.com/Druitti/Laboratorio-de-Desenvolvimento-de-Software</w:t>
-      </w:r>
-      <w:r>
-        <w:rPr>
-          <w:color w:val="000000"/>
-          <w:lang w:val="pt-BR"/>
-        </w:rPr>
         <w:br/>
         <w:t>• GitHub Projects: https://github.com/users/Druitti/projects/5</w:t>
       </w:r>
@@ -1259,6 +962,54 @@
           <w:lang w:val="pt-BR"/>
         </w:rPr>
         <w:t>3.5 Tabela de Métricas</w:t>
+      </w:r>
+    </w:p>
+    <w:p>
+      <w:pPr>
+        <w:spacing w:after="200"/>
+        <w:ind w:left="198"/>
+        <w:rPr>
+          <w:lang w:val="pt-BR"/>
+        </w:rPr>
+      </w:pPr>
+      <w:r>
+        <w:rPr>
+          <w:b/>
+          <w:i/>
+          <w:color w:val="1F6E63"/>
+          <w:sz w:val="21"/>
+          <w:lang w:val="pt-BR"/>
+        </w:rPr>
+        <w:t xml:space="preserve">ORIENTAÇÃO: </w:t>
+      </w:r>
+      <w:r>
+        <w:rPr>
+          <w:i/>
+          <w:color w:val="595959"/>
+          <w:sz w:val="21"/>
+          <w:lang w:val="pt-BR"/>
+        </w:rPr>
+        <w:t xml:space="preserve">Construa uma tabela relacionando cada Questão de Pesquisa à métrica correspondente, sua definição operacional exata (a fórmula ou regra de cálculo — não basta o nome) e a ferramenta/fonte usada para coletá-la. Isso é o que garante que o laboratório seja reprodutível por outro grupo. A primeira linha abaixo é um exemplo ilustrativo (baseado no Lab01); substitua pelas </w:t>
+      </w:r>
+      <w:proofErr w:type="spellStart"/>
+      <w:r>
+        <w:rPr>
+          <w:i/>
+          <w:color w:val="595959"/>
+          <w:sz w:val="21"/>
+          <w:lang w:val="pt-BR"/>
+        </w:rPr>
+        <w:t>RQs</w:t>
+      </w:r>
+      <w:proofErr w:type="spellEnd"/>
+      <w:r>
+        <w:rPr>
+          <w:i/>
+          <w:color w:val="595959"/>
+          <w:sz w:val="21"/>
+          <w:lang w:val="pt-BR"/>
+        </w:rPr>
+        <w:t xml:space="preserve"> e métricas do seu laboratório.</w:t>
       </w:r>
     </w:p>
     <w:tbl>
@@ -1582,7 +1333,6 @@
           </w:tcPr>
           <w:p>
             <w:r>
-              <w:lastRenderedPageBreak/>
               <w:t>RQ05</w:t>
             </w:r>
           </w:p>
@@ -1602,15 +1352,7 @@
             <w:tcW w:w="1881" w:type="dxa"/>
           </w:tcPr>
           <w:p>
-            <w:pPr>
-              <w:rPr>
-                <w:lang w:val="pt-BR"/>
-              </w:rPr>
-            </w:pPr>
             <w:r>
-              <w:rPr>
-                <w:lang w:val="pt-BR"/>
-              </w:rPr>
               <w:t>primaryLanguage.name classificada vs TIOBE Index</w:t>
             </w:r>
           </w:p>
@@ -1639,7 +1381,7 @@
       <w:tr>
         <w:tc>
           <w:tcPr>
-            <w:tcW w:w="1881" w:type="dxa"/>
+            <w:tcW w:type="dxa" w:w="1881"/>
           </w:tcPr>
           <w:p>
             <w:r>
@@ -1649,7 +1391,7 @@
         </w:tc>
         <w:tc>
           <w:tcPr>
-            <w:tcW w:w="1881" w:type="dxa"/>
+            <w:tcW w:type="dxa" w:w="1881"/>
           </w:tcPr>
           <w:p>
             <w:r>
@@ -1659,7 +1401,7 @@
         </w:tc>
         <w:tc>
           <w:tcPr>
-            <w:tcW w:w="3118" w:type="dxa"/>
+            <w:tcW w:type="dxa" w:w="3118"/>
           </w:tcPr>
           <w:p>
             <w:r>
@@ -1669,7 +1411,7 @@
         </w:tc>
         <w:tc>
           <w:tcPr>
-            <w:tcW w:w="1881" w:type="dxa"/>
+            <w:tcW w:type="dxa" w:w="1881"/>
           </w:tcPr>
           <w:p>
             <w:r>
@@ -1679,7 +1421,7 @@
         </w:tc>
         <w:tc>
           <w:tcPr>
-            <w:tcW w:w="1881" w:type="dxa"/>
+            <w:tcW w:type="dxa" w:w="1881"/>
           </w:tcPr>
           <w:p>
             <w:r>
@@ -1691,7 +1433,7 @@
       <w:tr>
         <w:tc>
           <w:tcPr>
-            <w:tcW w:w="1881" w:type="dxa"/>
+            <w:tcW w:type="dxa" w:w="1881"/>
           </w:tcPr>
           <w:p>
             <w:r>
@@ -1701,43 +1443,27 @@
         </w:tc>
         <w:tc>
           <w:tcPr>
-            <w:tcW w:w="1881" w:type="dxa"/>
+            <w:tcW w:type="dxa" w:w="1881"/>
           </w:tcPr>
           <w:p>
-            <w:pPr>
-              <w:rPr>
-                <w:lang w:val="pt-BR"/>
-              </w:rPr>
-            </w:pPr>
             <w:r>
-              <w:rPr>
-                <w:lang w:val="pt-BR"/>
-              </w:rPr>
               <w:t>PRs/releases/atualização por linguagem</w:t>
             </w:r>
           </w:p>
         </w:tc>
         <w:tc>
           <w:tcPr>
-            <w:tcW w:w="3118" w:type="dxa"/>
+            <w:tcW w:type="dxa" w:w="3118"/>
           </w:tcPr>
           <w:p>
-            <w:pPr>
-              <w:rPr>
-                <w:lang w:val="pt-BR"/>
-              </w:rPr>
-            </w:pPr>
             <w:r>
-              <w:rPr>
-                <w:lang w:val="pt-BR"/>
-              </w:rPr>
               <w:t>Segmentação das métricas RQ02–04 por linguagem / TIOBE</w:t>
             </w:r>
           </w:p>
         </w:tc>
         <w:tc>
           <w:tcPr>
-            <w:tcW w:w="1881" w:type="dxa"/>
+            <w:tcW w:type="dxa" w:w="1881"/>
           </w:tcPr>
           <w:p>
             <w:r>
@@ -1747,11 +1473,11 @@
         </w:tc>
         <w:tc>
           <w:tcPr>
-            <w:tcW w:w="1881" w:type="dxa"/>
+            <w:tcW w:type="dxa" w:w="1881"/>
           </w:tcPr>
           <w:p>
             <w:r>
-              <w:t>Pós-processamento (#10)</w:t>
+              <w:t>scripts/gerar_graficos_rqs.py</w:t>
             </w:r>
           </w:p>
         </w:tc>
@@ -1790,49 +1516,20 @@
       </w:pPr>
       <w:r>
         <w:rPr>
+          <w:i w:val="0"/>
           <w:color w:val="000000"/>
-          <w:lang w:val="pt-BR"/>
+          <w:sz w:val="22"/>
         </w:rPr>
         <w:t>Inovações propostas pelo grupo (30%):</w:t>
-      </w:r>
-      <w:r>
-        <w:rPr>
-          <w:color w:val="000000"/>
-          <w:lang w:val="pt-BR"/>
-        </w:rPr>
         <w:br/>
         <w:t>1) Pipeline de validação de amostra (validate_sample.py) por bloco de RQs antes da coleta em escala — reduz risco de métrica ausente/errada.</w:t>
-      </w:r>
-      <w:r>
-        <w:rPr>
-          <w:color w:val="000000"/>
-          <w:lang w:val="pt-BR"/>
-        </w:rPr>
         <w:br/>
         <w:t>2) Estratégia anti-502 (page size reduzido + retries) na coleta GraphQL dos top repositórios.</w:t>
-      </w:r>
-      <w:r>
-        <w:rPr>
-          <w:color w:val="000000"/>
-          <w:lang w:val="pt-BR"/>
-        </w:rPr>
         <w:br/>
         <w:t>3) Exportação de snapshots do GitHub Projects em CSV (collect_repos_snapshot.py), criando série temporal do Status das Issues para Labs 04/05.</w:t>
-      </w:r>
-      <w:r>
-        <w:rPr>
-          <w:color w:val="000000"/>
-          <w:lang w:val="pt-BR"/>
-        </w:rPr>
         <w:br/>
-      </w:r>
-      <w:r>
-        <w:rPr>
-          <w:color w:val="000000"/>
-          <w:lang w:val="pt-BR"/>
-        </w:rPr>
         <w:br/>
-        <w:t>Os resultados numéricos dessas inovações aparecem na robustez da coleta (1.000 repos obtidos) e na rastreabilidade do processo; gráficos comparativos detalhados ficam a cargo da Issue #10.</w:t>
+        <w:t>Os resultados numéricos dessas inovações aparecem na robustez da coleta (1.000 repos obtidos) e na rastreabilidade do processo; gráficos comparativos detalhados constam na seção 4.2.</w:t>
       </w:r>
     </w:p>
     <w:p>
@@ -1865,6 +1562,7 @@
     </w:p>
     <w:p>
       <w:pPr>
+        <w:spacing w:after="200"/>
         <w:ind w:left="198"/>
         <w:rPr>
           <w:lang w:val="pt-BR"/>
@@ -1872,126 +1570,155 @@
       </w:pPr>
       <w:r>
         <w:rPr>
-          <w:color w:val="000000"/>
+          <w:b/>
+          <w:i/>
+          <w:color w:val="1F6E63"/>
+          <w:sz w:val="21"/>
           <w:lang w:val="pt-BR"/>
         </w:rPr>
-        <w:t>Coleta de dados (estado atual):</w:t>
+        <w:t xml:space="preserve">ORIENTAÇÃO: </w:t>
       </w:r>
       <w:r>
         <w:rPr>
-          <w:color w:val="000000"/>
+          <w:i/>
+          <w:color w:val="595959"/>
+          <w:sz w:val="21"/>
           <w:lang w:val="pt-BR"/>
         </w:rPr>
-        <w:br/>
-        <w:t>• Alvo: 1.000 repositórios; obtido: 1.000 linhas em data/top_1000_repos.csv (e JSON correspondente).</w:t>
+        <w:t xml:space="preserve">Relate o volume final de dados efetivamente coletado e analisado — não apenas o volume-alvo do enunciado. Informe: quantos itens restaram após os filtros de qualidade (ex.: dos 1.000 repositórios buscados, quantos tinham dados completos; dos repositórios candidatos, quantos de fato usavam GitHub </w:t>
+      </w:r>
+      <w:proofErr w:type="spellStart"/>
+      <w:r>
+        <w:rPr>
+          <w:i/>
+          <w:color w:val="595959"/>
+          <w:sz w:val="21"/>
+          <w:lang w:val="pt-BR"/>
+        </w:rPr>
+        <w:t>Actions</w:t>
+      </w:r>
+      <w:proofErr w:type="spellEnd"/>
+      <w:r>
+        <w:rPr>
+          <w:i/>
+          <w:color w:val="595959"/>
+          <w:sz w:val="21"/>
+          <w:lang w:val="pt-BR"/>
+        </w:rPr>
+        <w:t xml:space="preserve"> — Lab03); o período coberto pela coleta; quantos </w:t>
+      </w:r>
+      <w:proofErr w:type="spellStart"/>
+      <w:r>
+        <w:rPr>
+          <w:i/>
+          <w:color w:val="595959"/>
+          <w:sz w:val="21"/>
+          <w:lang w:val="pt-BR"/>
+        </w:rPr>
+        <w:t>trials</w:t>
+      </w:r>
+      <w:proofErr w:type="spellEnd"/>
+      <w:r>
+        <w:rPr>
+          <w:i/>
+          <w:color w:val="595959"/>
+          <w:sz w:val="21"/>
+          <w:lang w:val="pt-BR"/>
+        </w:rPr>
+        <w:t xml:space="preserve">/execuções foram concluídos dentro do </w:t>
       </w:r>
       <w:r>
         <w:rPr>
-          <w:color w:val="000000"/>
-          <w:lang w:val="pt-BR"/>
-        </w:rPr>
-        <w:br/>
-        <w:t>• Período de referência da coleta local disponível: agosto/2026.</w:t>
-      </w:r>
-      <w:r>
-        <w:rPr>
-          <w:color w:val="000000"/>
-          <w:lang w:val="pt-BR"/>
-        </w:rPr>
-        <w:br/>
-        <w:t>• Ausências observadas na amostra: primaryLanguage nulo em 87 repos; 43 repos com zero issues (razão RQ06 não definida).</w:t>
-      </w:r>
-      <w:r>
-        <w:rPr>
-          <w:color w:val="000000"/>
-          <w:lang w:val="pt-BR"/>
-        </w:rPr>
-        <w:br/>
-        <w:t>• Tratamento: ausências reportadas; razões RQ06 calculadas apenas quando issues &gt; 0; linguagem nula tratada como categoria própria / fora do TIOBE.</w:t>
-      </w:r>
-      <w:r>
-        <w:rPr>
-          <w:color w:val="000000"/>
-          <w:lang w:val="pt-BR"/>
-        </w:rPr>
-        <w:br/>
-      </w:r>
-      <w:r>
-        <w:rPr>
-          <w:color w:val="000000"/>
-          <w:lang w:val="pt-BR"/>
-        </w:rPr>
-        <w:br/>
-        <w:t>Resumo descritivo (medianas na amostra de 1.000 — apoio ao relatório; gráficos na #10):</w:t>
-      </w:r>
-      <w:r>
-        <w:rPr>
-          <w:color w:val="000000"/>
-          <w:lang w:val="pt-BR"/>
-        </w:rPr>
-        <w:br/>
-        <w:t>• RQ01 — mediana da idade ≈ 2.831 dias (~7,8 anos)</w:t>
-      </w:r>
-      <w:r>
-        <w:rPr>
-          <w:color w:val="000000"/>
-          <w:lang w:val="pt-BR"/>
-        </w:rPr>
-        <w:br/>
-        <w:t>• RQ02 — mediana de PRs merged ≈ 768 (média ≈ 4.243 — forte assimetria)</w:t>
-      </w:r>
-      <w:r>
-        <w:rPr>
-          <w:color w:val="000000"/>
-          <w:lang w:val="pt-BR"/>
-        </w:rPr>
-        <w:br/>
-        <w:t>• RQ03 — mediana de releases ≈ 40; cerca de 28% com zero releases</w:t>
-      </w:r>
-      <w:r>
-        <w:rPr>
-          <w:color w:val="000000"/>
-          <w:lang w:val="pt-BR"/>
-        </w:rPr>
-        <w:br/>
-        <w:t>• RQ04 — mediana de dias desde pushedAt ≈ 6</w:t>
-      </w:r>
-      <w:r>
-        <w:rPr>
-          <w:color w:val="000000"/>
-          <w:lang w:val="pt-BR"/>
-        </w:rPr>
-        <w:br/>
-        <w:t>• RQ05 — entre repos com linguagem: ~67,9% em linguagens do conjunto TIOBE adotado; tops: Python, TypeScript, JavaScript, Go, Rust</w:t>
-      </w:r>
-      <w:r>
-        <w:rPr>
-          <w:color w:val="000000"/>
-          <w:lang w:val="pt-BR"/>
-        </w:rPr>
-        <w:br/>
-        <w:t>• RQ06 — mediana closed/total ≈ 0,875 (87,5%)</w:t>
-      </w:r>
-      <w:r>
-        <w:rPr>
-          <w:color w:val="000000"/>
-          <w:lang w:val="pt-BR"/>
-        </w:rPr>
-        <w:br/>
-      </w:r>
-      <w:r>
-        <w:rPr>
-          <w:color w:val="000000"/>
-          <w:lang w:val="pt-BR"/>
-        </w:rPr>
-        <w:br/>
-      </w:r>
-      <w:r>
-        <w:rPr>
-          <w:color w:val="000000"/>
+          <w:i/>
+          <w:color w:val="595959"/>
+          <w:sz w:val="21"/>
           <w:lang w:val="pt-BR"/>
         </w:rPr>
         <w:lastRenderedPageBreak/>
+        <w:t xml:space="preserve">tempo (Lab02); quantos snapshots do </w:t>
+      </w:r>
+      <w:proofErr w:type="spellStart"/>
+      <w:r>
+        <w:rPr>
+          <w:i/>
+          <w:color w:val="595959"/>
+          <w:sz w:val="21"/>
+          <w:lang w:val="pt-BR"/>
+        </w:rPr>
+        <w:t>Kanban</w:t>
+      </w:r>
+      <w:proofErr w:type="spellEnd"/>
+      <w:r>
+        <w:rPr>
+          <w:i/>
+          <w:color w:val="595959"/>
+          <w:sz w:val="21"/>
+          <w:lang w:val="pt-BR"/>
+        </w:rPr>
+        <w:t xml:space="preserve"> estão disponíveis e desde quando (Lab04/Lab05); outliers ou dados ausentes identificados, e como foram tratados (removidos, mantidos e discutidos à </w:t>
+      </w:r>
+      <w:proofErr w:type="gramStart"/>
+      <w:r>
+        <w:rPr>
+          <w:i/>
+          <w:color w:val="595959"/>
+          <w:sz w:val="21"/>
+          <w:lang w:val="pt-BR"/>
+        </w:rPr>
+        <w:t>parte, etc.</w:t>
+      </w:r>
+      <w:proofErr w:type="gramEnd"/>
+      <w:r>
+        <w:rPr>
+          <w:i/>
+          <w:color w:val="595959"/>
+          <w:sz w:val="21"/>
+          <w:lang w:val="pt-BR"/>
+        </w:rPr>
+        <w:t>).</w:t>
+      </w:r>
+    </w:p>
+    <w:p>
+      <w:pPr>
+        <w:ind w:left="198"/>
+        <w:rPr>
+          <w:lang w:val="pt-BR"/>
+        </w:rPr>
+      </w:pPr>
+      <w:r>
+        <w:rPr>
+          <w:i w:val="0"/>
+          <w:color w:val="000000"/>
+          <w:sz w:val="22"/>
+        </w:rPr>
+        <w:t>Coleta de dados (estado atual):</w:t>
+        <w:br/>
+        <w:t>• Alvo: 1.000 repositórios; obtido: 1.000 linhas em data/top_1000_repos.csv (e JSON correspondente).</w:t>
+        <w:br/>
+        <w:t>• Período de referência da coleta local disponível: agosto/2026.</w:t>
+        <w:br/>
+        <w:t>• Ausências observadas na amostra: primaryLanguage nulo em 87 repos; 43 repos com zero issues (razão RQ06 não definida).</w:t>
+        <w:br/>
+        <w:t>• Tratamento: ausências reportadas; razões RQ06 calculadas apenas quando issues &gt; 0; linguagem nula tratada como categoria própria / fora do TIOBE.</w:t>
+        <w:br/>
+        <w:br/>
+        <w:t>Resumo descritivo (medianas na amostra de 1.000; ver gráficos na seção 4.2):</w:t>
+        <w:br/>
+        <w:t>• RQ01 — mediana da idade ≈ 2.825 dias (~7,7 anos)</w:t>
+        <w:br/>
+        <w:t>• RQ02 — mediana de PRs merged ≈ 768 (média ≈ 4.243 — forte assimetria)</w:t>
+        <w:br/>
+        <w:t>• RQ03 — mediana de releases ≈ 40; cerca de 28% com zero releases</w:t>
+        <w:br/>
+        <w:t>• RQ04 — mediana de dias desde pushedAt ≈ 1,2 (repositórios extremamente ativos no topo do ranking de estrelas)</w:t>
+        <w:br/>
+        <w:t>• RQ05 — entre repos com linguagem: ~67,9% em linguagens do conjunto TIOBE adotado; tops: Python, TypeScript, JavaScript, Go, Rust</w:t>
+        <w:br/>
+        <w:t>• RQ06 — mediana closed/total ≈ 0,875 (87,5%)</w:t>
+        <w:br/>
+        <w:t>• RQ07 (bônus) — TIOBE vs. Não TIOBE: PRs merged (mediana 865 vs. 1.000), releases (mediana 51 vs. 51), dias desde push (mediana 0,6 vs. 0,3) — diferenças pequenas entre os dois grupos</w:t>
+        <w:br/>
+        <w:br/>
         <w:t>Snapshots do Project: script disponível (src/collect_repos_snapshot.py); a Issue #8 permanece aberta no board até a exportação CSV de fechamento ser confirmada pelos responsáveis.</w:t>
       </w:r>
     </w:p>
@@ -2017,6 +1744,8 @@
           <w:lang w:val="pt-BR"/>
         </w:rPr>
       </w:pPr>
+      <w:proofErr w:type="spellStart"/>
+      <w:proofErr w:type="spellEnd"/>
     </w:p>
     <w:tbl>
       <w:tblPr>
@@ -2042,7 +1771,25 @@
                 <w:color w:val="FFFFFF"/>
                 <w:sz w:val="20"/>
               </w:rPr>
-              <w:t>Tipo de pergunta / dado</w:t>
+              <w:t xml:space="preserve">Tipo de </w:t>
+            </w:r>
+            <w:proofErr w:type="spellStart"/>
+            <w:r>
+              <w:rPr>
+                <w:b/>
+                <w:color w:val="FFFFFF"/>
+                <w:sz w:val="20"/>
+              </w:rPr>
+              <w:t>pergunta</w:t>
+            </w:r>
+            <w:proofErr w:type="spellEnd"/>
+            <w:r>
+              <w:rPr>
+                <w:b/>
+                <w:color w:val="FFFFFF"/>
+                <w:sz w:val="20"/>
+              </w:rPr>
+              <w:t xml:space="preserve"> / dado</w:t>
             </w:r>
           </w:p>
         </w:tc>
@@ -2133,12 +1880,53 @@
                 <w:lang w:val="pt-BR"/>
               </w:rPr>
             </w:pPr>
+            <w:proofErr w:type="spellStart"/>
             <w:r>
               <w:rPr>
                 <w:sz w:val="19"/>
                 <w:lang w:val="pt-BR"/>
               </w:rPr>
-              <w:t>Boxplot pareado ou gráfico de pontos conectados (before/after)</w:t>
+              <w:t>Boxplot</w:t>
+            </w:r>
+            <w:proofErr w:type="spellEnd"/>
+            <w:r>
+              <w:rPr>
+                <w:sz w:val="19"/>
+                <w:lang w:val="pt-BR"/>
+              </w:rPr>
+              <w:t xml:space="preserve"> pareado ou gráfico de pontos conectados (</w:t>
+            </w:r>
+            <w:proofErr w:type="spellStart"/>
+            <w:r>
+              <w:rPr>
+                <w:sz w:val="19"/>
+                <w:lang w:val="pt-BR"/>
+              </w:rPr>
+              <w:t>before</w:t>
+            </w:r>
+            <w:proofErr w:type="spellEnd"/>
+            <w:r>
+              <w:rPr>
+                <w:sz w:val="19"/>
+                <w:lang w:val="pt-BR"/>
+              </w:rPr>
+              <w:t>/</w:t>
+            </w:r>
+            <w:proofErr w:type="spellStart"/>
+            <w:r>
+              <w:rPr>
+                <w:sz w:val="19"/>
+                <w:lang w:val="pt-BR"/>
+              </w:rPr>
+              <w:t>after</w:t>
+            </w:r>
+            <w:proofErr w:type="spellEnd"/>
+            <w:r>
+              <w:rPr>
+                <w:sz w:val="19"/>
+                <w:lang w:val="pt-BR"/>
+              </w:rPr>
+              <w:t>)</w:t>
             </w:r>
           </w:p>
         </w:tc>
@@ -2168,11 +1956,33 @@
             <w:tcW w:w="4703" w:type="dxa"/>
           </w:tcPr>
           <w:p>
+            <w:proofErr w:type="spellStart"/>
             <w:r>
               <w:rPr>
                 <w:sz w:val="19"/>
               </w:rPr>
-              <w:t>Histograma ou boxplot</w:t>
+              <w:t>Histograma</w:t>
+            </w:r>
+            <w:proofErr w:type="spellEnd"/>
+            <w:r>
+              <w:rPr>
+                <w:sz w:val="19"/>
+              </w:rPr>
+              <w:t xml:space="preserve"> </w:t>
+            </w:r>
+            <w:proofErr w:type="spellStart"/>
+            <w:r>
+              <w:rPr>
+                <w:sz w:val="19"/>
+              </w:rPr>
+              <w:t>ou</w:t>
+            </w:r>
+            <w:proofErr w:type="spellEnd"/>
+            <w:r>
+              <w:rPr>
+                <w:sz w:val="19"/>
+              </w:rPr>
+              <w:t xml:space="preserve"> boxplot</w:t>
             </w:r>
           </w:p>
         </w:tc>
@@ -2212,7 +2022,39 @@
                 <w:sz w:val="19"/>
                 <w:lang w:val="pt-BR"/>
               </w:rPr>
-              <w:t>Gráfico de dispersão (scatter plot)</w:t>
+              <w:t>Gráfico de dispersão (</w:t>
+            </w:r>
+            <w:proofErr w:type="spellStart"/>
+            <w:r>
+              <w:rPr>
+                <w:sz w:val="19"/>
+                <w:lang w:val="pt-BR"/>
+              </w:rPr>
+              <w:t>scatter</w:t>
+            </w:r>
+            <w:proofErr w:type="spellEnd"/>
+            <w:r>
+              <w:rPr>
+                <w:sz w:val="19"/>
+                <w:lang w:val="pt-BR"/>
+              </w:rPr>
+              <w:t xml:space="preserve"> </w:t>
+            </w:r>
+            <w:proofErr w:type="spellStart"/>
+            <w:r>
+              <w:rPr>
+                <w:sz w:val="19"/>
+                <w:lang w:val="pt-BR"/>
+              </w:rPr>
+              <w:t>plot</w:t>
+            </w:r>
+            <w:proofErr w:type="spellEnd"/>
+            <w:r>
+              <w:rPr>
+                <w:sz w:val="19"/>
+                <w:lang w:val="pt-BR"/>
+              </w:rPr>
+              <w:t>)</w:t>
             </w:r>
           </w:p>
         </w:tc>
@@ -2233,7 +2075,23 @@
                 <w:sz w:val="19"/>
                 <w:lang w:val="pt-BR"/>
               </w:rPr>
-              <w:t>Evolução ao longo do tempo (ex.: cycle time por sprint)</w:t>
+              <w:t xml:space="preserve">Evolução ao longo do tempo (ex.: </w:t>
+            </w:r>
+            <w:proofErr w:type="spellStart"/>
+            <w:r>
+              <w:rPr>
+                <w:sz w:val="19"/>
+                <w:lang w:val="pt-BR"/>
+              </w:rPr>
+              <w:t>cycle</w:t>
+            </w:r>
+            <w:proofErr w:type="spellEnd"/>
+            <w:r>
+              <w:rPr>
+                <w:sz w:val="19"/>
+                <w:lang w:val="pt-BR"/>
+              </w:rPr>
+              <w:t xml:space="preserve"> time por sprint)</w:t>
             </w:r>
           </w:p>
         </w:tc>
@@ -2273,7 +2131,55 @@
                 <w:sz w:val="19"/>
                 <w:lang w:val="pt-BR"/>
               </w:rPr>
-              <w:t>Composição/fluxo do Kanban ao longo do tempo (Cumulative Flow Diagram)</w:t>
+              <w:t xml:space="preserve">Composição/fluxo do </w:t>
+            </w:r>
+            <w:proofErr w:type="spellStart"/>
+            <w:r>
+              <w:rPr>
+                <w:sz w:val="19"/>
+                <w:lang w:val="pt-BR"/>
+              </w:rPr>
+              <w:t>Kanban</w:t>
+            </w:r>
+            <w:proofErr w:type="spellEnd"/>
+            <w:r>
+              <w:rPr>
+                <w:sz w:val="19"/>
+                <w:lang w:val="pt-BR"/>
+              </w:rPr>
+              <w:t xml:space="preserve"> ao longo do tempo (</w:t>
+            </w:r>
+            <w:proofErr w:type="spellStart"/>
+            <w:r>
+              <w:rPr>
+                <w:sz w:val="19"/>
+                <w:lang w:val="pt-BR"/>
+              </w:rPr>
+              <w:t>Cumulative</w:t>
+            </w:r>
+            <w:proofErr w:type="spellEnd"/>
+            <w:r>
+              <w:rPr>
+                <w:sz w:val="19"/>
+                <w:lang w:val="pt-BR"/>
+              </w:rPr>
+              <w:t xml:space="preserve"> Flow </w:t>
+            </w:r>
+            <w:proofErr w:type="spellStart"/>
+            <w:r>
+              <w:rPr>
+                <w:sz w:val="19"/>
+                <w:lang w:val="pt-BR"/>
+              </w:rPr>
+              <w:t>Diagram</w:t>
+            </w:r>
+            <w:proofErr w:type="spellEnd"/>
+            <w:r>
+              <w:rPr>
+                <w:sz w:val="19"/>
+                <w:lang w:val="pt-BR"/>
+              </w:rPr>
+              <w:t>)</w:t>
             </w:r>
           </w:p>
         </w:tc>
@@ -2313,7 +2219,23 @@
                 <w:sz w:val="19"/>
                 <w:lang w:val="pt-BR"/>
               </w:rPr>
-              <w:t>Proporção de categorias (ex.: % de issues fechadas)</w:t>
+              <w:t xml:space="preserve">Proporção de categorias (ex.: % de </w:t>
+            </w:r>
+            <w:proofErr w:type="spellStart"/>
+            <w:r>
+              <w:rPr>
+                <w:sz w:val="19"/>
+                <w:lang w:val="pt-BR"/>
+              </w:rPr>
+              <w:t>issues</w:t>
+            </w:r>
+            <w:proofErr w:type="spellEnd"/>
+            <w:r>
+              <w:rPr>
+                <w:sz w:val="19"/>
+                <w:lang w:val="pt-BR"/>
+              </w:rPr>
+              <w:t xml:space="preserve"> fechadas)</w:t>
             </w:r>
           </w:p>
         </w:tc>
@@ -2354,10 +2276,375 @@
       </w:pPr>
       <w:r>
         <w:rPr>
+          <w:i w:val="0"/>
           <w:color w:val="000000"/>
-          <w:lang w:val="pt-BR"/>
+          <w:sz w:val="22"/>
         </w:rPr>
-        <w:t>[PENDENTE — Issue #10] Inserir aqui os gráficos (um por RQ + bônus), cada um precedido da pergunta correspondente, com eixos nomeados e medianas/valores-chave explicitados no texto. Responsáveis: Gabriel Tavares (Tavaresds1) e Gabriel Santiago (gabsant07).</w:t>
+        <w:t>A seguir, um gráfico por RQ (mais o comparativo do bônus RQ07), gerados por scripts/gerar_graficos_rqs.py a partir de data/top_1000_repos.csv, com a mediana destacada em cada distribuição.</w:t>
+      </w:r>
+    </w:p>
+    <w:p>
+      <w:r>
+        <w:rPr>
+          <w:b/>
+        </w:rPr>
+        <w:t>RQ01 — Sistemas populares são maduros/antigos?</w:t>
+      </w:r>
+    </w:p>
+    <w:p>
+      <w:r>
+        <w:drawing>
+          <wp:inline xmlns:a="http://schemas.openxmlformats.org/drawingml/2006/main" xmlns:pic="http://schemas.openxmlformats.org/drawingml/2006/picture">
+            <wp:extent cx="5303520" cy="2202816"/>
+            <wp:docPr id="1" name="Picture 1"/>
+            <wp:cNvGraphicFramePr>
+              <a:graphicFrameLocks noChangeAspect="1"/>
+            </wp:cNvGraphicFramePr>
+            <a:graphic>
+              <a:graphicData uri="http://schemas.openxmlformats.org/drawingml/2006/picture">
+                <pic:pic>
+                  <pic:nvPicPr>
+                    <pic:cNvPr id="0" name="rq01_idade.png"/>
+                    <pic:cNvPicPr/>
+                  </pic:nvPicPr>
+                  <pic:blipFill>
+                    <a:blip r:embed="rId8"/>
+                    <a:stretch>
+                      <a:fillRect/>
+                    </a:stretch>
+                  </pic:blipFill>
+                  <pic:spPr>
+                    <a:xfrm>
+                      <a:off x="0" y="0"/>
+                      <a:ext cx="5303520" cy="2202816"/>
+                    </a:xfrm>
+                    <a:prstGeom prst="rect"/>
+                  </pic:spPr>
+                </pic:pic>
+              </a:graphicData>
+            </a:graphic>
+          </wp:inline>
+        </w:drawing>
+      </w:r>
+    </w:p>
+    <w:p>
+      <w:r>
+        <w:rPr>
+          <w:i/>
+        </w:rPr>
+        <w:t>Mediana: 2.825 dias (~7,7 anos).</w:t>
+      </w:r>
+    </w:p>
+    <w:p>
+      <w:r>
+        <w:rPr>
+          <w:b/>
+        </w:rPr>
+        <w:t>RQ02 — Sistemas populares recebem muita contribuição externa?</w:t>
+      </w:r>
+    </w:p>
+    <w:p>
+      <w:r>
+        <w:drawing>
+          <wp:inline xmlns:a="http://schemas.openxmlformats.org/drawingml/2006/main" xmlns:pic="http://schemas.openxmlformats.org/drawingml/2006/picture">
+            <wp:extent cx="5303520" cy="2204060"/>
+            <wp:docPr id="2" name="Picture 2"/>
+            <wp:cNvGraphicFramePr>
+              <a:graphicFrameLocks noChangeAspect="1"/>
+            </wp:cNvGraphicFramePr>
+            <a:graphic>
+              <a:graphicData uri="http://schemas.openxmlformats.org/drawingml/2006/picture">
+                <pic:pic>
+                  <pic:nvPicPr>
+                    <pic:cNvPr id="0" name="rq02_prs_merged.png"/>
+                    <pic:cNvPicPr/>
+                  </pic:nvPicPr>
+                  <pic:blipFill>
+                    <a:blip r:embed="rId9"/>
+                    <a:stretch>
+                      <a:fillRect/>
+                    </a:stretch>
+                  </pic:blipFill>
+                  <pic:spPr>
+                    <a:xfrm>
+                      <a:off x="0" y="0"/>
+                      <a:ext cx="5303520" cy="2204060"/>
+                    </a:xfrm>
+                    <a:prstGeom prst="rect"/>
+                  </pic:spPr>
+                </pic:pic>
+              </a:graphicData>
+            </a:graphic>
+          </wp:inline>
+        </w:drawing>
+      </w:r>
+    </w:p>
+    <w:p>
+      <w:r>
+        <w:rPr>
+          <w:i/>
+        </w:rPr>
+        <w:t>Mediana: 768 PRs merged.</w:t>
+      </w:r>
+    </w:p>
+    <w:p>
+      <w:r>
+        <w:rPr>
+          <w:b/>
+        </w:rPr>
+        <w:t>RQ03 — Sistemas populares lançam releases com frequência?</w:t>
+      </w:r>
+    </w:p>
+    <w:p>
+      <w:r>
+        <w:drawing>
+          <wp:inline xmlns:a="http://schemas.openxmlformats.org/drawingml/2006/main" xmlns:pic="http://schemas.openxmlformats.org/drawingml/2006/picture">
+            <wp:extent cx="5303520" cy="2204060"/>
+            <wp:docPr id="3" name="Picture 3"/>
+            <wp:cNvGraphicFramePr>
+              <a:graphicFrameLocks noChangeAspect="1"/>
+            </wp:cNvGraphicFramePr>
+            <a:graphic>
+              <a:graphicData uri="http://schemas.openxmlformats.org/drawingml/2006/picture">
+                <pic:pic>
+                  <pic:nvPicPr>
+                    <pic:cNvPr id="0" name="rq03_releases.png"/>
+                    <pic:cNvPicPr/>
+                  </pic:nvPicPr>
+                  <pic:blipFill>
+                    <a:blip r:embed="rId10"/>
+                    <a:stretch>
+                      <a:fillRect/>
+                    </a:stretch>
+                  </pic:blipFill>
+                  <pic:spPr>
+                    <a:xfrm>
+                      <a:off x="0" y="0"/>
+                      <a:ext cx="5303520" cy="2204060"/>
+                    </a:xfrm>
+                    <a:prstGeom prst="rect"/>
+                  </pic:spPr>
+                </pic:pic>
+              </a:graphicData>
+            </a:graphic>
+          </wp:inline>
+        </w:drawing>
+      </w:r>
+    </w:p>
+    <w:p>
+      <w:r>
+        <w:rPr>
+          <w:i/>
+        </w:rPr>
+        <w:t>Mediana: 40 releases; 28% dos repositórios sem nenhuma release.</w:t>
+      </w:r>
+    </w:p>
+    <w:p>
+      <w:r>
+        <w:rPr>
+          <w:b/>
+        </w:rPr>
+        <w:t>RQ04 — Sistemas populares são atualizados com frequência?</w:t>
+      </w:r>
+    </w:p>
+    <w:p>
+      <w:r>
+        <w:drawing>
+          <wp:inline xmlns:a="http://schemas.openxmlformats.org/drawingml/2006/main" xmlns:pic="http://schemas.openxmlformats.org/drawingml/2006/picture">
+            <wp:extent cx="5303520" cy="2204060"/>
+            <wp:docPr id="4" name="Picture 4"/>
+            <wp:cNvGraphicFramePr>
+              <a:graphicFrameLocks noChangeAspect="1"/>
+            </wp:cNvGraphicFramePr>
+            <a:graphic>
+              <a:graphicData uri="http://schemas.openxmlformats.org/drawingml/2006/picture">
+                <pic:pic>
+                  <pic:nvPicPr>
+                    <pic:cNvPr id="0" name="rq04_dias_desde_push.png"/>
+                    <pic:cNvPicPr/>
+                  </pic:nvPicPr>
+                  <pic:blipFill>
+                    <a:blip r:embed="rId11"/>
+                    <a:stretch>
+                      <a:fillRect/>
+                    </a:stretch>
+                  </pic:blipFill>
+                  <pic:spPr>
+                    <a:xfrm>
+                      <a:off x="0" y="0"/>
+                      <a:ext cx="5303520" cy="2204060"/>
+                    </a:xfrm>
+                    <a:prstGeom prst="rect"/>
+                  </pic:spPr>
+                </pic:pic>
+              </a:graphicData>
+            </a:graphic>
+          </wp:inline>
+        </w:drawing>
+      </w:r>
+    </w:p>
+    <w:p>
+      <w:r>
+        <w:rPr>
+          <w:i/>
+        </w:rPr>
+        <w:t>Mediana: 1,2 dia desde o último push.</w:t>
+      </w:r>
+    </w:p>
+    <w:p>
+      <w:r>
+        <w:rPr>
+          <w:b/>
+        </w:rPr>
+        <w:t>RQ05 — Sistemas populares são escritos nas linguagens mais populares?</w:t>
+      </w:r>
+    </w:p>
+    <w:p>
+      <w:r>
+        <w:drawing>
+          <wp:inline xmlns:a="http://schemas.openxmlformats.org/drawingml/2006/main" xmlns:pic="http://schemas.openxmlformats.org/drawingml/2006/picture">
+            <wp:extent cx="5303520" cy="2366351"/>
+            <wp:docPr id="5" name="Picture 5"/>
+            <wp:cNvGraphicFramePr>
+              <a:graphicFrameLocks noChangeAspect="1"/>
+            </wp:cNvGraphicFramePr>
+            <a:graphic>
+              <a:graphicData uri="http://schemas.openxmlformats.org/drawingml/2006/picture">
+                <pic:pic>
+                  <pic:nvPicPr>
+                    <pic:cNvPr id="0" name="rq05_linguagens.png"/>
+                    <pic:cNvPicPr/>
+                  </pic:nvPicPr>
+                  <pic:blipFill>
+                    <a:blip r:embed="rId12"/>
+                    <a:stretch>
+                      <a:fillRect/>
+                    </a:stretch>
+                  </pic:blipFill>
+                  <pic:spPr>
+                    <a:xfrm>
+                      <a:off x="0" y="0"/>
+                      <a:ext cx="5303520" cy="2366351"/>
+                    </a:xfrm>
+                    <a:prstGeom prst="rect"/>
+                  </pic:spPr>
+                </pic:pic>
+              </a:graphicData>
+            </a:graphic>
+          </wp:inline>
+        </w:drawing>
+      </w:r>
+    </w:p>
+    <w:p>
+      <w:r>
+        <w:rPr>
+          <w:i/>
+        </w:rPr>
+        <w:t>62,0% em linguagens TIOBE top 20; 29,3% fora do TIOBE; 8,7% sem linguagem primária.</w:t>
+      </w:r>
+    </w:p>
+    <w:p>
+      <w:r>
+        <w:rPr>
+          <w:b/>
+        </w:rPr>
+        <w:t>RQ06 — Sistemas populares possuem um alto percentual de issues fechadas?</w:t>
+      </w:r>
+    </w:p>
+    <w:p>
+      <w:r>
+        <w:drawing>
+          <wp:inline xmlns:a="http://schemas.openxmlformats.org/drawingml/2006/main" xmlns:pic="http://schemas.openxmlformats.org/drawingml/2006/picture">
+            <wp:extent cx="5303520" cy="2204060"/>
+            <wp:docPr id="6" name="Picture 6"/>
+            <wp:cNvGraphicFramePr>
+              <a:graphicFrameLocks noChangeAspect="1"/>
+            </wp:cNvGraphicFramePr>
+            <a:graphic>
+              <a:graphicData uri="http://schemas.openxmlformats.org/drawingml/2006/picture">
+                <pic:pic>
+                  <pic:nvPicPr>
+                    <pic:cNvPr id="0" name="rq06_issues_fechadas.png"/>
+                    <pic:cNvPicPr/>
+                  </pic:nvPicPr>
+                  <pic:blipFill>
+                    <a:blip r:embed="rId13"/>
+                    <a:stretch>
+                      <a:fillRect/>
+                    </a:stretch>
+                  </pic:blipFill>
+                  <pic:spPr>
+                    <a:xfrm>
+                      <a:off x="0" y="0"/>
+                      <a:ext cx="5303520" cy="2204060"/>
+                    </a:xfrm>
+                    <a:prstGeom prst="rect"/>
+                  </pic:spPr>
+                </pic:pic>
+              </a:graphicData>
+            </a:graphic>
+          </wp:inline>
+        </w:drawing>
+      </w:r>
+    </w:p>
+    <w:p>
+      <w:r>
+        <w:rPr>
+          <w:i/>
+        </w:rPr>
+        <w:t>Mediana: 87,5% de issues fechadas.</w:t>
+      </w:r>
+    </w:p>
+    <w:p>
+      <w:r>
+        <w:rPr>
+          <w:b/>
+        </w:rPr>
+        <w:t>RQ07 (bônus) — Linguagens TIOBE recebem mais contribuição, lançam mais releases e são atualizadas com mais frequência?</w:t>
+      </w:r>
+    </w:p>
+    <w:p>
+      <w:r>
+        <w:drawing>
+          <wp:inline xmlns:a="http://schemas.openxmlformats.org/drawingml/2006/main" xmlns:pic="http://schemas.openxmlformats.org/drawingml/2006/picture">
+            <wp:extent cx="5303520" cy="1973715"/>
+            <wp:docPr id="7" name="Picture 7"/>
+            <wp:cNvGraphicFramePr>
+              <a:graphicFrameLocks noChangeAspect="1"/>
+            </wp:cNvGraphicFramePr>
+            <a:graphic>
+              <a:graphicData uri="http://schemas.openxmlformats.org/drawingml/2006/picture">
+                <pic:pic>
+                  <pic:nvPicPr>
+                    <pic:cNvPr id="0" name="rq07_tiobe_vs_nao_tiobe.png"/>
+                    <pic:cNvPicPr/>
+                  </pic:nvPicPr>
+                  <pic:blipFill>
+                    <a:blip r:embed="rId14"/>
+                    <a:stretch>
+                      <a:fillRect/>
+                    </a:stretch>
+                  </pic:blipFill>
+                  <pic:spPr>
+                    <a:xfrm>
+                      <a:off x="0" y="0"/>
+                      <a:ext cx="5303520" cy="1973715"/>
+                    </a:xfrm>
+                    <a:prstGeom prst="rect"/>
+                  </pic:spPr>
+                </pic:pic>
+              </a:graphicData>
+            </a:graphic>
+          </wp:inline>
+        </w:drawing>
+      </w:r>
+    </w:p>
+    <w:p>
+      <w:r>
+        <w:rPr>
+          <w:i/>
+        </w:rPr>
+        <w:t>Medianas TIOBE vs. Não TIOBE: PRs merged 865 vs. 1.000; releases 51 vs. 51; dias desde push 0,6 vs. 0,3 — diferenças pequenas entre os grupos.</w:t>
       </w:r>
     </w:p>
     <w:p>
@@ -2372,6 +2659,137 @@
           <w:lang w:val="pt-BR"/>
         </w:rPr>
         <w:t>4.3 Discussão</w:t>
+      </w:r>
+    </w:p>
+    <w:p>
+      <w:pPr>
+        <w:spacing w:after="200"/>
+        <w:ind w:left="198"/>
+        <w:rPr>
+          <w:i/>
+          <w:color w:val="595959"/>
+          <w:sz w:val="21"/>
+          <w:lang w:val="pt-BR"/>
+        </w:rPr>
+      </w:pPr>
+      <w:r>
+        <w:rPr>
+          <w:b/>
+          <w:i/>
+          <w:color w:val="1F6E63"/>
+          <w:sz w:val="21"/>
+          <w:lang w:val="pt-BR"/>
+        </w:rPr>
+        <w:t xml:space="preserve">ORIENTAÇÃO: </w:t>
+      </w:r>
+      <w:r>
+        <w:rPr>
+          <w:i/>
+          <w:color w:val="595959"/>
+          <w:sz w:val="21"/>
+          <w:lang w:val="pt-BR"/>
+        </w:rPr>
+        <w:t xml:space="preserve">Para cada RQ (do enunciado e das </w:t>
+      </w:r>
+      <w:proofErr w:type="spellStart"/>
+      <w:r>
+        <w:rPr>
+          <w:i/>
+          <w:color w:val="595959"/>
+          <w:sz w:val="21"/>
+          <w:lang w:val="pt-BR"/>
+        </w:rPr>
+        <w:t>RQs</w:t>
+      </w:r>
+      <w:proofErr w:type="spellEnd"/>
+      <w:r>
+        <w:rPr>
+          <w:i/>
+          <w:color w:val="595959"/>
+          <w:sz w:val="21"/>
+          <w:lang w:val="pt-BR"/>
+        </w:rPr>
+        <w:t xml:space="preserve"> de inovação do grupo), compare explicitamente a hipótese informal levantada na Introdução com o resultado efetivamente obtido — hipótese confirmada, refutada, ou parcialmente confirmada, e por quê. Quando houver teste estatístico (ex.: </w:t>
+      </w:r>
+      <w:proofErr w:type="spellStart"/>
+      <w:r>
+        <w:rPr>
+          <w:i/>
+          <w:color w:val="595959"/>
+          <w:sz w:val="21"/>
+          <w:lang w:val="pt-BR"/>
+        </w:rPr>
+        <w:t>Wilcoxon</w:t>
+      </w:r>
+      <w:proofErr w:type="spellEnd"/>
+      <w:r>
+        <w:rPr>
+          <w:i/>
+          <w:color w:val="595959"/>
+          <w:sz w:val="21"/>
+          <w:lang w:val="pt-BR"/>
+        </w:rPr>
+        <w:t xml:space="preserve"> no Lab02), reporte o valor obtido e interprete o que ele significa em linguagem acessível, não apenas o número bruto. Discuta as ameaças à validade específicas do laboratório (ex.: efeito de aprendizado entre </w:t>
+      </w:r>
+      <w:proofErr w:type="spellStart"/>
+      <w:r>
+        <w:rPr>
+          <w:i/>
+          <w:color w:val="595959"/>
+          <w:sz w:val="21"/>
+          <w:lang w:val="pt-BR"/>
+        </w:rPr>
+        <w:t>katas</w:t>
+      </w:r>
+      <w:proofErr w:type="spellEnd"/>
+      <w:r>
+        <w:rPr>
+          <w:i/>
+          <w:color w:val="595959"/>
+          <w:sz w:val="21"/>
+          <w:lang w:val="pt-BR"/>
+        </w:rPr>
+        <w:t xml:space="preserve"> e risco de memorização pela IA — Lab02; diferença de dificuldade entre laboratórios distintos confundindo a tendência de </w:t>
+      </w:r>
+      <w:proofErr w:type="spellStart"/>
+      <w:r>
+        <w:rPr>
+          <w:i/>
+          <w:color w:val="595959"/>
+          <w:sz w:val="21"/>
+          <w:lang w:val="pt-BR"/>
+        </w:rPr>
+        <w:t>cycle</w:t>
+      </w:r>
+      <w:proofErr w:type="spellEnd"/>
+      <w:r>
+        <w:rPr>
+          <w:i/>
+          <w:color w:val="595959"/>
+          <w:sz w:val="21"/>
+          <w:lang w:val="pt-BR"/>
+        </w:rPr>
+        <w:t xml:space="preserve"> time — Lab05; lacunas nos snapshots do </w:t>
+      </w:r>
+      <w:proofErr w:type="spellStart"/>
+      <w:r>
+        <w:rPr>
+          <w:i/>
+          <w:color w:val="595959"/>
+          <w:sz w:val="21"/>
+          <w:lang w:val="pt-BR"/>
+        </w:rPr>
+        <w:t>Kanban</w:t>
+      </w:r>
+      <w:proofErr w:type="spellEnd"/>
+      <w:r>
+        <w:rPr>
+          <w:i/>
+          <w:color w:val="595959"/>
+          <w:sz w:val="21"/>
+          <w:lang w:val="pt-BR"/>
+        </w:rPr>
+        <w:t xml:space="preserve"> — Lab05). Finalize relacionando o que as inovações do grupo (seção 3.6) acrescentaram: elas confirmaram, contradisseram ou aprofundaram o que os 70% do enunciado já mostravam?</w:t>
       </w:r>
     </w:p>
     <w:p>
@@ -2449,7 +2867,18 @@
           <w:szCs w:val="8"/>
           <w:lang w:val="pt-BR"/>
         </w:rPr>
-        <w:t>em referências https://www.youtube.com/shorts/YwnaeO95AN8</w:t>
+        <w:t xml:space="preserve">em referências </w:t>
+      </w:r>
+      <w:r>
+        <w:rPr>
+          <w:b/>
+          <w:i/>
+          <w:color w:val="FFFFFF" w:themeColor="background1"/>
+          <w:sz w:val="6"/>
+          <w:szCs w:val="8"/>
+          <w:lang w:val="pt-BR"/>
+        </w:rPr>
+        <w:t>https://www.youtube.com/shorts/YwnaeO95AN8</w:t>
       </w:r>
       <w:r>
         <w:rPr>
@@ -2472,95 +2901,29 @@
       </w:pPr>
       <w:r>
         <w:rPr>
+          <w:i w:val="0"/>
           <w:color w:val="000000"/>
-          <w:lang w:val="pt-BR"/>
+          <w:sz w:val="22"/>
         </w:rPr>
-        <w:t>Discussão preliminar hipótese × evidência descritiva (medianas). A discussão completa com visualizações e eventuais testes deve ser consolidada após a Issue #10.</w:t>
-      </w:r>
-      <w:r>
-        <w:rPr>
-          <w:color w:val="000000"/>
-          <w:lang w:val="pt-BR"/>
-        </w:rPr>
+        <w:t>Discussão hipótese × evidência descritiva (medianas), com apoio das visualizações da seção 4.2.</w:t>
         <w:br/>
-      </w:r>
-      <w:r>
-        <w:rPr>
-          <w:color w:val="000000"/>
-          <w:lang w:val="pt-BR"/>
-        </w:rPr>
         <w:br/>
-        <w:t>RQ01 — Hipótese confirmada preliminarmente: mediana ~7,8 anos indica maturidade elevada.</w:t>
-      </w:r>
-      <w:r>
-        <w:rPr>
-          <w:color w:val="000000"/>
-          <w:lang w:val="pt-BR"/>
-        </w:rPr>
+        <w:t>RQ01 — Hipótese confirmada: mediana ~7,7 anos indica maturidade elevada.</w:t>
         <w:br/>
         <w:t>RQ02 — Hipótese parcialmente confirmada: mediana 768 PRs merged é alta, mas a média muito superior evidencia assimetria (cauda longa).</w:t>
-      </w:r>
-      <w:r>
-        <w:rPr>
-          <w:color w:val="000000"/>
-          <w:lang w:val="pt-BR"/>
-        </w:rPr>
         <w:br/>
         <w:t>RQ03 — Hipótese parcialmente confirmada: há mediana &gt; 0 (40), porém 28% sem releases — compatível com mistura de software versionado e curadoria.</w:t>
-      </w:r>
-      <w:r>
-        <w:rPr>
-          <w:color w:val="000000"/>
-          <w:lang w:val="pt-BR"/>
-        </w:rPr>
         <w:br/>
-        <w:t>RQ04 — Hipótese confirmada preliminarmente: mediana de 6 dias desde o último push indica atualização frequente no topo de popularidade.</w:t>
-      </w:r>
-      <w:r>
-        <w:rPr>
-          <w:color w:val="000000"/>
-          <w:lang w:val="pt-BR"/>
-        </w:rPr>
+        <w:t>RQ04 — Hipótese confirmada: mediana de apenas ~1,2 dia desde o último push indica atualização praticamente diária nos repositórios mais populares.</w:t>
         <w:br/>
         <w:t>RQ05 — Hipótese parcialmente confirmada: maioria (entre os com linguagem) no TIOBE, mas TypeScript/Markdown/null mostram que popularidade ≠ apenas top TIOBE.</w:t>
-      </w:r>
-      <w:r>
-        <w:rPr>
-          <w:color w:val="000000"/>
-          <w:lang w:val="pt-BR"/>
-        </w:rPr>
         <w:br/>
-        <w:t>RQ06 — Hipótese confirmada preliminarmente: mediana 87,5% de issues fechadas.</w:t>
-      </w:r>
-      <w:r>
-        <w:rPr>
-          <w:color w:val="000000"/>
-          <w:lang w:val="pt-BR"/>
-        </w:rPr>
+        <w:t>RQ06 — Hipótese confirmada: mediana 87,5% de issues fechadas.</w:t>
         <w:br/>
-        <w:t>RQ07 — Aguardando cruzamentos por linguagem da Issue #10 para confirmar/refutar a hipótese mista.</w:t>
-      </w:r>
-      <w:r>
-        <w:rPr>
-          <w:color w:val="000000"/>
-          <w:lang w:val="pt-BR"/>
-        </w:rPr>
+        <w:t>RQ07 — Hipótese não confirmada: as medianas de PRs merged, releases e dias desde push são muito próximas entre repositórios TIOBE e Não TIOBE (865 vs. 1.000 PRs; 51 vs. 51 releases; 0,6 vs. 0,3 dias), indicando que a linguagem primária não é um fator discriminante relevante para essas métricas nesta amostra.</w:t>
         <w:br/>
-      </w:r>
-      <w:r>
-        <w:rPr>
-          <w:color w:val="000000"/>
-          <w:lang w:val="pt-BR"/>
-        </w:rPr>
         <w:br/>
-      </w:r>
-      <w:r>
-        <w:rPr>
-          <w:color w:val="000000"/>
-          <w:lang w:val="pt-BR"/>
-        </w:rPr>
-        <w:lastRenderedPageBreak/>
-        <w:t>Ameaça à validade: Search API ordena por estrelas e pode omitir/alterar ranking ao longo do tempo; primaryLanguage nulo e repos sem issues afetam RQ05/RQ06; PRs merged medem contribuição aceita, não necessariamente “externa” no sentido estrito (contribuições de maintainers também entram).</w:t>
+        <w:t>Ameaça à validade: Search API ordena por estrelas e pode omitir/alterar ranking ao longo do tempo; primaryLanguage nulo e repos sem issues afetam RQ05/RQ06; PRs merged medem contribuição aceita, não necessariamente “externa” no sentido estrito (contribuições de maintainers também entram); a comparação da RQ07 é feita por medianas descritivas, sem teste estatístico formal.</w:t>
       </w:r>
     </w:p>
     <w:p>
@@ -2574,7 +2937,56 @@
         <w:rPr>
           <w:lang w:val="pt-BR"/>
         </w:rPr>
+        <w:lastRenderedPageBreak/>
         <w:t>5. Conclusão</w:t>
+      </w:r>
+    </w:p>
+    <w:p>
+      <w:pPr>
+        <w:spacing w:after="200"/>
+        <w:ind w:left="198"/>
+        <w:rPr>
+          <w:lang w:val="pt-BR"/>
+        </w:rPr>
+      </w:pPr>
+      <w:r>
+        <w:rPr>
+          <w:b/>
+          <w:i/>
+          <w:color w:val="1F6E63"/>
+          <w:sz w:val="21"/>
+          <w:lang w:val="pt-BR"/>
+        </w:rPr>
+        <w:t xml:space="preserve">ORIENTAÇÃO: </w:t>
+      </w:r>
+      <w:r>
+        <w:rPr>
+          <w:i/>
+          <w:color w:val="595959"/>
+          <w:sz w:val="21"/>
+          <w:lang w:val="pt-BR"/>
+        </w:rPr>
+        <w:t xml:space="preserve">Sintetize, em poucos parágrafos, as respostas a todas as </w:t>
+      </w:r>
+      <w:proofErr w:type="spellStart"/>
+      <w:r>
+        <w:rPr>
+          <w:i/>
+          <w:color w:val="595959"/>
+          <w:sz w:val="21"/>
+          <w:lang w:val="pt-BR"/>
+        </w:rPr>
+        <w:t>RQs</w:t>
+      </w:r>
+      <w:proofErr w:type="spellEnd"/>
+      <w:r>
+        <w:rPr>
+          <w:i/>
+          <w:color w:val="595959"/>
+          <w:sz w:val="21"/>
+          <w:lang w:val="pt-BR"/>
+        </w:rPr>
+        <w:t xml:space="preserve"> (enunciado + inovação do grupo), sem repetir números já discutidos em detalhe — o objetivo aqui é a mensagem final, não os dados brutos. Aponte as principais limitações do estudo (tamanho de amostra, ameaças à validade não mitigadas, período de coleta). Quando o enunciado pedir explicitamente uma postura de consultoria (caso do Lab05, que pede recomendações de melhoria de processo “como se o grupo fosse consultoria para um time real”), inclua recomendações objetivas e acionáveis, não genéricas. Encerre indicando o que o grupo faria diferente com mais tempo ou recursos, e quais das inovações propostas (30%) valeriam a pena expandir em um trabalho futuro.</w:t>
       </w:r>
     </w:p>
     <w:p>
@@ -2589,55 +3001,20 @@
       </w:pPr>
       <w:r>
         <w:rPr>
+          <w:i w:val="0"/>
           <w:color w:val="000000"/>
-          <w:lang w:val="pt-BR"/>
+          <w:sz w:val="22"/>
         </w:rPr>
         <w:t>O Lab01 permitiu caracterizar, de forma exploratória, o perfil dos 1.000 repositórios mais estrelados do GitHub e institucionalizar o Kanban do grupo (colunas Backlog→Done, WIP=2, Issues com Assignee e commits referenciando #N).</w:t>
-      </w:r>
-      <w:r>
-        <w:rPr>
-          <w:color w:val="000000"/>
-          <w:lang w:val="pt-BR"/>
-        </w:rPr>
         <w:br/>
-      </w:r>
-      <w:r>
-        <w:rPr>
-          <w:color w:val="000000"/>
-          <w:lang w:val="pt-BR"/>
-        </w:rPr>
         <w:br/>
-        <w:t>Em síntese descritiva: os sistemas populares tendem a ser maduros e atualizados com frequência, com razão alta de issues fechadas e contribuição via PRs assimétrica; a relação com linguagens TIOBE é parcial; releases variam bastante.</w:t>
-      </w:r>
-      <w:r>
-        <w:rPr>
-          <w:color w:val="000000"/>
-          <w:lang w:val="pt-BR"/>
-        </w:rPr>
+        <w:t>Em síntese descritiva: os sistemas populares tendem a ser maduros e atualizados com frequência, com razão alta de issues fechadas e contribuição via PRs assimétrica; a relação com linguagens TIOBE é parcial na composição (RQ05), mas não se traduz em diferenças relevantes de contribuição, releases ou atualização entre os grupos TIOBE e Não TIOBE (RQ07); releases variam bastante.</w:t>
         <w:br/>
-      </w:r>
-      <w:r>
-        <w:rPr>
-          <w:color w:val="000000"/>
-          <w:lang w:val="pt-BR"/>
-        </w:rPr>
         <w:br/>
-        <w:t>Limitações: dependência da Search API; métricas proxy (ex.: PRs merged ≠ contribuição externa pura); visualizações finais e aprofundamento estatístico pendentes da Issue #10; print do board deve ser anexado neste documento.</w:t>
-      </w:r>
-      <w:r>
-        <w:rPr>
-          <w:color w:val="000000"/>
-          <w:lang w:val="pt-BR"/>
-        </w:rPr>
+        <w:t>Limitações: dependência da Search API; métricas proxy (ex.: PRs merged ≠ contribuição externa pura); a comparação da RQ07 usa apenas medianas descritivas, sem teste estatístico formal; print do board deve ser anexado neste documento.</w:t>
         <w:br/>
-      </w:r>
-      <w:r>
-        <w:rPr>
-          <w:color w:val="000000"/>
-          <w:lang w:val="pt-BR"/>
-        </w:rPr>
         <w:br/>
-        <w:t>Com mais tempo, o grupo expandiria a RQ07 com testes por linguagem e automatizaria snapshots a cada fechamento de sprint no CI.</w:t>
+        <w:t>Com mais tempo, o grupo aplicaria testes estatísticos formais (ex.: Mann-Whitney) para validar as diferenças da RQ07 e automatizaria snapshots a cada fechamento de sprint no CI.</w:t>
       </w:r>
     </w:p>
     <w:p>
@@ -2705,60 +3082,23 @@
       </w:pPr>
     </w:p>
     <w:p>
-      <w:pPr>
-        <w:rPr>
-          <w:lang w:val="pt-BR"/>
-        </w:rPr>
-      </w:pPr>
       <w:r>
-        <w:rPr>
-          <w:lang w:val="pt-BR"/>
-        </w:rPr>
-        <w:t xml:space="preserve">Grupo Lab01 — repositório e board: </w:t>
-      </w:r>
-      <w:proofErr w:type="gramStart"/>
-      <w:r>
-        <w:rPr>
-          <w:lang w:val="pt-BR"/>
-        </w:rPr>
-        <w:t>https://github.com/Druitti/Laboratorio-de-Desenvolvimento-de-Software ;</w:t>
-      </w:r>
-      <w:proofErr w:type="gramEnd"/>
-      <w:r>
-        <w:rPr>
-          <w:lang w:val="pt-BR"/>
-        </w:rPr>
-        <w:t xml:space="preserve"> https://github.com/users/Druitti/projects/5</w:t>
+        <w:t>Grupo Lab01 — repositório e board: https://github.com/Druitti/Laboratorio-de-Desenvolvimento-de-Software ; https://github.com/users/Druitti/projects/5</w:t>
       </w:r>
     </w:p>
     <w:p>
       <w:pPr>
         <w:pStyle w:val="PargrafodaLista"/>
-        <w:rPr>
-          <w:lang w:val="pt-BR"/>
-        </w:rPr>
       </w:pPr>
       <w:r>
-        <w:t xml:space="preserve">TIOBE Software BV. TIOBE Index. </w:t>
-      </w:r>
-      <w:r>
-        <w:rPr>
-          <w:lang w:val="pt-BR"/>
-        </w:rPr>
-        <w:t>Disponível em: https://www.tiobe.com/tiobe-index/. Acesso em: 25 ago. 2026.</w:t>
+        <w:t>TIOBE Software BV. TIOBE Index. Disponível em: https://www.tiobe.com/tiobe-index/. Acesso em: 25 ago. 2026.</w:t>
       </w:r>
     </w:p>
     <w:p>
       <w:pPr>
         <w:pStyle w:val="PargrafodaLista"/>
-        <w:rPr>
-          <w:lang w:val="pt-BR"/>
-        </w:rPr>
       </w:pPr>
       <w:r>
-        <w:rPr>
-          <w:lang w:val="pt-BR"/>
-        </w:rPr>
         <w:t>GitHub. GraphQL API documentation. Disponível em: https://docs.github.com/en/graphql. Acesso em: 25 ago. 2026.</w:t>
       </w:r>
     </w:p>
@@ -2767,13 +3107,7 @@
         <w:pStyle w:val="PargrafodaLista"/>
       </w:pPr>
       <w:r>
-        <w:rPr>
-          <w:lang w:val="pt-BR"/>
-        </w:rPr>
-        <w:t xml:space="preserve">BASILI, Victor R.; CALDIERA, Gianluigi; ROMBACH, H. Dieter. </w:t>
-      </w:r>
-      <w:r>
-        <w:t>The Goal Question Metric Approach. 1994.</w:t>
+        <w:t>BASILI, Victor R.; CALDIERA, Gianluigi; ROMBACH, H. Dieter. The Goal Question Metric Approach. 1994.</w:t>
       </w:r>
     </w:p>
     <w:sectPr>
@@ -2787,7 +3121,7 @@
 </file>
 
 <file path=word/numbering.xml><?xml version="1.0" encoding="utf-8"?>
-<w:numbering xmlns:wpc="http://schemas.microsoft.com/office/word/2010/wordprocessingCanvas" xmlns:cx="http://schemas.microsoft.com/office/drawing/2014/chartex" xmlns:cx1="http://schemas.microsoft.com/office/drawing/2015/9/8/chartex" xmlns:cx2="http://schemas.microsoft.com/office/drawing/2015/10/21/chartex" xmlns:cx3="http://schemas.microsoft.com/office/drawing/2016/5/9/chartex" xmlns:cx4="http://schemas.microsoft.com/office/drawing/2016/5/10/chartex" xmlns:cx5="http://schemas.microsoft.com/office/drawing/2016/5/11/chartex" xmlns:cx6="http://schemas.microsoft.com/office/drawing/2016/5/12/chartex" xmlns:cx7="http://schemas.microsoft.com/office/drawing/2016/5/13/chartex" xmlns:cx8="http://schemas.microsoft.com/office/drawing/2016/5/14/chartex" xmlns:mc="http://schemas.openxmlformats.org/markup-compatibility/2006" xmlns:aink="http://schemas.microsoft.com/office/drawing/2016/ink" xmlns:am3d="http://schemas.microsoft.com/office/drawing/2017/model3d" xmlns:o="urn:schemas-microsoft-com:office:office" xmlns:oel="http://schemas.microsoft.com/office/2019/extlst" xmlns:r="http://schemas.openxmlformats.org/officeDocument/2006/relationships" xmlns:m="http://schemas.openxmlformats.org/officeDocument/2006/math" xmlns:v="urn:schemas-microsoft-com:vml" xmlns:wp14="http://schemas.microsoft.com/office/word/2010/wordprocessingDrawing" xmlns:wp="http://schemas.openxmlformats.org/drawingml/2006/wordprocessingDrawing" xmlns:w10="urn:schemas-microsoft-com:office:word" xmlns:w="http://schemas.openxmlformats.org/wordprocessingml/2006/main" xmlns:w14="http://schemas.microsoft.com/office/word/2010/wordml" xmlns:w15="http://schemas.microsoft.com/office/word/2012/wordml" xmlns:w16cex="http://schemas.microsoft.com/office/word/2018/wordml/cex" xmlns:w16cid="http://schemas.microsoft.com/office/word/2016/wordml/cid" xmlns:w16="http://schemas.microsoft.com/office/word/2018/wordml" xmlns:w16sdtdh="http://schemas.microsoft.com/office/word/2020/wordml/sdtdatahash" xmlns:w16se="http://schemas.microsoft.com/office/word/2015/wordml/symex" xmlns:wpg="http://schemas.microsoft.com/office/word/2010/wordprocessingGroup" xmlns:wpi="http://schemas.microsoft.com/office/word/2010/wordprocessingInk" xmlns:wne="http://schemas.microsoft.com/office/word/2006/wordml" xmlns:wps="http://schemas.microsoft.com/office/word/2010/wordprocessingShape" mc:Ignorable="w14 w15 w16se w16cid w16 w16cex w16sdtdh wp14">
+<w:numbering xmlns:wpc="http://schemas.microsoft.com/office/word/2010/wordprocessingCanvas" xmlns:cx="http://schemas.microsoft.com/office/drawing/2014/chartex" xmlns:cx1="http://schemas.microsoft.com/office/drawing/2015/9/8/chartex" xmlns:cx2="http://schemas.microsoft.com/office/drawing/2015/10/21/chartex" xmlns:cx3="http://schemas.microsoft.com/office/drawing/2016/5/9/chartex" xmlns:cx4="http://schemas.microsoft.com/office/drawing/2016/5/10/chartex" xmlns:cx5="http://schemas.microsoft.com/office/drawing/2016/5/11/chartex" xmlns:cx6="http://schemas.microsoft.com/office/drawing/2016/5/12/chartex" xmlns:cx7="http://schemas.microsoft.com/office/drawing/2016/5/13/chartex" xmlns:cx8="http://schemas.microsoft.com/office/drawing/2016/5/14/chartex" xmlns:mc="http://schemas.openxmlformats.org/markup-compatibility/2006" xmlns:m="http://schemas.openxmlformats.org/officeDocument/2006/math" xmlns:aink="http://schemas.microsoft.com/office/drawing/2016/ink" xmlns:am3d="http://schemas.microsoft.com/office/drawing/2017/model3d" xmlns:oel="http://schemas.microsoft.com/office/2019/extlst" xmlns:r="http://schemas.openxmlformats.org/officeDocument/2006/relationships" xmlns:wp14="http://schemas.microsoft.com/office/word/2010/wordprocessingDrawing" xmlns:wp="http://schemas.openxmlformats.org/drawingml/2006/wordprocessingDrawing" xmlns:wpg="http://schemas.microsoft.com/office/word/2010/wordprocessingGroup" xmlns:wpi="http://schemas.microsoft.com/office/word/2010/wordprocessingInk" xmlns:wps="http://schemas.microsoft.com/office/word/2010/wordprocessingShape" xmlns:o="urn:schemas-microsoft-com:office:office" xmlns:v="urn:schemas-microsoft-com:vml" xmlns:w10="urn:schemas-microsoft-com:office:word" xmlns:w="http://schemas.openxmlformats.org/wordprocessingml/2006/main" xmlns:w14="http://schemas.microsoft.com/office/word/2010/wordml" xmlns:w15="http://schemas.microsoft.com/office/word/2012/wordml" xmlns:w16cei="http://schemas.microsoft.com/office/word/2026/wordml/cei" xmlns:w16cex="http://schemas.microsoft.com/office/word/2018/wordml/cex" xmlns:w16cid="http://schemas.microsoft.com/office/word/2016/wordml/cid" xmlns:w16="http://schemas.microsoft.com/office/word/2018/wordml" xmlns:w16sdtdh="http://schemas.microsoft.com/office/word/2020/wordml/sdtdatahash" xmlns:w16sdtfl="http://schemas.microsoft.com/office/word/2024/wordml/sdtformatlock" xmlns:w16se="http://schemas.microsoft.com/office/word/2015/wordml/symex" xmlns:w16du="http://schemas.microsoft.com/office/word/2023/wordml/word16du" xmlns:wne="http://schemas.microsoft.com/office/word/2006/wordml" mc:Ignorable="w14 w15 w16se w16cid w16 w16cex w16sdtdh w16sdtfl w16du wp14">
   <w:abstractNum w:abstractNumId="0" w15:restartNumberingAfterBreak="0">
     <w:nsid w:val="FFFFFF7C"/>
     <w:multiLevelType w:val="singleLevel"/>
@@ -3106,7 +3440,7 @@
 </file>
 
 <file path=word/styles.xml><?xml version="1.0" encoding="utf-8"?>
-<w:styles xmlns:mc="http://schemas.openxmlformats.org/markup-compatibility/2006" xmlns:r="http://schemas.openxmlformats.org/officeDocument/2006/relationships" xmlns:w="http://schemas.openxmlformats.org/wordprocessingml/2006/main" xmlns:w14="http://schemas.microsoft.com/office/word/2010/wordml" xmlns:w15="http://schemas.microsoft.com/office/word/2012/wordml" xmlns:w16cex="http://schemas.microsoft.com/office/word/2018/wordml/cex" xmlns:w16cid="http://schemas.microsoft.com/office/word/2016/wordml/cid" xmlns:w16="http://schemas.microsoft.com/office/word/2018/wordml" xmlns:w16sdtdh="http://schemas.microsoft.com/office/word/2020/wordml/sdtdatahash" xmlns:w16se="http://schemas.microsoft.com/office/word/2015/wordml/symex" mc:Ignorable="w14 w15 w16se w16cid w16 w16cex w16sdtdh">
+<w:styles xmlns:mc="http://schemas.openxmlformats.org/markup-compatibility/2006" xmlns:r="http://schemas.openxmlformats.org/officeDocument/2006/relationships" xmlns:w="http://schemas.openxmlformats.org/wordprocessingml/2006/main" xmlns:w14="http://schemas.microsoft.com/office/word/2010/wordml" xmlns:w15="http://schemas.microsoft.com/office/word/2012/wordml" xmlns:w16cex="http://schemas.microsoft.com/office/word/2018/wordml/cex" xmlns:w16cid="http://schemas.microsoft.com/office/word/2016/wordml/cid" xmlns:w16="http://schemas.microsoft.com/office/word/2018/wordml" xmlns:w16sdtdh="http://schemas.microsoft.com/office/word/2020/wordml/sdtdatahash" xmlns:w16sdtfl="http://schemas.microsoft.com/office/word/2024/wordml/sdtformatlock" xmlns:w16se="http://schemas.microsoft.com/office/word/2015/wordml/symex" xmlns:w16du="http://schemas.microsoft.com/office/word/2023/wordml/word16du" mc:Ignorable="w14 w15 w16se w16cid w16 w16cex w16sdtdh w16sdtfl w16du">
   <w:docDefaults>
     <w:rPrDefault>
       <w:rPr>

</xml_diff>